<commit_message>
gotowe pkt. 1, 2, 3 sprawozdania
</commit_message>
<xml_diff>
--- a/Sprawozdanie projektowe IO.docx
+++ b/Sprawozdanie projektowe IO.docx
@@ -4,7 +4,7 @@
   <w:body>
     <w:tbl>
       <w:tblPr>
-        <w:tblStyle w:val="TableGrid"/>
+        <w:tblStyle w:val="Tabela-Siatka"/>
         <w:tblW w:w="0" w:type="auto"/>
         <w:jc w:val="center"/>
         <w:tblBorders>
@@ -241,7 +241,7 @@
           </w:p>
           <w:p>
             <w:pPr>
-              <w:pStyle w:val="ListParagraph"/>
+              <w:pStyle w:val="Akapitzlist"/>
               <w:numPr>
                 <w:ilvl w:val="0"/>
                 <w:numId w:val="1"/>
@@ -266,7 +266,7 @@
           </w:p>
           <w:p>
             <w:pPr>
-              <w:pStyle w:val="ListParagraph"/>
+              <w:pStyle w:val="Akapitzlist"/>
               <w:numPr>
                 <w:ilvl w:val="0"/>
                 <w:numId w:val="1"/>
@@ -285,7 +285,7 @@
           </w:p>
           <w:p>
             <w:pPr>
-              <w:pStyle w:val="ListParagraph"/>
+              <w:pStyle w:val="Akapitzlist"/>
               <w:numPr>
                 <w:ilvl w:val="0"/>
                 <w:numId w:val="1"/>
@@ -299,16 +299,8 @@
               <w:rPr>
                 <w:rFonts w:ascii="Aptos" w:eastAsia="Aptos" w:hAnsi="Aptos" w:cs="Aptos"/>
               </w:rPr>
-              <w:t xml:space="preserve">Ernest </w:t>
+              <w:t>Ernest Miciura</w:t>
             </w:r>
-            <w:proofErr w:type="spellStart"/>
-            <w:r>
-              <w:rPr>
-                <w:rFonts w:ascii="Aptos" w:eastAsia="Aptos" w:hAnsi="Aptos" w:cs="Aptos"/>
-              </w:rPr>
-              <w:t>Miciura</w:t>
-            </w:r>
-            <w:proofErr w:type="spellEnd"/>
           </w:p>
         </w:tc>
         <w:tc>
@@ -381,7 +373,7 @@
     </w:tbl>
     <w:p>
       <w:pPr>
-        <w:pStyle w:val="Heading2"/>
+        <w:pStyle w:val="Nagwek2"/>
         <w:jc w:val="both"/>
       </w:pPr>
       <w:r>
@@ -390,10 +382,10 @@
     </w:p>
     <w:p>
       <w:pPr>
-        <w:pStyle w:val="ListParagraph"/>
-        <w:numPr>
-          <w:ilvl w:val="0"/>
-          <w:numId w:val="21"/>
+        <w:pStyle w:val="Akapitzlist"/>
+        <w:numPr>
+          <w:ilvl w:val="0"/>
+          <w:numId w:val="22"/>
         </w:numPr>
         <w:jc w:val="both"/>
       </w:pPr>
@@ -424,10 +416,10 @@
     </w:p>
     <w:p>
       <w:pPr>
-        <w:pStyle w:val="ListParagraph"/>
-        <w:numPr>
-          <w:ilvl w:val="0"/>
-          <w:numId w:val="21"/>
+        <w:pStyle w:val="Akapitzlist"/>
+        <w:numPr>
+          <w:ilvl w:val="0"/>
+          <w:numId w:val="22"/>
         </w:numPr>
         <w:jc w:val="both"/>
       </w:pPr>
@@ -464,10 +456,10 @@
     </w:p>
     <w:p>
       <w:pPr>
-        <w:pStyle w:val="ListParagraph"/>
-        <w:numPr>
-          <w:ilvl w:val="0"/>
-          <w:numId w:val="21"/>
+        <w:pStyle w:val="Akapitzlist"/>
+        <w:numPr>
+          <w:ilvl w:val="0"/>
+          <w:numId w:val="22"/>
         </w:numPr>
         <w:jc w:val="both"/>
       </w:pPr>
@@ -504,23 +496,15 @@
     </w:p>
     <w:p>
       <w:pPr>
-        <w:pStyle w:val="ListParagraph"/>
-        <w:numPr>
-          <w:ilvl w:val="0"/>
-          <w:numId w:val="21"/>
+        <w:pStyle w:val="Akapitzlist"/>
+        <w:numPr>
+          <w:ilvl w:val="0"/>
+          <w:numId w:val="22"/>
         </w:numPr>
         <w:jc w:val="both"/>
       </w:pPr>
       <w:r>
-        <w:t xml:space="preserve">Ernest </w:t>
-      </w:r>
-      <w:proofErr w:type="spellStart"/>
-      <w:r>
-        <w:t>Miciura</w:t>
-      </w:r>
-      <w:proofErr w:type="spellEnd"/>
-      <w:r>
-        <w:t>:</w:t>
+        <w:t>Ernest Miciura:</w:t>
       </w:r>
     </w:p>
     <w:p>
@@ -531,11 +515,9 @@
       <w:r>
         <w:t xml:space="preserve">Opis aktora: </w:t>
       </w:r>
-      <w:proofErr w:type="spellStart"/>
       <w:r>
         <w:t>Serwisant</w:t>
       </w:r>
-      <w:proofErr w:type="spellEnd"/>
       <w:r>
         <w:t>,</w:t>
       </w:r>
@@ -554,7 +536,7 @@
     </w:p>
     <w:p>
       <w:pPr>
-        <w:pStyle w:val="Heading2"/>
+        <w:pStyle w:val="Nagwek2"/>
         <w:jc w:val="both"/>
       </w:pPr>
       <w:r>
@@ -588,15 +570,7 @@
         <w:jc w:val="both"/>
       </w:pPr>
       <w:r>
-        <w:t xml:space="preserve">Ernest </w:t>
-      </w:r>
-      <w:proofErr w:type="spellStart"/>
-      <w:r>
-        <w:t>Miciura</w:t>
-      </w:r>
-      <w:proofErr w:type="spellEnd"/>
-      <w:r>
-        <w:t xml:space="preserve">: </w:t>
+        <w:t xml:space="preserve">Ernest Miciura: </w:t>
       </w:r>
       <w:r>
         <w:t>10 pkt.</w:t>
@@ -604,7 +578,7 @@
     </w:p>
     <w:p>
       <w:pPr>
-        <w:pStyle w:val="Heading2"/>
+        <w:pStyle w:val="Nagwek2"/>
         <w:jc w:val="both"/>
       </w:pPr>
       <w:r>
@@ -624,7 +598,7 @@
     </w:p>
     <w:p>
       <w:pPr>
-        <w:pStyle w:val="Heading1"/>
+        <w:pStyle w:val="Nagwek1"/>
         <w:numPr>
           <w:ilvl w:val="0"/>
           <w:numId w:val="2"/>
@@ -648,67 +622,7 @@
         <w:jc w:val="both"/>
       </w:pPr>
       <w:r>
-        <w:t xml:space="preserve">Projekt </w:t>
-      </w:r>
-      <w:r>
-        <w:t>zakłada zaprojektowanie</w:t>
-      </w:r>
-      <w:r>
-        <w:t xml:space="preserve"> systemu zarządzającego serwisem komputerowym. Zadaniem systemu jest obsługa zleceń naprawy sprzętu komputerowego, obejmująca cały proces serwisowy.  Rozpoczyna się od rejestracji oraz przyjęcia urządzenia, po czym następuje diagnoza techniczna, ewentualne zamówienie części oraz właściwa naprawa.  Zlecenie kończy się odbiorem naprawionego sprzętu i finalizacją płatności. System opiera się na interakcji trzech </w:t>
-      </w:r>
-      <w:r>
-        <w:t>aktorów Pracownika</w:t>
-      </w:r>
-      <w:r>
-        <w:t xml:space="preserve"> Biura, </w:t>
-      </w:r>
-      <w:r>
-        <w:t xml:space="preserve">który zarządza </w:t>
-      </w:r>
-      <w:r>
-        <w:t xml:space="preserve">zlecaniami </w:t>
-      </w:r>
-      <w:r>
-        <w:t>i</w:t>
-      </w:r>
-      <w:r>
-        <w:t xml:space="preserve"> </w:t>
-      </w:r>
-      <w:r>
-        <w:t>stanowi główny</w:t>
-      </w:r>
-      <w:r>
-        <w:t xml:space="preserve"> punkt </w:t>
-      </w:r>
-      <w:r>
-        <w:t>kontaktu</w:t>
-      </w:r>
-      <w:r>
-        <w:t xml:space="preserve"> z </w:t>
-      </w:r>
-      <w:r>
-        <w:t>klientem,</w:t>
-      </w:r>
-      <w:r>
-        <w:t xml:space="preserve"> </w:t>
-      </w:r>
-      <w:r>
-        <w:t>Klienta</w:t>
-      </w:r>
-      <w:r>
-        <w:t>, który zleca naprawę</w:t>
-      </w:r>
-      <w:r>
-        <w:t xml:space="preserve"> </w:t>
-      </w:r>
-      <w:r>
-        <w:t xml:space="preserve">oraz Serwisanta, </w:t>
-      </w:r>
-      <w:r>
-        <w:t>który realizuje czynności techniczne związane z naprawą</w:t>
-      </w:r>
-      <w:r>
-        <w:t>.</w:t>
+        <w:t>Projekt zakłada zaprojektowanie systemu zarządzającego serwisem komputerowym. Zadaniem systemu jest obsługa zleceń naprawy sprzętu komputerowego, obejmująca cały proces serwisowy.  Rozpoczyna się od rejestracji oraz przyjęcia urządzenia, po czym następuje diagnoza techniczna, ewentualne zamówienie części oraz właściwa naprawa.  Zlecenie kończy się odbiorem naprawionego sprzętu i finalizacją płatności. System opiera się na interakcji trzech aktorów Pracownika Biura, który zarządza zlecaniami i stanowi główny punkt kontaktu z klientem, Klienta, który zleca naprawę oraz Serwisanta, który realizuje czynności techniczne związane z naprawą.</w:t>
       </w:r>
     </w:p>
     <w:p>
@@ -718,7 +632,7 @@
     </w:p>
     <w:p>
       <w:pPr>
-        <w:pStyle w:val="Heading1"/>
+        <w:pStyle w:val="Nagwek1"/>
         <w:numPr>
           <w:ilvl w:val="0"/>
           <w:numId w:val="2"/>
@@ -740,7 +654,7 @@
     </w:p>
     <w:p>
       <w:pPr>
-        <w:pStyle w:val="Heading2"/>
+        <w:pStyle w:val="Nagwek2"/>
         <w:jc w:val="both"/>
       </w:pPr>
       <w:r>
@@ -792,7 +706,7 @@
     </w:p>
     <w:p>
       <w:pPr>
-        <w:pStyle w:val="ListParagraph"/>
+        <w:pStyle w:val="Akapitzlist"/>
         <w:numPr>
           <w:ilvl w:val="0"/>
           <w:numId w:val="9"/>
@@ -805,7 +719,7 @@
     </w:p>
     <w:p>
       <w:pPr>
-        <w:pStyle w:val="ListParagraph"/>
+        <w:pStyle w:val="Akapitzlist"/>
         <w:numPr>
           <w:ilvl w:val="0"/>
           <w:numId w:val="9"/>
@@ -818,7 +732,7 @@
     </w:p>
     <w:p>
       <w:pPr>
-        <w:pStyle w:val="ListParagraph"/>
+        <w:pStyle w:val="Akapitzlist"/>
         <w:numPr>
           <w:ilvl w:val="0"/>
           <w:numId w:val="9"/>
@@ -831,7 +745,7 @@
     </w:p>
     <w:p>
       <w:pPr>
-        <w:pStyle w:val="ListParagraph"/>
+        <w:pStyle w:val="Akapitzlist"/>
         <w:numPr>
           <w:ilvl w:val="0"/>
           <w:numId w:val="9"/>
@@ -844,7 +758,7 @@
     </w:p>
     <w:p>
       <w:pPr>
-        <w:pStyle w:val="ListParagraph"/>
+        <w:pStyle w:val="Akapitzlist"/>
         <w:numPr>
           <w:ilvl w:val="0"/>
           <w:numId w:val="9"/>
@@ -857,7 +771,7 @@
     </w:p>
     <w:p>
       <w:pPr>
-        <w:pStyle w:val="ListParagraph"/>
+        <w:pStyle w:val="Akapitzlist"/>
         <w:numPr>
           <w:ilvl w:val="0"/>
           <w:numId w:val="9"/>
@@ -870,7 +784,7 @@
     </w:p>
     <w:p>
       <w:pPr>
-        <w:pStyle w:val="ListParagraph"/>
+        <w:pStyle w:val="Akapitzlist"/>
         <w:numPr>
           <w:ilvl w:val="0"/>
           <w:numId w:val="9"/>
@@ -883,7 +797,7 @@
     </w:p>
     <w:p>
       <w:pPr>
-        <w:pStyle w:val="ListParagraph"/>
+        <w:pStyle w:val="Akapitzlist"/>
         <w:numPr>
           <w:ilvl w:val="0"/>
           <w:numId w:val="9"/>
@@ -896,7 +810,7 @@
     </w:p>
     <w:p>
       <w:pPr>
-        <w:pStyle w:val="ListParagraph"/>
+        <w:pStyle w:val="Akapitzlist"/>
         <w:numPr>
           <w:ilvl w:val="0"/>
           <w:numId w:val="9"/>
@@ -909,7 +823,7 @@
     </w:p>
     <w:p>
       <w:pPr>
-        <w:pStyle w:val="ListParagraph"/>
+        <w:pStyle w:val="Akapitzlist"/>
         <w:numPr>
           <w:ilvl w:val="0"/>
           <w:numId w:val="9"/>
@@ -922,7 +836,7 @@
     </w:p>
     <w:p>
       <w:pPr>
-        <w:pStyle w:val="ListParagraph"/>
+        <w:pStyle w:val="Akapitzlist"/>
         <w:numPr>
           <w:ilvl w:val="0"/>
           <w:numId w:val="9"/>
@@ -935,7 +849,7 @@
     </w:p>
     <w:p>
       <w:pPr>
-        <w:pStyle w:val="ListParagraph"/>
+        <w:pStyle w:val="Akapitzlist"/>
         <w:numPr>
           <w:ilvl w:val="0"/>
           <w:numId w:val="9"/>
@@ -948,7 +862,7 @@
     </w:p>
     <w:p>
       <w:pPr>
-        <w:pStyle w:val="ListParagraph"/>
+        <w:pStyle w:val="Akapitzlist"/>
         <w:numPr>
           <w:ilvl w:val="0"/>
           <w:numId w:val="9"/>
@@ -972,15 +886,7 @@
         <w:jc w:val="both"/>
       </w:pPr>
       <w:r>
-        <w:t xml:space="preserve">Serwis komputerowy obsługuje klientów indywidualnych oraz firmy, które zgłaszają usterki sprzętu komputerowego. Obsługą klienta oraz zarządzaniem zleceniami zajmuje się Pracownik Biura, natomiast za obsługę techniczną odpowiedzialny jest </w:t>
-      </w:r>
-      <w:proofErr w:type="spellStart"/>
-      <w:r>
-        <w:t>Serwisant</w:t>
-      </w:r>
-      <w:proofErr w:type="spellEnd"/>
-      <w:r>
-        <w:t>. Klient ma możliwość uzyskania informacji o swoim zleceniu po wcześniejszej autoryzacji za pomocą numeru zlecenia.</w:t>
+        <w:t>Serwis komputerowy obsługuje klientów indywidualnych oraz firmy, które zgłaszają usterki sprzętu komputerowego. Obsługą klienta oraz zarządzaniem zleceniami zajmuje się Pracownik Biura, natomiast za obsługę techniczną odpowiedzialny jest Serwisant. Klient ma możliwość uzyskania informacji o swoim zleceniu po wcześniejszej autoryzacji za pomocą numeru zlecenia.</w:t>
       </w:r>
     </w:p>
     <w:p>
@@ -990,7 +896,7 @@
     </w:p>
     <w:p>
       <w:pPr>
-        <w:pStyle w:val="Heading2"/>
+        <w:pStyle w:val="Nagwek2"/>
         <w:jc w:val="both"/>
       </w:pPr>
       <w:r>
@@ -999,7 +905,7 @@
     </w:p>
     <w:p>
       <w:pPr>
-        <w:pStyle w:val="ListParagraph"/>
+        <w:pStyle w:val="Akapitzlist"/>
         <w:numPr>
           <w:ilvl w:val="0"/>
           <w:numId w:val="18"/>
@@ -1015,7 +921,7 @@
     </w:p>
     <w:p>
       <w:pPr>
-        <w:pStyle w:val="ListParagraph"/>
+        <w:pStyle w:val="Akapitzlist"/>
         <w:numPr>
           <w:ilvl w:val="0"/>
           <w:numId w:val="19"/>
@@ -1034,7 +940,7 @@
     </w:p>
     <w:p>
       <w:pPr>
-        <w:pStyle w:val="ListParagraph"/>
+        <w:pStyle w:val="Akapitzlist"/>
         <w:ind w:left="1068"/>
         <w:jc w:val="both"/>
       </w:pPr>
@@ -1154,7 +1060,7 @@
     </w:p>
     <w:p>
       <w:pPr>
-        <w:pStyle w:val="ListParagraph"/>
+        <w:pStyle w:val="Akapitzlist"/>
         <w:ind w:left="1068"/>
         <w:jc w:val="both"/>
       </w:pPr>
@@ -1224,7 +1130,7 @@
     </w:p>
     <w:p>
       <w:pPr>
-        <w:pStyle w:val="ListParagraph"/>
+        <w:pStyle w:val="Akapitzlist"/>
         <w:numPr>
           <w:ilvl w:val="0"/>
           <w:numId w:val="19"/>
@@ -1243,7 +1149,7 @@
     </w:p>
     <w:p>
       <w:pPr>
-        <w:pStyle w:val="ListParagraph"/>
+        <w:pStyle w:val="Akapitzlist"/>
         <w:ind w:left="1068"/>
         <w:jc w:val="both"/>
         <w:rPr>
@@ -1253,7 +1159,6 @@
       <w:r>
         <w:t xml:space="preserve">sposób wyliczenia: </w:t>
       </w:r>
-      <w:proofErr w:type="spellStart"/>
       <m:oMath>
         <m:r>
           <m:rPr>
@@ -1274,7 +1179,6 @@
           </w:rPr>
           <m:t>różnica</m:t>
         </m:r>
-        <w:proofErr w:type="spellEnd"/>
         <m:r>
           <m:rPr>
             <m:nor/>
@@ -1353,7 +1257,7 @@
     </w:p>
     <w:p>
       <w:pPr>
-        <w:pStyle w:val="ListParagraph"/>
+        <w:pStyle w:val="Akapitzlist"/>
         <w:ind w:left="1068"/>
         <w:jc w:val="both"/>
       </w:pPr>
@@ -1372,7 +1276,7 @@
     </w:p>
     <w:p>
       <w:pPr>
-        <w:pStyle w:val="ListParagraph"/>
+        <w:pStyle w:val="Akapitzlist"/>
         <w:numPr>
           <w:ilvl w:val="0"/>
           <w:numId w:val="19"/>
@@ -1391,7 +1295,7 @@
     </w:p>
     <w:p>
       <w:pPr>
-        <w:pStyle w:val="ListParagraph"/>
+        <w:pStyle w:val="Akapitzlist"/>
         <w:ind w:left="1068"/>
         <w:jc w:val="both"/>
         <w:rPr>
@@ -1536,7 +1440,7 @@
     </w:p>
     <w:p>
       <w:pPr>
-        <w:pStyle w:val="ListParagraph"/>
+        <w:pStyle w:val="Akapitzlist"/>
         <w:ind w:left="1068"/>
         <w:jc w:val="both"/>
       </w:pPr>
@@ -1552,7 +1456,7 @@
     </w:p>
     <w:p>
       <w:pPr>
-        <w:pStyle w:val="ListParagraph"/>
+        <w:pStyle w:val="Akapitzlist"/>
         <w:numPr>
           <w:ilvl w:val="0"/>
           <w:numId w:val="18"/>
@@ -1568,10 +1472,10 @@
     </w:p>
     <w:p>
       <w:pPr>
-        <w:pStyle w:val="ListParagraph"/>
-        <w:numPr>
-          <w:ilvl w:val="0"/>
-          <w:numId w:val="20"/>
+        <w:pStyle w:val="Akapitzlist"/>
+        <w:numPr>
+          <w:ilvl w:val="0"/>
+          <w:numId w:val="21"/>
         </w:numPr>
         <w:jc w:val="both"/>
       </w:pPr>
@@ -1588,10 +1492,10 @@
     </w:p>
     <w:p>
       <w:pPr>
-        <w:pStyle w:val="ListParagraph"/>
-        <w:numPr>
-          <w:ilvl w:val="0"/>
-          <w:numId w:val="20"/>
+        <w:pStyle w:val="Akapitzlist"/>
+        <w:numPr>
+          <w:ilvl w:val="0"/>
+          <w:numId w:val="21"/>
         </w:numPr>
         <w:jc w:val="both"/>
       </w:pPr>
@@ -1607,10 +1511,10 @@
     </w:p>
     <w:p>
       <w:pPr>
-        <w:pStyle w:val="ListParagraph"/>
-        <w:numPr>
-          <w:ilvl w:val="0"/>
-          <w:numId w:val="20"/>
+        <w:pStyle w:val="Akapitzlist"/>
+        <w:numPr>
+          <w:ilvl w:val="0"/>
+          <w:numId w:val="21"/>
         </w:numPr>
         <w:jc w:val="both"/>
       </w:pPr>
@@ -1626,10 +1530,10 @@
     </w:p>
     <w:p>
       <w:pPr>
-        <w:pStyle w:val="ListParagraph"/>
-        <w:numPr>
-          <w:ilvl w:val="0"/>
-          <w:numId w:val="20"/>
+        <w:pStyle w:val="Akapitzlist"/>
+        <w:numPr>
+          <w:ilvl w:val="0"/>
+          <w:numId w:val="21"/>
         </w:numPr>
         <w:jc w:val="both"/>
       </w:pPr>
@@ -1645,7 +1549,7 @@
     </w:p>
     <w:p>
       <w:pPr>
-        <w:pStyle w:val="Heading1"/>
+        <w:pStyle w:val="Nagwek1"/>
         <w:numPr>
           <w:ilvl w:val="0"/>
           <w:numId w:val="2"/>
@@ -1729,7 +1633,7 @@
     </w:p>
     <w:p>
       <w:pPr>
-        <w:pStyle w:val="Heading1"/>
+        <w:pStyle w:val="Nagwek1"/>
         <w:numPr>
           <w:ilvl w:val="0"/>
           <w:numId w:val="2"/>
@@ -1750,7 +1654,7 @@
     </w:p>
     <w:p>
       <w:pPr>
-        <w:pStyle w:val="Heading2"/>
+        <w:pStyle w:val="Nagwek2"/>
         <w:jc w:val="both"/>
       </w:pPr>
       <w:r>
@@ -1813,7 +1717,7 @@
     </w:p>
     <w:p>
       <w:pPr>
-        <w:pStyle w:val="Heading3"/>
+        <w:pStyle w:val="Nagwek3"/>
         <w:jc w:val="both"/>
         <w:rPr>
           <w:u w:val="single"/>
@@ -1835,7 +1739,7 @@
     </w:p>
     <w:p>
       <w:pPr>
-        <w:pStyle w:val="ListParagraph"/>
+        <w:pStyle w:val="Akapitzlist"/>
         <w:numPr>
           <w:ilvl w:val="0"/>
           <w:numId w:val="3"/>
@@ -1926,20 +1830,15 @@
     </w:p>
     <w:p>
       <w:pPr>
-        <w:pStyle w:val="ListParagraph"/>
+        <w:pStyle w:val="Akapitzlist"/>
         <w:numPr>
           <w:ilvl w:val="0"/>
           <w:numId w:val="3"/>
         </w:numPr>
         <w:jc w:val="both"/>
       </w:pPr>
-      <w:proofErr w:type="spellStart"/>
-      <w:r>
-        <w:t>Serwisant</w:t>
-      </w:r>
-      <w:proofErr w:type="spellEnd"/>
-      <w:r>
-        <w:t xml:space="preserve">: pracownik serwisu </w:t>
+      <w:r>
+        <w:t xml:space="preserve">Serwisant: pracownik serwisu </w:t>
       </w:r>
       <w:r>
         <w:t xml:space="preserve">odpowiedzialny za </w:t>
@@ -2064,7 +1963,7 @@
     </w:p>
     <w:p>
       <w:pPr>
-        <w:pStyle w:val="ListParagraph"/>
+        <w:pStyle w:val="Akapitzlist"/>
         <w:numPr>
           <w:ilvl w:val="0"/>
           <w:numId w:val="3"/>
@@ -2230,7 +2129,7 @@
     </w:p>
     <w:p>
       <w:pPr>
-        <w:pStyle w:val="Heading3"/>
+        <w:pStyle w:val="Nagwek3"/>
         <w:jc w:val="both"/>
         <w:rPr>
           <w:u w:val="single"/>
@@ -2251,7 +2150,7 @@
     </w:p>
     <w:p>
       <w:pPr>
-        <w:pStyle w:val="ListParagraph"/>
+        <w:pStyle w:val="Akapitzlist"/>
         <w:numPr>
           <w:ilvl w:val="0"/>
           <w:numId w:val="3"/>
@@ -2263,7 +2162,7 @@
     </w:p>
     <w:p>
       <w:pPr>
-        <w:pStyle w:val="ListParagraph"/>
+        <w:pStyle w:val="Akapitzlist"/>
         <w:numPr>
           <w:ilvl w:val="0"/>
           <w:numId w:val="4"/>
@@ -2275,7 +2174,7 @@
     </w:p>
     <w:p>
       <w:pPr>
-        <w:pStyle w:val="ListParagraph"/>
+        <w:pStyle w:val="Akapitzlist"/>
         <w:numPr>
           <w:ilvl w:val="1"/>
           <w:numId w:val="3"/>
@@ -2287,7 +2186,7 @@
     </w:p>
     <w:p>
       <w:pPr>
-        <w:pStyle w:val="ListParagraph"/>
+        <w:pStyle w:val="Akapitzlist"/>
         <w:numPr>
           <w:ilvl w:val="1"/>
           <w:numId w:val="3"/>
@@ -2299,7 +2198,7 @@
     </w:p>
     <w:p>
       <w:pPr>
-        <w:pStyle w:val="ListParagraph"/>
+        <w:pStyle w:val="Akapitzlist"/>
         <w:numPr>
           <w:ilvl w:val="0"/>
           <w:numId w:val="4"/>
@@ -2311,7 +2210,7 @@
     </w:p>
     <w:p>
       <w:pPr>
-        <w:pStyle w:val="ListParagraph"/>
+        <w:pStyle w:val="Akapitzlist"/>
         <w:numPr>
           <w:ilvl w:val="1"/>
           <w:numId w:val="3"/>
@@ -2344,7 +2243,7 @@
     </w:p>
     <w:p>
       <w:pPr>
-        <w:pStyle w:val="ListParagraph"/>
+        <w:pStyle w:val="Akapitzlist"/>
         <w:numPr>
           <w:ilvl w:val="1"/>
           <w:numId w:val="3"/>
@@ -2380,7 +2279,7 @@
     </w:p>
     <w:p>
       <w:pPr>
-        <w:pStyle w:val="ListParagraph"/>
+        <w:pStyle w:val="Akapitzlist"/>
         <w:numPr>
           <w:ilvl w:val="1"/>
           <w:numId w:val="3"/>
@@ -2437,7 +2336,7 @@
     </w:p>
     <w:p>
       <w:pPr>
-        <w:pStyle w:val="ListParagraph"/>
+        <w:pStyle w:val="Akapitzlist"/>
         <w:numPr>
           <w:ilvl w:val="1"/>
           <w:numId w:val="3"/>
@@ -2461,7 +2360,7 @@
     </w:p>
     <w:p>
       <w:pPr>
-        <w:pStyle w:val="ListParagraph"/>
+        <w:pStyle w:val="Akapitzlist"/>
         <w:numPr>
           <w:ilvl w:val="1"/>
           <w:numId w:val="3"/>
@@ -2497,7 +2396,7 @@
     </w:p>
     <w:p>
       <w:pPr>
-        <w:pStyle w:val="ListParagraph"/>
+        <w:pStyle w:val="Akapitzlist"/>
         <w:numPr>
           <w:ilvl w:val="1"/>
           <w:numId w:val="3"/>
@@ -2512,7 +2411,7 @@
     </w:p>
     <w:p>
       <w:pPr>
-        <w:pStyle w:val="ListParagraph"/>
+        <w:pStyle w:val="Akapitzlist"/>
         <w:numPr>
           <w:ilvl w:val="1"/>
           <w:numId w:val="3"/>
@@ -2533,7 +2432,7 @@
     </w:p>
     <w:p>
       <w:pPr>
-        <w:pStyle w:val="ListParagraph"/>
+        <w:pStyle w:val="Akapitzlist"/>
         <w:numPr>
           <w:ilvl w:val="1"/>
           <w:numId w:val="3"/>
@@ -2573,7 +2472,7 @@
     </w:p>
     <w:p>
       <w:pPr>
-        <w:pStyle w:val="ListParagraph"/>
+        <w:pStyle w:val="Akapitzlist"/>
         <w:numPr>
           <w:ilvl w:val="0"/>
           <w:numId w:val="4"/>
@@ -2585,7 +2484,7 @@
     </w:p>
     <w:p>
       <w:pPr>
-        <w:pStyle w:val="ListParagraph"/>
+        <w:pStyle w:val="Akapitzlist"/>
         <w:numPr>
           <w:ilvl w:val="0"/>
           <w:numId w:val="17"/>
@@ -2603,7 +2502,7 @@
     </w:p>
     <w:p>
       <w:pPr>
-        <w:pStyle w:val="ListParagraph"/>
+        <w:pStyle w:val="Akapitzlist"/>
         <w:numPr>
           <w:ilvl w:val="2"/>
           <w:numId w:val="3"/>
@@ -2621,7 +2520,7 @@
     </w:p>
     <w:p>
       <w:pPr>
-        <w:pStyle w:val="ListParagraph"/>
+        <w:pStyle w:val="Akapitzlist"/>
         <w:numPr>
           <w:ilvl w:val="2"/>
           <w:numId w:val="3"/>
@@ -2633,7 +2532,7 @@
     </w:p>
     <w:p>
       <w:pPr>
-        <w:pStyle w:val="ListParagraph"/>
+        <w:pStyle w:val="Akapitzlist"/>
         <w:numPr>
           <w:ilvl w:val="0"/>
           <w:numId w:val="17"/>
@@ -2645,7 +2544,7 @@
     </w:p>
     <w:p>
       <w:pPr>
-        <w:pStyle w:val="ListParagraph"/>
+        <w:pStyle w:val="Akapitzlist"/>
         <w:numPr>
           <w:ilvl w:val="2"/>
           <w:numId w:val="3"/>
@@ -2672,7 +2571,7 @@
     </w:p>
     <w:p>
       <w:pPr>
-        <w:pStyle w:val="ListParagraph"/>
+        <w:pStyle w:val="Akapitzlist"/>
         <w:numPr>
           <w:ilvl w:val="2"/>
           <w:numId w:val="3"/>
@@ -2693,7 +2592,7 @@
     </w:p>
     <w:p>
       <w:pPr>
-        <w:pStyle w:val="ListParagraph"/>
+        <w:pStyle w:val="Akapitzlist"/>
         <w:numPr>
           <w:ilvl w:val="0"/>
           <w:numId w:val="17"/>
@@ -2711,7 +2610,7 @@
     </w:p>
     <w:p>
       <w:pPr>
-        <w:pStyle w:val="ListParagraph"/>
+        <w:pStyle w:val="Akapitzlist"/>
         <w:numPr>
           <w:ilvl w:val="2"/>
           <w:numId w:val="3"/>
@@ -2756,7 +2655,7 @@
     </w:p>
     <w:p>
       <w:pPr>
-        <w:pStyle w:val="ListParagraph"/>
+        <w:pStyle w:val="Akapitzlist"/>
         <w:numPr>
           <w:ilvl w:val="2"/>
           <w:numId w:val="3"/>
@@ -2771,7 +2670,7 @@
     </w:p>
     <w:p>
       <w:pPr>
-        <w:pStyle w:val="ListParagraph"/>
+        <w:pStyle w:val="Akapitzlist"/>
         <w:numPr>
           <w:ilvl w:val="0"/>
           <w:numId w:val="4"/>
@@ -2854,7 +2753,7 @@
     </w:p>
     <w:p>
       <w:pPr>
-        <w:pStyle w:val="ListParagraph"/>
+        <w:pStyle w:val="Akapitzlist"/>
         <w:numPr>
           <w:ilvl w:val="0"/>
           <w:numId w:val="4"/>
@@ -2872,7 +2771,7 @@
     </w:p>
     <w:p>
       <w:pPr>
-        <w:pStyle w:val="ListParagraph"/>
+        <w:pStyle w:val="Akapitzlist"/>
         <w:numPr>
           <w:ilvl w:val="1"/>
           <w:numId w:val="3"/>
@@ -2890,7 +2789,7 @@
     </w:p>
     <w:p>
       <w:pPr>
-        <w:pStyle w:val="ListParagraph"/>
+        <w:pStyle w:val="Akapitzlist"/>
         <w:numPr>
           <w:ilvl w:val="1"/>
           <w:numId w:val="3"/>
@@ -2926,7 +2825,7 @@
     </w:p>
     <w:p>
       <w:pPr>
-        <w:pStyle w:val="ListParagraph"/>
+        <w:pStyle w:val="Akapitzlist"/>
         <w:numPr>
           <w:ilvl w:val="1"/>
           <w:numId w:val="3"/>
@@ -2941,13 +2840,13 @@
     </w:p>
     <w:p>
       <w:pPr>
-        <w:pStyle w:val="ListParagraph"/>
+        <w:pStyle w:val="Akapitzlist"/>
         <w:ind w:left="1440"/>
       </w:pPr>
     </w:p>
     <w:p>
       <w:pPr>
-        <w:pStyle w:val="ListParagraph"/>
+        <w:pStyle w:val="Akapitzlist"/>
         <w:numPr>
           <w:ilvl w:val="0"/>
           <w:numId w:val="3"/>
@@ -2966,7 +2865,7 @@
     </w:p>
     <w:p>
       <w:pPr>
-        <w:pStyle w:val="ListParagraph"/>
+        <w:pStyle w:val="Akapitzlist"/>
         <w:numPr>
           <w:ilvl w:val="0"/>
           <w:numId w:val="5"/>
@@ -2978,7 +2877,7 @@
     </w:p>
     <w:p>
       <w:pPr>
-        <w:pStyle w:val="ListParagraph"/>
+        <w:pStyle w:val="Akapitzlist"/>
         <w:numPr>
           <w:ilvl w:val="0"/>
           <w:numId w:val="16"/>
@@ -2990,7 +2889,7 @@
     </w:p>
     <w:p>
       <w:pPr>
-        <w:pStyle w:val="ListParagraph"/>
+        <w:pStyle w:val="Akapitzlist"/>
         <w:numPr>
           <w:ilvl w:val="0"/>
           <w:numId w:val="16"/>
@@ -3002,13 +2901,13 @@
     </w:p>
     <w:p>
       <w:pPr>
-        <w:pStyle w:val="ListParagraph"/>
+        <w:pStyle w:val="Akapitzlist"/>
         <w:ind w:left="1440"/>
       </w:pPr>
     </w:p>
     <w:p>
       <w:pPr>
-        <w:pStyle w:val="ListParagraph"/>
+        <w:pStyle w:val="Akapitzlist"/>
         <w:numPr>
           <w:ilvl w:val="0"/>
           <w:numId w:val="5"/>
@@ -3020,7 +2919,7 @@
     </w:p>
     <w:p>
       <w:pPr>
-        <w:pStyle w:val="ListParagraph"/>
+        <w:pStyle w:val="Akapitzlist"/>
         <w:numPr>
           <w:ilvl w:val="0"/>
           <w:numId w:val="15"/>
@@ -3032,7 +2931,7 @@
     </w:p>
     <w:p>
       <w:pPr>
-        <w:pStyle w:val="ListParagraph"/>
+        <w:pStyle w:val="Akapitzlist"/>
         <w:numPr>
           <w:ilvl w:val="0"/>
           <w:numId w:val="15"/>
@@ -3044,7 +2943,7 @@
     </w:p>
     <w:p>
       <w:pPr>
-        <w:pStyle w:val="ListParagraph"/>
+        <w:pStyle w:val="Akapitzlist"/>
         <w:numPr>
           <w:ilvl w:val="0"/>
           <w:numId w:val="15"/>
@@ -3056,7 +2955,7 @@
     </w:p>
     <w:p>
       <w:pPr>
-        <w:pStyle w:val="ListParagraph"/>
+        <w:pStyle w:val="Akapitzlist"/>
         <w:numPr>
           <w:ilvl w:val="0"/>
           <w:numId w:val="15"/>
@@ -3068,7 +2967,7 @@
     </w:p>
     <w:p>
       <w:pPr>
-        <w:pStyle w:val="ListParagraph"/>
+        <w:pStyle w:val="Akapitzlist"/>
         <w:numPr>
           <w:ilvl w:val="0"/>
           <w:numId w:val="15"/>
@@ -3083,7 +2982,7 @@
     </w:p>
     <w:p>
       <w:pPr>
-        <w:pStyle w:val="ListParagraph"/>
+        <w:pStyle w:val="Akapitzlist"/>
         <w:numPr>
           <w:ilvl w:val="0"/>
           <w:numId w:val="15"/>
@@ -3095,7 +2994,7 @@
     </w:p>
     <w:p>
       <w:pPr>
-        <w:pStyle w:val="ListParagraph"/>
+        <w:pStyle w:val="Akapitzlist"/>
         <w:numPr>
           <w:ilvl w:val="0"/>
           <w:numId w:val="15"/>
@@ -3107,13 +3006,13 @@
     </w:p>
     <w:p>
       <w:pPr>
-        <w:pStyle w:val="ListParagraph"/>
+        <w:pStyle w:val="Akapitzlist"/>
         <w:ind w:left="1440"/>
       </w:pPr>
     </w:p>
     <w:p>
       <w:pPr>
-        <w:pStyle w:val="ListParagraph"/>
+        <w:pStyle w:val="Akapitzlist"/>
         <w:numPr>
           <w:ilvl w:val="0"/>
           <w:numId w:val="5"/>
@@ -3126,7 +3025,7 @@
     </w:p>
     <w:p>
       <w:pPr>
-        <w:pStyle w:val="ListParagraph"/>
+        <w:pStyle w:val="Akapitzlist"/>
         <w:numPr>
           <w:ilvl w:val="0"/>
           <w:numId w:val="14"/>
@@ -3138,7 +3037,7 @@
     </w:p>
     <w:p>
       <w:pPr>
-        <w:pStyle w:val="ListParagraph"/>
+        <w:pStyle w:val="Akapitzlist"/>
         <w:numPr>
           <w:ilvl w:val="0"/>
           <w:numId w:val="13"/>
@@ -3150,7 +3049,7 @@
     </w:p>
     <w:p>
       <w:pPr>
-        <w:pStyle w:val="ListParagraph"/>
+        <w:pStyle w:val="Akapitzlist"/>
         <w:numPr>
           <w:ilvl w:val="0"/>
           <w:numId w:val="13"/>
@@ -3162,7 +3061,7 @@
     </w:p>
     <w:p>
       <w:pPr>
-        <w:pStyle w:val="ListParagraph"/>
+        <w:pStyle w:val="Akapitzlist"/>
         <w:numPr>
           <w:ilvl w:val="0"/>
           <w:numId w:val="13"/>
@@ -3174,7 +3073,7 @@
     </w:p>
     <w:p>
       <w:pPr>
-        <w:pStyle w:val="ListParagraph"/>
+        <w:pStyle w:val="Akapitzlist"/>
         <w:numPr>
           <w:ilvl w:val="0"/>
           <w:numId w:val="13"/>
@@ -3186,7 +3085,7 @@
     </w:p>
     <w:p>
       <w:pPr>
-        <w:pStyle w:val="ListParagraph"/>
+        <w:pStyle w:val="Akapitzlist"/>
         <w:numPr>
           <w:ilvl w:val="0"/>
           <w:numId w:val="13"/>
@@ -3198,7 +3097,7 @@
     </w:p>
     <w:p>
       <w:pPr>
-        <w:pStyle w:val="ListParagraph"/>
+        <w:pStyle w:val="Akapitzlist"/>
         <w:numPr>
           <w:ilvl w:val="0"/>
           <w:numId w:val="14"/>
@@ -3210,7 +3109,7 @@
     </w:p>
     <w:p>
       <w:pPr>
-        <w:pStyle w:val="ListParagraph"/>
+        <w:pStyle w:val="Akapitzlist"/>
         <w:numPr>
           <w:ilvl w:val="0"/>
           <w:numId w:val="12"/>
@@ -3222,7 +3121,7 @@
     </w:p>
     <w:p>
       <w:pPr>
-        <w:pStyle w:val="ListParagraph"/>
+        <w:pStyle w:val="Akapitzlist"/>
         <w:numPr>
           <w:ilvl w:val="0"/>
           <w:numId w:val="12"/>
@@ -3234,7 +3133,7 @@
     </w:p>
     <w:p>
       <w:pPr>
-        <w:pStyle w:val="ListParagraph"/>
+        <w:pStyle w:val="Akapitzlist"/>
         <w:numPr>
           <w:ilvl w:val="0"/>
           <w:numId w:val="12"/>
@@ -3246,7 +3145,7 @@
     </w:p>
     <w:p>
       <w:pPr>
-        <w:pStyle w:val="ListParagraph"/>
+        <w:pStyle w:val="Akapitzlist"/>
         <w:numPr>
           <w:ilvl w:val="0"/>
           <w:numId w:val="12"/>
@@ -3258,13 +3157,13 @@
     </w:p>
     <w:p>
       <w:pPr>
-        <w:pStyle w:val="ListParagraph"/>
+        <w:pStyle w:val="Akapitzlist"/>
         <w:ind w:left="1800"/>
       </w:pPr>
     </w:p>
     <w:p>
       <w:pPr>
-        <w:pStyle w:val="ListParagraph"/>
+        <w:pStyle w:val="Akapitzlist"/>
         <w:numPr>
           <w:ilvl w:val="0"/>
           <w:numId w:val="5"/>
@@ -3276,7 +3175,7 @@
     </w:p>
     <w:p>
       <w:pPr>
-        <w:pStyle w:val="ListParagraph"/>
+        <w:pStyle w:val="Akapitzlist"/>
         <w:numPr>
           <w:ilvl w:val="0"/>
           <w:numId w:val="11"/>
@@ -3288,7 +3187,7 @@
     </w:p>
     <w:p>
       <w:pPr>
-        <w:pStyle w:val="ListParagraph"/>
+        <w:pStyle w:val="Akapitzlist"/>
         <w:numPr>
           <w:ilvl w:val="0"/>
           <w:numId w:val="11"/>
@@ -3300,7 +3199,7 @@
     </w:p>
     <w:p>
       <w:pPr>
-        <w:pStyle w:val="ListParagraph"/>
+        <w:pStyle w:val="Akapitzlist"/>
         <w:numPr>
           <w:ilvl w:val="0"/>
           <w:numId w:val="11"/>
@@ -3312,7 +3211,7 @@
     </w:p>
     <w:p>
       <w:pPr>
-        <w:pStyle w:val="ListParagraph"/>
+        <w:pStyle w:val="Akapitzlist"/>
         <w:numPr>
           <w:ilvl w:val="0"/>
           <w:numId w:val="11"/>
@@ -3324,13 +3223,13 @@
     </w:p>
     <w:p>
       <w:pPr>
-        <w:pStyle w:val="ListParagraph"/>
+        <w:pStyle w:val="Akapitzlist"/>
         <w:ind w:left="1440"/>
       </w:pPr>
     </w:p>
     <w:p>
       <w:pPr>
-        <w:pStyle w:val="ListParagraph"/>
+        <w:pStyle w:val="Akapitzlist"/>
         <w:numPr>
           <w:ilvl w:val="0"/>
           <w:numId w:val="5"/>
@@ -3342,7 +3241,7 @@
     </w:p>
     <w:p>
       <w:pPr>
-        <w:pStyle w:val="ListParagraph"/>
+        <w:pStyle w:val="Akapitzlist"/>
         <w:numPr>
           <w:ilvl w:val="0"/>
           <w:numId w:val="10"/>
@@ -3354,7 +3253,7 @@
     </w:p>
     <w:p>
       <w:pPr>
-        <w:pStyle w:val="ListParagraph"/>
+        <w:pStyle w:val="Akapitzlist"/>
         <w:numPr>
           <w:ilvl w:val="0"/>
           <w:numId w:val="10"/>
@@ -3371,7 +3270,7 @@
     </w:p>
     <w:p>
       <w:pPr>
-        <w:pStyle w:val="ListParagraph"/>
+        <w:pStyle w:val="Akapitzlist"/>
         <w:numPr>
           <w:ilvl w:val="0"/>
           <w:numId w:val="3"/>
@@ -3390,7 +3289,7 @@
     </w:p>
     <w:p>
       <w:pPr>
-        <w:pStyle w:val="ListParagraph"/>
+        <w:pStyle w:val="Akapitzlist"/>
         <w:numPr>
           <w:ilvl w:val="0"/>
           <w:numId w:val="6"/>
@@ -3402,7 +3301,7 @@
     </w:p>
     <w:p>
       <w:pPr>
-        <w:pStyle w:val="ListParagraph"/>
+        <w:pStyle w:val="Akapitzlist"/>
         <w:numPr>
           <w:ilvl w:val="0"/>
           <w:numId w:val="16"/>
@@ -3414,7 +3313,7 @@
     </w:p>
     <w:p>
       <w:pPr>
-        <w:pStyle w:val="ListParagraph"/>
+        <w:pStyle w:val="Akapitzlist"/>
         <w:numPr>
           <w:ilvl w:val="0"/>
           <w:numId w:val="16"/>
@@ -3426,13 +3325,13 @@
     </w:p>
     <w:p>
       <w:pPr>
-        <w:pStyle w:val="ListParagraph"/>
+        <w:pStyle w:val="Akapitzlist"/>
         <w:ind w:left="1080"/>
       </w:pPr>
     </w:p>
     <w:p>
       <w:pPr>
-        <w:pStyle w:val="ListParagraph"/>
+        <w:pStyle w:val="Akapitzlist"/>
         <w:numPr>
           <w:ilvl w:val="0"/>
           <w:numId w:val="6"/>
@@ -3444,7 +3343,7 @@
     </w:p>
     <w:p>
       <w:pPr>
-        <w:pStyle w:val="ListParagraph"/>
+        <w:pStyle w:val="Akapitzlist"/>
         <w:numPr>
           <w:ilvl w:val="0"/>
           <w:numId w:val="16"/>
@@ -3456,7 +3355,7 @@
     </w:p>
     <w:p>
       <w:pPr>
-        <w:pStyle w:val="ListParagraph"/>
+        <w:pStyle w:val="Akapitzlist"/>
         <w:numPr>
           <w:ilvl w:val="0"/>
           <w:numId w:val="16"/>
@@ -3468,7 +3367,7 @@
     </w:p>
     <w:p>
       <w:pPr>
-        <w:pStyle w:val="ListParagraph"/>
+        <w:pStyle w:val="Akapitzlist"/>
         <w:numPr>
           <w:ilvl w:val="0"/>
           <w:numId w:val="16"/>
@@ -3480,7 +3379,7 @@
     </w:p>
     <w:p>
       <w:pPr>
-        <w:pStyle w:val="ListParagraph"/>
+        <w:pStyle w:val="Akapitzlist"/>
         <w:numPr>
           <w:ilvl w:val="0"/>
           <w:numId w:val="16"/>
@@ -3492,7 +3391,7 @@
     </w:p>
     <w:p>
       <w:pPr>
-        <w:pStyle w:val="ListParagraph"/>
+        <w:pStyle w:val="Akapitzlist"/>
         <w:numPr>
           <w:ilvl w:val="0"/>
           <w:numId w:val="16"/>
@@ -3504,7 +3403,7 @@
     </w:p>
     <w:p>
       <w:pPr>
-        <w:pStyle w:val="ListParagraph"/>
+        <w:pStyle w:val="Akapitzlist"/>
         <w:numPr>
           <w:ilvl w:val="0"/>
           <w:numId w:val="16"/>
@@ -3516,7 +3415,7 @@
     </w:p>
     <w:p>
       <w:pPr>
-        <w:pStyle w:val="ListParagraph"/>
+        <w:pStyle w:val="Akapitzlist"/>
         <w:numPr>
           <w:ilvl w:val="0"/>
           <w:numId w:val="16"/>
@@ -3529,7 +3428,7 @@
     </w:p>
     <w:p>
       <w:pPr>
-        <w:pStyle w:val="ListParagraph"/>
+        <w:pStyle w:val="Akapitzlist"/>
         <w:numPr>
           <w:ilvl w:val="0"/>
           <w:numId w:val="16"/>
@@ -3541,13 +3440,13 @@
     </w:p>
     <w:p>
       <w:pPr>
-        <w:pStyle w:val="ListParagraph"/>
+        <w:pStyle w:val="Akapitzlist"/>
         <w:ind w:left="1440"/>
       </w:pPr>
     </w:p>
     <w:p>
       <w:pPr>
-        <w:pStyle w:val="ListParagraph"/>
+        <w:pStyle w:val="Akapitzlist"/>
         <w:numPr>
           <w:ilvl w:val="0"/>
           <w:numId w:val="6"/>
@@ -3559,7 +3458,7 @@
     </w:p>
     <w:p>
       <w:pPr>
-        <w:pStyle w:val="ListParagraph"/>
+        <w:pStyle w:val="Akapitzlist"/>
         <w:numPr>
           <w:ilvl w:val="0"/>
           <w:numId w:val="8"/>
@@ -3571,7 +3470,7 @@
     </w:p>
     <w:p>
       <w:pPr>
-        <w:pStyle w:val="ListParagraph"/>
+        <w:pStyle w:val="Akapitzlist"/>
         <w:numPr>
           <w:ilvl w:val="0"/>
           <w:numId w:val="16"/>
@@ -3583,7 +3482,7 @@
     </w:p>
     <w:p>
       <w:pPr>
-        <w:pStyle w:val="ListParagraph"/>
+        <w:pStyle w:val="Akapitzlist"/>
         <w:numPr>
           <w:ilvl w:val="0"/>
           <w:numId w:val="16"/>
@@ -3595,7 +3494,7 @@
     </w:p>
     <w:p>
       <w:pPr>
-        <w:pStyle w:val="ListParagraph"/>
+        <w:pStyle w:val="Akapitzlist"/>
         <w:numPr>
           <w:ilvl w:val="0"/>
           <w:numId w:val="16"/>
@@ -3607,7 +3506,7 @@
     </w:p>
     <w:p>
       <w:pPr>
-        <w:pStyle w:val="ListParagraph"/>
+        <w:pStyle w:val="Akapitzlist"/>
         <w:numPr>
           <w:ilvl w:val="0"/>
           <w:numId w:val="16"/>
@@ -3619,7 +3518,7 @@
     </w:p>
     <w:p>
       <w:pPr>
-        <w:pStyle w:val="ListParagraph"/>
+        <w:pStyle w:val="Akapitzlist"/>
         <w:numPr>
           <w:ilvl w:val="0"/>
           <w:numId w:val="16"/>
@@ -3631,7 +3530,7 @@
     </w:p>
     <w:p>
       <w:pPr>
-        <w:pStyle w:val="ListParagraph"/>
+        <w:pStyle w:val="Akapitzlist"/>
         <w:numPr>
           <w:ilvl w:val="0"/>
           <w:numId w:val="16"/>
@@ -3643,7 +3542,7 @@
     </w:p>
     <w:p>
       <w:pPr>
-        <w:pStyle w:val="ListParagraph"/>
+        <w:pStyle w:val="Akapitzlist"/>
         <w:numPr>
           <w:ilvl w:val="0"/>
           <w:numId w:val="8"/>
@@ -3661,7 +3560,7 @@
     </w:p>
     <w:p>
       <w:pPr>
-        <w:pStyle w:val="ListParagraph"/>
+        <w:pStyle w:val="Akapitzlist"/>
         <w:numPr>
           <w:ilvl w:val="0"/>
           <w:numId w:val="16"/>
@@ -3673,7 +3572,7 @@
     </w:p>
     <w:p>
       <w:pPr>
-        <w:pStyle w:val="ListParagraph"/>
+        <w:pStyle w:val="Akapitzlist"/>
         <w:numPr>
           <w:ilvl w:val="0"/>
           <w:numId w:val="16"/>
@@ -3688,7 +3587,7 @@
     </w:p>
     <w:p>
       <w:pPr>
-        <w:pStyle w:val="ListParagraph"/>
+        <w:pStyle w:val="Akapitzlist"/>
         <w:numPr>
           <w:ilvl w:val="0"/>
           <w:numId w:val="16"/>
@@ -3700,7 +3599,7 @@
     </w:p>
     <w:p>
       <w:pPr>
-        <w:pStyle w:val="ListParagraph"/>
+        <w:pStyle w:val="Akapitzlist"/>
         <w:numPr>
           <w:ilvl w:val="0"/>
           <w:numId w:val="16"/>
@@ -3712,13 +3611,13 @@
     </w:p>
     <w:p>
       <w:pPr>
-        <w:pStyle w:val="ListParagraph"/>
+        <w:pStyle w:val="Akapitzlist"/>
         <w:ind w:left="1440"/>
       </w:pPr>
     </w:p>
     <w:p>
       <w:pPr>
-        <w:pStyle w:val="ListParagraph"/>
+        <w:pStyle w:val="Akapitzlist"/>
         <w:numPr>
           <w:ilvl w:val="0"/>
           <w:numId w:val="6"/>
@@ -3730,7 +3629,7 @@
     </w:p>
     <w:p>
       <w:pPr>
-        <w:pStyle w:val="ListParagraph"/>
+        <w:pStyle w:val="Akapitzlist"/>
         <w:numPr>
           <w:ilvl w:val="0"/>
           <w:numId w:val="7"/>
@@ -3742,7 +3641,7 @@
     </w:p>
     <w:p>
       <w:pPr>
-        <w:pStyle w:val="ListParagraph"/>
+        <w:pStyle w:val="Akapitzlist"/>
         <w:numPr>
           <w:ilvl w:val="0"/>
           <w:numId w:val="7"/>
@@ -3760,7 +3659,7 @@
     </w:p>
     <w:p>
       <w:pPr>
-        <w:pStyle w:val="ListParagraph"/>
+        <w:pStyle w:val="Akapitzlist"/>
         <w:numPr>
           <w:ilvl w:val="0"/>
           <w:numId w:val="7"/>
@@ -3772,13 +3671,13 @@
     </w:p>
     <w:p>
       <w:pPr>
-        <w:pStyle w:val="ListParagraph"/>
+        <w:pStyle w:val="Akapitzlist"/>
         <w:ind w:left="1440"/>
       </w:pPr>
     </w:p>
     <w:p>
       <w:pPr>
-        <w:pStyle w:val="ListParagraph"/>
+        <w:pStyle w:val="Akapitzlist"/>
         <w:numPr>
           <w:ilvl w:val="0"/>
           <w:numId w:val="6"/>
@@ -3791,7 +3690,7 @@
     </w:p>
     <w:p>
       <w:pPr>
-        <w:pStyle w:val="ListParagraph"/>
+        <w:pStyle w:val="Akapitzlist"/>
         <w:numPr>
           <w:ilvl w:val="0"/>
           <w:numId w:val="16"/>
@@ -3803,7 +3702,7 @@
     </w:p>
     <w:p>
       <w:pPr>
-        <w:pStyle w:val="ListParagraph"/>
+        <w:pStyle w:val="Akapitzlist"/>
         <w:numPr>
           <w:ilvl w:val="0"/>
           <w:numId w:val="16"/>
@@ -6169,16 +6068,16 @@
   <w:num w:numId="19" w16cid:durableId="2127384956">
     <w:abstractNumId w:val="5"/>
   </w:num>
-  <w:num w:numId="20" w16cid:durableId="1218469101">
+  <w:num w:numId="20" w16cid:durableId="711198130">
+    <w:abstractNumId w:val="6"/>
+  </w:num>
+  <w:num w:numId="21" w16cid:durableId="1218469101">
     <w:abstractNumId w:val="9"/>
   </w:num>
-  <w:num w:numId="21" w16cid:durableId="1556045746">
+  <w:num w:numId="22" w16cid:durableId="1556045746">
     <w:abstractNumId w:val="4"/>
   </w:num>
-  <w:num w:numId="22" w16cid:durableId="711198130">
-    <w:abstractNumId w:val="6"/>
-  </w:num>
-  <w:numIdMacAtCleanup w:val="21"/>
+  <w:numIdMacAtCleanup w:val="16"/>
 </w:numbering>
 </file>
 
@@ -6577,14 +6476,14 @@
     <w:lsdException w:name="Unresolved Mention" w:semiHidden="1" w:unhideWhenUsed="1"/>
     <w:lsdException w:name="Smart Link" w:semiHidden="1" w:unhideWhenUsed="1"/>
   </w:latentStyles>
-  <w:style w:type="paragraph" w:default="1" w:styleId="Normal">
+  <w:style w:type="paragraph" w:default="1" w:styleId="Normalny">
     <w:name w:val="Normal"/>
     <w:qFormat/>
   </w:style>
-  <w:style w:type="paragraph" w:styleId="Heading1">
-    <w:name w:val="Heading 1"/>
-    <w:basedOn w:val="Normal"/>
-    <w:next w:val="Normal"/>
+  <w:style w:type="paragraph" w:styleId="Nagwek1">
+    <w:name w:val="heading 1"/>
+    <w:basedOn w:val="Normalny"/>
+    <w:next w:val="Normalny"/>
     <w:uiPriority w:val="9"/>
     <w:qFormat/>
     <w:rsid w:val="5F21DB3D"/>
@@ -6601,10 +6500,10 @@
       <w:szCs w:val="40"/>
     </w:rPr>
   </w:style>
-  <w:style w:type="paragraph" w:styleId="Heading2">
-    <w:name w:val="Heading 2"/>
-    <w:basedOn w:val="Normal"/>
-    <w:next w:val="Normal"/>
+  <w:style w:type="paragraph" w:styleId="Nagwek2">
+    <w:name w:val="heading 2"/>
+    <w:basedOn w:val="Normalny"/>
+    <w:next w:val="Normalny"/>
     <w:uiPriority w:val="9"/>
     <w:unhideWhenUsed/>
     <w:qFormat/>
@@ -6622,10 +6521,10 @@
       <w:szCs w:val="32"/>
     </w:rPr>
   </w:style>
-  <w:style w:type="paragraph" w:styleId="Heading3">
-    <w:name w:val="Heading 3"/>
-    <w:basedOn w:val="Normal"/>
-    <w:next w:val="Normal"/>
+  <w:style w:type="paragraph" w:styleId="Nagwek3">
+    <w:name w:val="heading 3"/>
+    <w:basedOn w:val="Normalny"/>
+    <w:next w:val="Normalny"/>
     <w:uiPriority w:val="9"/>
     <w:unhideWhenUsed/>
     <w:qFormat/>
@@ -6641,14 +6540,14 @@
       <w:color w:val="0A2F40" w:themeColor="accent1" w:themeShade="7F"/>
     </w:rPr>
   </w:style>
-  <w:style w:type="character" w:default="1" w:styleId="DefaultParagraphFont">
+  <w:style w:type="character" w:default="1" w:styleId="Domylnaczcionkaakapitu">
     <w:name w:val="Default Paragraph Font"/>
     <w:uiPriority w:val="1"/>
     <w:semiHidden/>
     <w:unhideWhenUsed/>
   </w:style>
-  <w:style w:type="table" w:default="1" w:styleId="TableNormal">
-    <w:name w:val="Table Normal"/>
+  <w:style w:type="table" w:default="1" w:styleId="Standardowy">
+    <w:name w:val="Normal Table"/>
     <w:uiPriority w:val="99"/>
     <w:semiHidden/>
     <w:unhideWhenUsed/>
@@ -6662,15 +6561,15 @@
       </w:tblCellMar>
     </w:tblPr>
   </w:style>
-  <w:style w:type="numbering" w:default="1" w:styleId="NoList">
+  <w:style w:type="numbering" w:default="1" w:styleId="Bezlisty">
     <w:name w:val="No List"/>
     <w:uiPriority w:val="99"/>
     <w:semiHidden/>
     <w:unhideWhenUsed/>
   </w:style>
-  <w:style w:type="paragraph" w:styleId="ListParagraph">
+  <w:style w:type="paragraph" w:styleId="Akapitzlist">
     <w:name w:val="List Paragraph"/>
-    <w:basedOn w:val="Normal"/>
+    <w:basedOn w:val="Normalny"/>
     <w:uiPriority w:val="34"/>
     <w:qFormat/>
     <w:rsid w:val="49FF1289"/>
@@ -6679,9 +6578,9 @@
       <w:contextualSpacing/>
     </w:pPr>
   </w:style>
-  <w:style w:type="character" w:styleId="Hyperlink">
+  <w:style w:type="character" w:styleId="Hipercze">
     <w:name w:val="Hyperlink"/>
-    <w:basedOn w:val="DefaultParagraphFont"/>
+    <w:basedOn w:val="Domylnaczcionkaakapitu"/>
     <w:uiPriority w:val="99"/>
     <w:unhideWhenUsed/>
     <w:rsid w:val="49FF1289"/>
@@ -6690,9 +6589,9 @@
       <w:u w:val="single"/>
     </w:rPr>
   </w:style>
-  <w:style w:type="table" w:styleId="TableGrid">
+  <w:style w:type="table" w:styleId="Tabela-Siatka">
     <w:name w:val="Table Grid"/>
-    <w:basedOn w:val="TableNormal"/>
+    <w:basedOn w:val="Standardowy"/>
     <w:uiPriority w:val="59"/>
     <w:rsid w:val="00FB4123"/>
     <w:pPr>
@@ -6709,9 +6608,9 @@
       </w:tblBorders>
     </w:tblPr>
   </w:style>
-  <w:style w:type="character" w:styleId="UnresolvedMention">
+  <w:style w:type="character" w:styleId="Nierozpoznanawzmianka">
     <w:name w:val="Unresolved Mention"/>
-    <w:basedOn w:val="DefaultParagraphFont"/>
+    <w:basedOn w:val="Domylnaczcionkaakapitu"/>
     <w:uiPriority w:val="99"/>
     <w:semiHidden/>
     <w:unhideWhenUsed/>
@@ -6721,9 +6620,9 @@
       <w:shd w:val="clear" w:color="auto" w:fill="E1DFDD"/>
     </w:rPr>
   </w:style>
-  <w:style w:type="character" w:styleId="EndnoteReference">
-    <w:name w:val="Endnote Reference"/>
-    <w:basedOn w:val="DefaultParagraphFont"/>
+  <w:style w:type="character" w:styleId="Odwoanieprzypisukocowego">
+    <w:name w:val="endnote reference"/>
+    <w:basedOn w:val="Domylnaczcionkaakapitu"/>
     <w:uiPriority w:val="99"/>
     <w:semiHidden/>
     <w:unhideWhenUsed/>
@@ -6734,7 +6633,7 @@
   </w:style>
   <w:style w:type="character" w:customStyle="1" w:styleId="TekstprzypisukocowegoZnak">
     <w:name w:val="Tekst przypisu końcowego Znak"/>
-    <w:basedOn w:val="DefaultParagraphFont"/>
+    <w:basedOn w:val="Domylnaczcionkaakapitu"/>
     <w:uiPriority w:val="99"/>
     <w:semiHidden/>
     <w:rsid w:val="004F20F3"/>
@@ -6745,21 +6644,21 @@
   </w:style>
   <w:style w:type="character" w:customStyle="1" w:styleId="NagwekZnak">
     <w:name w:val="Nagłówek Znak"/>
-    <w:basedOn w:val="DefaultParagraphFont"/>
+    <w:basedOn w:val="Domylnaczcionkaakapitu"/>
     <w:uiPriority w:val="99"/>
     <w:semiHidden/>
     <w:rsid w:val="004F20F3"/>
   </w:style>
   <w:style w:type="character" w:customStyle="1" w:styleId="StopkaZnak">
     <w:name w:val="Stopka Znak"/>
-    <w:basedOn w:val="DefaultParagraphFont"/>
+    <w:basedOn w:val="Domylnaczcionkaakapitu"/>
     <w:uiPriority w:val="99"/>
     <w:semiHidden/>
     <w:rsid w:val="004F20F3"/>
   </w:style>
   <w:style w:type="paragraph" w:styleId="Nagwek">
     <w:name w:val="header"/>
-    <w:basedOn w:val="Normal"/>
+    <w:basedOn w:val="Normalny"/>
     <w:link w:val="NagwekZnak2"/>
     <w:uiPriority w:val="99"/>
     <w:semiHidden/>
@@ -6775,7 +6674,7 @@
   </w:style>
   <w:style w:type="character" w:customStyle="1" w:styleId="NagwekZnak2">
     <w:name w:val="Nagłówek Znak2"/>
-    <w:basedOn w:val="DefaultParagraphFont"/>
+    <w:basedOn w:val="Domylnaczcionkaakapitu"/>
     <w:link w:val="Nagwek"/>
     <w:uiPriority w:val="99"/>
     <w:semiHidden/>
@@ -6783,7 +6682,7 @@
   </w:style>
   <w:style w:type="paragraph" w:styleId="Stopka">
     <w:name w:val="footer"/>
-    <w:basedOn w:val="Normal"/>
+    <w:basedOn w:val="Normalny"/>
     <w:link w:val="StopkaZnak2"/>
     <w:uiPriority w:val="99"/>
     <w:semiHidden/>
@@ -6799,7 +6698,7 @@
   </w:style>
   <w:style w:type="character" w:customStyle="1" w:styleId="StopkaZnak2">
     <w:name w:val="Stopka Znak2"/>
-    <w:basedOn w:val="DefaultParagraphFont"/>
+    <w:basedOn w:val="Domylnaczcionkaakapitu"/>
     <w:link w:val="Stopka"/>
     <w:uiPriority w:val="99"/>
     <w:semiHidden/>
@@ -6821,10 +6720,10 @@
       </w:tblCellMar>
     </w:tblPr>
   </w:style>
-  <w:style w:type="paragraph" w:styleId="Title">
+  <w:style w:type="paragraph" w:styleId="Tytu">
     <w:name w:val="Title"/>
-    <w:basedOn w:val="Normal"/>
-    <w:next w:val="Normal"/>
+    <w:basedOn w:val="Normalny"/>
+    <w:next w:val="Normalny"/>
     <w:uiPriority w:val="10"/>
     <w:qFormat/>
     <w:rsid w:val="5F21DB3D"/>
@@ -6838,10 +6737,10 @@
       <w:szCs w:val="56"/>
     </w:rPr>
   </w:style>
-  <w:style w:type="paragraph" w:styleId="Subtitle">
+  <w:style w:type="paragraph" w:styleId="Podtytu">
     <w:name w:val="Subtitle"/>
-    <w:basedOn w:val="Normal"/>
-    <w:next w:val="Normal"/>
+    <w:basedOn w:val="Normalny"/>
+    <w:next w:val="Normalny"/>
     <w:uiPriority w:val="11"/>
     <w:qFormat/>
     <w:rsid w:val="5F21DB3D"/>
@@ -6854,31 +6753,31 @@
   </w:style>
   <w:style w:type="character" w:styleId="Tekstzastpczy">
     <w:name w:val="Placeholder Text"/>
-    <w:basedOn w:val="DefaultParagraphFont"/>
+    <w:basedOn w:val="Domylnaczcionkaakapitu"/>
     <w:uiPriority w:val="99"/>
     <w:semiHidden/>
-    <w:rsid w:val="00B10D06"/>
+    <w:rsid w:val="000B0F68"/>
     <w:rPr>
       <w:color w:val="666666"/>
     </w:rPr>
   </w:style>
   <w:style w:type="character" w:customStyle="1" w:styleId="NagwekZnak1">
     <w:name w:val="Nagłówek Znak1"/>
-    <w:basedOn w:val="DefaultParagraphFont"/>
+    <w:basedOn w:val="Domylnaczcionkaakapitu"/>
     <w:uiPriority w:val="99"/>
     <w:semiHidden/>
     <w:rsid w:val="00BF1A5E"/>
   </w:style>
   <w:style w:type="character" w:customStyle="1" w:styleId="StopkaZnak1">
     <w:name w:val="Stopka Znak1"/>
-    <w:basedOn w:val="DefaultParagraphFont"/>
+    <w:basedOn w:val="Domylnaczcionkaakapitu"/>
     <w:uiPriority w:val="99"/>
     <w:semiHidden/>
     <w:rsid w:val="00BF1A5E"/>
   </w:style>
   <w:style w:type="character" w:customStyle="1" w:styleId="Nagwek3Znak">
     <w:name w:val="Nagłówek 3 Znak"/>
-    <w:basedOn w:val="DefaultParagraphFont"/>
+    <w:basedOn w:val="Domylnaczcionkaakapitu"/>
     <w:uiPriority w:val="9"/>
     <w:rsid w:val="00BF1A5E"/>
     <w:rPr>

</xml_diff>

<commit_message>
aktualizaja sprawozdania o diagram klas i nową strukturę
</commit_message>
<xml_diff>
--- a/Sprawozdanie projektowe IO.docx
+++ b/Sprawozdanie projektowe IO.docx
@@ -299,8 +299,16 @@
               <w:rPr>
                 <w:rFonts w:ascii="Aptos" w:eastAsia="Aptos" w:hAnsi="Aptos" w:cs="Aptos"/>
               </w:rPr>
-              <w:t>Ernest Miciura</w:t>
+              <w:t xml:space="preserve">Ernest </w:t>
             </w:r>
+            <w:proofErr w:type="spellStart"/>
+            <w:r>
+              <w:rPr>
+                <w:rFonts w:ascii="Aptos" w:eastAsia="Aptos" w:hAnsi="Aptos" w:cs="Aptos"/>
+              </w:rPr>
+              <w:t>Miciura</w:t>
+            </w:r>
+            <w:proofErr w:type="spellEnd"/>
           </w:p>
         </w:tc>
         <w:tc>
@@ -504,7 +512,15 @@
         <w:jc w:val="both"/>
       </w:pPr>
       <w:r>
-        <w:t>Ernest Miciura:</w:t>
+        <w:t xml:space="preserve">Ernest </w:t>
+      </w:r>
+      <w:proofErr w:type="spellStart"/>
+      <w:r>
+        <w:t>Miciura</w:t>
+      </w:r>
+      <w:proofErr w:type="spellEnd"/>
+      <w:r>
+        <w:t>:</w:t>
       </w:r>
     </w:p>
     <w:p>
@@ -515,9 +531,11 @@
       <w:r>
         <w:t xml:space="preserve">Opis aktora: </w:t>
       </w:r>
+      <w:proofErr w:type="spellStart"/>
       <w:r>
         <w:t>Serwisant</w:t>
       </w:r>
+      <w:proofErr w:type="spellEnd"/>
       <w:r>
         <w:t>,</w:t>
       </w:r>
@@ -570,7 +588,15 @@
         <w:jc w:val="both"/>
       </w:pPr>
       <w:r>
-        <w:t xml:space="preserve">Ernest Miciura: </w:t>
+        <w:t xml:space="preserve">Ernest </w:t>
+      </w:r>
+      <w:proofErr w:type="spellStart"/>
+      <w:r>
+        <w:t>Miciura</w:t>
+      </w:r>
+      <w:proofErr w:type="spellEnd"/>
+      <w:r>
+        <w:t xml:space="preserve">: </w:t>
       </w:r>
       <w:r>
         <w:t>10 pkt.</w:t>
@@ -886,7 +912,15 @@
         <w:jc w:val="both"/>
       </w:pPr>
       <w:r>
-        <w:t>Serwis komputerowy obsługuje klientów indywidualnych oraz firmy, które zgłaszają usterki sprzętu komputerowego. Obsługą klienta oraz zarządzaniem zleceniami zajmuje się Pracownik Biura, natomiast za obsługę techniczną odpowiedzialny jest Serwisant. Klient ma możliwość uzyskania informacji o swoim zleceniu po wcześniejszej autoryzacji za pomocą numeru zlecenia.</w:t>
+        <w:t xml:space="preserve">Serwis komputerowy obsługuje klientów indywidualnych oraz firmy, które zgłaszają usterki sprzętu komputerowego. Obsługą klienta oraz zarządzaniem zleceniami zajmuje się Pracownik Biura, natomiast za obsługę techniczną odpowiedzialny jest </w:t>
+      </w:r>
+      <w:proofErr w:type="spellStart"/>
+      <w:r>
+        <w:t>Serwisant</w:t>
+      </w:r>
+      <w:proofErr w:type="spellEnd"/>
+      <w:r>
+        <w:t>. Klient ma możliwość uzyskania informacji o swoim zleceniu po wcześniejszej autoryzacji za pomocą numeru zlecenia.</w:t>
       </w:r>
     </w:p>
     <w:p>
@@ -1159,6 +1193,7 @@
       <w:r>
         <w:t xml:space="preserve">sposób wyliczenia: </w:t>
       </w:r>
+      <w:proofErr w:type="spellStart"/>
       <m:oMath>
         <m:r>
           <m:rPr>
@@ -1179,6 +1214,7 @@
           </w:rPr>
           <m:t>różnica</m:t>
         </m:r>
+        <w:proofErr w:type="spellEnd"/>
         <m:r>
           <m:rPr>
             <m:nor/>
@@ -1658,6 +1694,12 @@
         <w:jc w:val="both"/>
       </w:pPr>
       <w:r>
+        <w:t>4.1</w:t>
+      </w:r>
+      <w:r>
+        <w:tab/>
+      </w:r>
+      <w:r>
         <w:t>Diagram</w:t>
       </w:r>
       <w:r>
@@ -1673,10 +1715,10 @@
           <w:noProof/>
         </w:rPr>
         <w:drawing>
-          <wp:inline distT="0" distB="0" distL="0" distR="0" wp14:anchorId="4422E058" wp14:editId="5DBFB05D">
-            <wp:extent cx="6645910" cy="4953635"/>
+          <wp:inline distT="0" distB="0" distL="0" distR="0" wp14:anchorId="7C5F9507" wp14:editId="36C2BF99">
+            <wp:extent cx="6645910" cy="4959350"/>
             <wp:effectExtent l="0" t="0" r="2540" b="0"/>
-            <wp:docPr id="795853678" name="Grafika 1"/>
+            <wp:docPr id="1382524200" name="Grafika 1"/>
             <wp:cNvGraphicFramePr>
               <a:graphicFrameLocks xmlns:a="http://schemas.openxmlformats.org/drawingml/2006/main" noChangeAspect="1"/>
             </wp:cNvGraphicFramePr>
@@ -1684,7 +1726,7 @@
               <a:graphicData uri="http://schemas.openxmlformats.org/drawingml/2006/picture">
                 <pic:pic xmlns:pic="http://schemas.openxmlformats.org/drawingml/2006/picture">
                   <pic:nvPicPr>
-                    <pic:cNvPr id="795853678" name=""/>
+                    <pic:cNvPr id="913581464" name=""/>
                     <pic:cNvPicPr/>
                   </pic:nvPicPr>
                   <pic:blipFill>
@@ -1702,7 +1744,7 @@
                   <pic:spPr>
                     <a:xfrm>
                       <a:off x="0" y="0"/>
-                      <a:ext cx="6645910" cy="4953635"/>
+                      <a:ext cx="6645910" cy="4959350"/>
                     </a:xfrm>
                     <a:prstGeom prst="rect">
                       <a:avLst/>
@@ -1837,8 +1879,13 @@
         </w:numPr>
         <w:jc w:val="both"/>
       </w:pPr>
-      <w:r>
-        <w:t xml:space="preserve">Serwisant: pracownik serwisu </w:t>
+      <w:proofErr w:type="spellStart"/>
+      <w:r>
+        <w:t>Serwisant</w:t>
+      </w:r>
+      <w:proofErr w:type="spellEnd"/>
+      <w:r>
+        <w:t xml:space="preserve">: pracownik serwisu </w:t>
       </w:r>
       <w:r>
         <w:t xml:space="preserve">odpowiedzialny za </w:t>
@@ -3281,7 +3328,13 @@
         <w:t>Opis przypadku użycia „</w:t>
       </w:r>
       <w:r>
-        <w:t>Odbiór sprzętu</w:t>
+        <w:t>Wydanie</w:t>
+      </w:r>
+      <w:r>
+        <w:t xml:space="preserve"> sprzętu</w:t>
+      </w:r>
+      <w:r>
+        <w:t xml:space="preserve"> dla klienta</w:t>
       </w:r>
       <w:r>
         <w:t>”</w:t>
@@ -3709,7 +3762,203 @@
         </w:numPr>
       </w:pPr>
       <w:r>
-        <w:t xml:space="preserve">Pracownik biura ostatecznie zamyka zlecenie w systemie, zwalnia miejsce w magazynie, </w:t>
+        <w:t>Pracownik biura ostatecznie zamyka zlecenie w systemie, zwalnia miejsce w magazynie</w:t>
+      </w:r>
+    </w:p>
+    <w:p>
+      <w:pPr>
+        <w:pStyle w:val="Nagwek2"/>
+      </w:pPr>
+      <w:r>
+        <w:t>4.2</w:t>
+      </w:r>
+      <w:r>
+        <w:tab/>
+      </w:r>
+      <w:r>
+        <w:t>Diagramy czynności</w:t>
+      </w:r>
+    </w:p>
+    <w:p/>
+    <w:p/>
+    <w:p>
+      <w:pPr>
+        <w:pStyle w:val="Nagwek2"/>
+      </w:pPr>
+      <w:r>
+        <w:t>4.3</w:t>
+      </w:r>
+      <w:r>
+        <w:tab/>
+      </w:r>
+      <w:r>
+        <w:t>Diagramy interakcji (przebiegu)</w:t>
+      </w:r>
+    </w:p>
+    <w:p/>
+    <w:p/>
+    <w:p>
+      <w:pPr>
+        <w:pStyle w:val="Nagwek1"/>
+      </w:pPr>
+      <w:r>
+        <w:t>5.</w:t>
+      </w:r>
+      <w:r>
+        <w:tab/>
+      </w:r>
+      <w:r>
+        <w:t>Perspektywa projektowa</w:t>
+      </w:r>
+    </w:p>
+    <w:p>
+      <w:pPr>
+        <w:pStyle w:val="Nagwek2"/>
+      </w:pPr>
+      <w:r>
+        <w:t>5.</w:t>
+      </w:r>
+      <w:r>
+        <w:t>0</w:t>
+      </w:r>
+      <w:r>
+        <w:tab/>
+      </w:r>
+      <w:r>
+        <w:t>Proponowana architektura system</w:t>
+      </w:r>
+      <w:r>
+        <w:t>u</w:t>
+      </w:r>
+    </w:p>
+    <w:p/>
+    <w:p>
+      <w:pPr>
+        <w:pStyle w:val="Nagwek2"/>
+      </w:pPr>
+      <w:r>
+        <w:lastRenderedPageBreak/>
+        <w:t>5.</w:t>
+      </w:r>
+      <w:r>
+        <w:t>1</w:t>
+      </w:r>
+      <w:r>
+        <w:tab/>
+      </w:r>
+      <w:r>
+        <w:t>Diagram klas</w:t>
+      </w:r>
+    </w:p>
+    <w:p>
+      <w:r>
+        <w:drawing>
+          <wp:inline distT="0" distB="0" distL="0" distR="0" wp14:anchorId="723EE074" wp14:editId="1CF3C0E7">
+            <wp:extent cx="6645910" cy="2691130"/>
+            <wp:effectExtent l="0" t="0" r="2540" b="0"/>
+            <wp:docPr id="1953163535" name="Grafika 1"/>
+            <wp:cNvGraphicFramePr>
+              <a:graphicFrameLocks xmlns:a="http://schemas.openxmlformats.org/drawingml/2006/main" noChangeAspect="1"/>
+            </wp:cNvGraphicFramePr>
+            <a:graphic xmlns:a="http://schemas.openxmlformats.org/drawingml/2006/main">
+              <a:graphicData uri="http://schemas.openxmlformats.org/drawingml/2006/picture">
+                <pic:pic xmlns:pic="http://schemas.openxmlformats.org/drawingml/2006/picture">
+                  <pic:nvPicPr>
+                    <pic:cNvPr id="1953163535" name=""/>
+                    <pic:cNvPicPr/>
+                  </pic:nvPicPr>
+                  <pic:blipFill>
+                    <a:blip r:embed="rId13">
+                      <a:extLst>
+                        <a:ext uri="{96DAC541-7B7A-43D3-8B79-37D633B846F1}">
+                          <asvg:svgBlip xmlns:asvg="http://schemas.microsoft.com/office/drawing/2016/SVG/main" r:embed="rId14"/>
+                        </a:ext>
+                      </a:extLst>
+                    </a:blip>
+                    <a:stretch>
+                      <a:fillRect/>
+                    </a:stretch>
+                  </pic:blipFill>
+                  <pic:spPr>
+                    <a:xfrm>
+                      <a:off x="0" y="0"/>
+                      <a:ext cx="6645910" cy="2691130"/>
+                    </a:xfrm>
+                    <a:prstGeom prst="rect">
+                      <a:avLst/>
+                    </a:prstGeom>
+                  </pic:spPr>
+                </pic:pic>
+              </a:graphicData>
+            </a:graphic>
+          </wp:inline>
+        </w:drawing>
+      </w:r>
+    </w:p>
+    <w:p>
+      <w:pPr>
+        <w:pStyle w:val="Nagwek2"/>
+      </w:pPr>
+      <w:r>
+        <w:t>5.</w:t>
+      </w:r>
+      <w:r>
+        <w:t>2</w:t>
+      </w:r>
+      <w:r>
+        <w:tab/>
+      </w:r>
+      <w:r>
+        <w:t>Wykaz wszystkich klas</w:t>
+      </w:r>
+    </w:p>
+    <w:p/>
+    <w:p/>
+    <w:p>
+      <w:pPr>
+        <w:pStyle w:val="Nagwek2"/>
+      </w:pPr>
+      <w:r>
+        <w:t>5.</w:t>
+      </w:r>
+      <w:r>
+        <w:t>3</w:t>
+      </w:r>
+      <w:r>
+        <w:tab/>
+      </w:r>
+      <w:r>
+        <w:t>Diagramy stanów</w:t>
+      </w:r>
+    </w:p>
+    <w:p/>
+    <w:p/>
+    <w:p>
+      <w:pPr>
+        <w:pStyle w:val="Nagwek2"/>
+      </w:pPr>
+      <w:r>
+        <w:t>5.4</w:t>
+      </w:r>
+      <w:r>
+        <w:tab/>
+        <w:t>Propozycje interfejsu użytkownika</w:t>
+      </w:r>
+    </w:p>
+    <w:p/>
+    <w:p/>
+    <w:p>
+      <w:pPr>
+        <w:pStyle w:val="Nagwek1"/>
+      </w:pPr>
+      <w:r>
+        <w:t>6.</w:t>
+      </w:r>
+      <w:r>
+        <w:tab/>
+      </w:r>
+      <w:r>
+        <w:t>Wymagania niefunkcjonalne dla systemu</w:t>
       </w:r>
     </w:p>
     <w:sectPr>
@@ -7050,6 +7299,27 @@
 </file>
 
 <file path=customXml/item1.xml><?xml version="1.0" encoding="utf-8"?>
+<b:Sources xmlns:b="http://schemas.openxmlformats.org/officeDocument/2006/bibliography" xmlns="http://schemas.openxmlformats.org/officeDocument/2006/bibliography" SelectedStyle="\APASixthEditionOfficeOnline.xsl" StyleName="APA" Version="6"/>
+</file>
+
+<file path=customXml/item2.xml><?xml version="1.0" encoding="utf-8"?>
+<p:properties xmlns:p="http://schemas.microsoft.com/office/2006/metadata/properties" xmlns:xsi="http://www.w3.org/2001/XMLSchema-instance" xmlns:pc="http://schemas.microsoft.com/office/infopath/2007/PartnerControls">
+  <documentManagement>
+    <_activity xmlns="01a094b0-08a8-443b-bd9d-7d2701d1cf8a" xsi:nil="true"/>
+  </documentManagement>
+</p:properties>
+</file>
+
+<file path=customXml/item3.xml><?xml version="1.0" encoding="utf-8"?>
+<?mso-contentType ?>
+<FormTemplates xmlns="http://schemas.microsoft.com/sharepoint/v3/contenttype/forms">
+  <Display>DocumentLibraryForm</Display>
+  <Edit>DocumentLibraryForm</Edit>
+  <New>DocumentLibraryForm</New>
+</FormTemplates>
+</file>
+
+<file path=customXml/item4.xml><?xml version="1.0" encoding="utf-8"?>
 <ct:contentTypeSchema xmlns:ct="http://schemas.microsoft.com/office/2006/metadata/contentType" xmlns:ma="http://schemas.microsoft.com/office/2006/metadata/properties/metaAttributes" ct:_="" ma:_="" ma:contentTypeName="Dokument" ma:contentTypeID="0x010100CCB42EE1A2101A46A529E33B73FA5B9E" ma:contentTypeVersion="6" ma:contentTypeDescription="Utwórz nowy dokument." ma:contentTypeScope="" ma:versionID="7f99c836655c8e118ac5ff6deceec588">
   <xsd:schema xmlns:xsd="http://www.w3.org/2001/XMLSchema" xmlns:xs="http://www.w3.org/2001/XMLSchema" xmlns:p="http://schemas.microsoft.com/office/2006/metadata/properties" xmlns:ns3="01a094b0-08a8-443b-bd9d-7d2701d1cf8a" targetNamespace="http://schemas.microsoft.com/office/2006/metadata/properties" ma:root="true" ma:fieldsID="402682bf42a3ef1dd60032c46426ad7b" ns3:_="">
     <xsd:import namespace="01a094b0-08a8-443b-bd9d-7d2701d1cf8a"/>
@@ -7205,28 +7475,33 @@
 </ct:contentTypeSchema>
 </file>
 
-<file path=customXml/item2.xml><?xml version="1.0" encoding="utf-8"?>
-<?mso-contentType ?>
-<FormTemplates xmlns="http://schemas.microsoft.com/sharepoint/v3/contenttype/forms">
-  <Display>DocumentLibraryForm</Display>
-  <Edit>DocumentLibraryForm</Edit>
-  <New>DocumentLibraryForm</New>
-</FormTemplates>
+<file path=customXml/itemProps1.xml><?xml version="1.0" encoding="utf-8"?>
+<ds:datastoreItem xmlns:ds="http://schemas.openxmlformats.org/officeDocument/2006/customXml" ds:itemID="{67C8E2F5-E66A-4D6E-A0D7-4D1B26B079DC}">
+  <ds:schemaRefs>
+    <ds:schemaRef ds:uri="http://schemas.openxmlformats.org/officeDocument/2006/bibliography"/>
+  </ds:schemaRefs>
+</ds:datastoreItem>
 </file>
 
-<file path=customXml/item3.xml><?xml version="1.0" encoding="utf-8"?>
-<p:properties xmlns:p="http://schemas.microsoft.com/office/2006/metadata/properties" xmlns:xsi="http://www.w3.org/2001/XMLSchema-instance" xmlns:pc="http://schemas.microsoft.com/office/infopath/2007/PartnerControls">
-  <documentManagement>
-    <_activity xmlns="01a094b0-08a8-443b-bd9d-7d2701d1cf8a" xsi:nil="true"/>
-  </documentManagement>
-</p:properties>
+<file path=customXml/itemProps2.xml><?xml version="1.0" encoding="utf-8"?>
+<ds:datastoreItem xmlns:ds="http://schemas.openxmlformats.org/officeDocument/2006/customXml" ds:itemID="{7597BCB1-5F9D-46E4-B418-B874D9A18AD7}">
+  <ds:schemaRefs>
+    <ds:schemaRef ds:uri="http://schemas.microsoft.com/office/2006/metadata/properties"/>
+    <ds:schemaRef ds:uri="http://schemas.microsoft.com/office/infopath/2007/PartnerControls"/>
+    <ds:schemaRef ds:uri="01a094b0-08a8-443b-bd9d-7d2701d1cf8a"/>
+  </ds:schemaRefs>
+</ds:datastoreItem>
 </file>
 
-<file path=customXml/item4.xml><?xml version="1.0" encoding="utf-8"?>
-<b:Sources xmlns:b="http://schemas.openxmlformats.org/officeDocument/2006/bibliography" xmlns="http://schemas.openxmlformats.org/officeDocument/2006/bibliography" SelectedStyle="\APASixthEditionOfficeOnline.xsl" StyleName="APA" Version="6"/>
+<file path=customXml/itemProps3.xml><?xml version="1.0" encoding="utf-8"?>
+<ds:datastoreItem xmlns:ds="http://schemas.openxmlformats.org/officeDocument/2006/customXml" ds:itemID="{0F49DEAA-62A3-474D-9D43-5B4EB3847878}">
+  <ds:schemaRefs>
+    <ds:schemaRef ds:uri="http://schemas.microsoft.com/sharepoint/v3/contenttype/forms"/>
+  </ds:schemaRefs>
+</ds:datastoreItem>
 </file>
 
-<file path=customXml/itemProps1.xml><?xml version="1.0" encoding="utf-8"?>
+<file path=customXml/itemProps4.xml><?xml version="1.0" encoding="utf-8"?>
 <ds:datastoreItem xmlns:ds="http://schemas.openxmlformats.org/officeDocument/2006/customXml" ds:itemID="{9FAA2568-8506-478A-A3AF-FB593C23B164}">
   <ds:schemaRefs>
     <ds:schemaRef ds:uri="http://schemas.microsoft.com/office/2006/metadata/contentType"/>
@@ -7242,30 +7517,4 @@
     <ds:schemaRef ds:uri="http://schemas.microsoft.com/internal/obd"/>
   </ds:schemaRefs>
 </ds:datastoreItem>
-</file>
-
-<file path=customXml/itemProps2.xml><?xml version="1.0" encoding="utf-8"?>
-<ds:datastoreItem xmlns:ds="http://schemas.openxmlformats.org/officeDocument/2006/customXml" ds:itemID="{0F49DEAA-62A3-474D-9D43-5B4EB3847878}">
-  <ds:schemaRefs>
-    <ds:schemaRef ds:uri="http://schemas.microsoft.com/sharepoint/v3/contenttype/forms"/>
-  </ds:schemaRefs>
-</ds:datastoreItem>
-</file>
-
-<file path=customXml/itemProps3.xml><?xml version="1.0" encoding="utf-8"?>
-<ds:datastoreItem xmlns:ds="http://schemas.openxmlformats.org/officeDocument/2006/customXml" ds:itemID="{7597BCB1-5F9D-46E4-B418-B874D9A18AD7}">
-  <ds:schemaRefs>
-    <ds:schemaRef ds:uri="http://schemas.microsoft.com/office/2006/metadata/properties"/>
-    <ds:schemaRef ds:uri="http://schemas.microsoft.com/office/infopath/2007/PartnerControls"/>
-    <ds:schemaRef ds:uri="01a094b0-08a8-443b-bd9d-7d2701d1cf8a"/>
-  </ds:schemaRefs>
-</ds:datastoreItem>
-</file>
-
-<file path=customXml/itemProps4.xml><?xml version="1.0" encoding="utf-8"?>
-<ds:datastoreItem xmlns:ds="http://schemas.openxmlformats.org/officeDocument/2006/customXml" ds:itemID="{67C8E2F5-E66A-4D6E-A0D7-4D1B26B079DC}">
-  <ds:schemaRefs>
-    <ds:schemaRef ds:uri="http://schemas.openxmlformats.org/officeDocument/2006/bibliography"/>
-  </ds:schemaRefs>
-</ds:datastoreItem>
 </file>
</xml_diff>

<commit_message>
diagram czynności part 1
</commit_message>
<xml_diff>
--- a/Sprawozdanie projektowe IO.docx
+++ b/Sprawozdanie projektowe IO.docx
@@ -421,6 +421,9 @@
       <w:r>
         <w:t xml:space="preserve">, </w:t>
       </w:r>
+      <w:r>
+        <w:t>diagram klas</w:t>
+      </w:r>
     </w:p>
     <w:p>
       <w:pPr>
@@ -460,6 +463,15 @@
       </w:r>
       <w:r>
         <w:t>przyjęcie zlecenia naprawy</w:t>
+      </w:r>
+      <w:r>
+        <w:t>, Diagram</w:t>
+      </w:r>
+      <w:r>
+        <w:t xml:space="preserve"> czynności dla</w:t>
+      </w:r>
+      <w:r>
+        <w:t xml:space="preserve"> przypadku „Zamówienie części zamiennych”</w:t>
       </w:r>
     </w:p>
     <w:p>
@@ -3765,38 +3777,109 @@
         <w:t>Pracownik biura ostatecznie zamyka zlecenie w systemie, zwalnia miejsce w magazynie</w:t>
       </w:r>
     </w:p>
-    <w:p>
-      <w:pPr>
-        <w:pStyle w:val="Nagwek2"/>
-      </w:pPr>
-      <w:r>
-        <w:t>4.2</w:t>
-      </w:r>
-      <w:r>
-        <w:tab/>
-      </w:r>
-      <w:r>
-        <w:t>Diagramy czynności</w:t>
-      </w:r>
-    </w:p>
     <w:p/>
     <w:p/>
-    <w:p>
-      <w:pPr>
-        <w:pStyle w:val="Nagwek2"/>
-      </w:pPr>
-      <w:r>
-        <w:t>4.3</w:t>
-      </w:r>
-      <w:r>
-        <w:tab/>
-      </w:r>
-      <w:r>
-        <w:t>Diagramy interakcji (przebiegu)</w:t>
-      </w:r>
-    </w:p>
     <w:p/>
     <w:p/>
+    <w:p/>
+    <w:p/>
+    <w:p/>
+    <w:p/>
+    <w:p/>
+    <w:p/>
+    <w:p/>
+    <w:p/>
+    <w:p>
+      <w:pPr>
+        <w:pStyle w:val="Nagwek2"/>
+      </w:pPr>
+      <w:r>
+        <w:lastRenderedPageBreak/>
+        <w:t>4.2</w:t>
+      </w:r>
+      <w:r>
+        <w:tab/>
+      </w:r>
+      <w:r>
+        <w:t>Diagramy czynności</w:t>
+      </w:r>
+    </w:p>
+    <w:p>
+      <w:r>
+        <w:t xml:space="preserve">Diagram czynności dla przypadku </w:t>
+      </w:r>
+      <w:r>
+        <w:t xml:space="preserve">użycia </w:t>
+      </w:r>
+      <w:r>
+        <w:t>„Zamówienie części zamiennych”</w:t>
+      </w:r>
+      <w:r>
+        <w:t>:</w:t>
+      </w:r>
+    </w:p>
+    <w:p>
+      <w:r>
+        <w:drawing>
+          <wp:inline distT="0" distB="0" distL="0" distR="0" wp14:anchorId="165319B7" wp14:editId="2BE25B11">
+            <wp:extent cx="6645910" cy="7910195"/>
+            <wp:effectExtent l="0" t="0" r="2540" b="0"/>
+            <wp:docPr id="253579172" name="Grafika 1"/>
+            <wp:cNvGraphicFramePr>
+              <a:graphicFrameLocks xmlns:a="http://schemas.openxmlformats.org/drawingml/2006/main" noChangeAspect="1"/>
+            </wp:cNvGraphicFramePr>
+            <a:graphic xmlns:a="http://schemas.openxmlformats.org/drawingml/2006/main">
+              <a:graphicData uri="http://schemas.openxmlformats.org/drawingml/2006/picture">
+                <pic:pic xmlns:pic="http://schemas.openxmlformats.org/drawingml/2006/picture">
+                  <pic:nvPicPr>
+                    <pic:cNvPr id="253579172" name=""/>
+                    <pic:cNvPicPr/>
+                  </pic:nvPicPr>
+                  <pic:blipFill>
+                    <a:blip r:embed="rId13">
+                      <a:extLst>
+                        <a:ext uri="{96DAC541-7B7A-43D3-8B79-37D633B846F1}">
+                          <asvg:svgBlip xmlns:asvg="http://schemas.microsoft.com/office/drawing/2016/SVG/main" r:embed="rId14"/>
+                        </a:ext>
+                      </a:extLst>
+                    </a:blip>
+                    <a:stretch>
+                      <a:fillRect/>
+                    </a:stretch>
+                  </pic:blipFill>
+                  <pic:spPr>
+                    <a:xfrm>
+                      <a:off x="0" y="0"/>
+                      <a:ext cx="6645910" cy="7910195"/>
+                    </a:xfrm>
+                    <a:prstGeom prst="rect">
+                      <a:avLst/>
+                    </a:prstGeom>
+                  </pic:spPr>
+                </pic:pic>
+              </a:graphicData>
+            </a:graphic>
+          </wp:inline>
+        </w:drawing>
+      </w:r>
+    </w:p>
+    <w:p/>
+    <w:p>
+      <w:pPr>
+        <w:pStyle w:val="Nagwek2"/>
+      </w:pPr>
+      <w:r>
+        <w:t>4.3</w:t>
+      </w:r>
+      <w:r>
+        <w:tab/>
+      </w:r>
+      <w:r>
+        <w:t>Diagramy interakcji (przebiegu)</w:t>
+      </w:r>
+    </w:p>
+    <w:p/>
+    <w:p/>
     <w:p>
       <w:pPr>
         <w:pStyle w:val="Nagwek1"/>
@@ -3837,7 +3920,6 @@
         <w:pStyle w:val="Nagwek2"/>
       </w:pPr>
       <w:r>
-        <w:lastRenderedPageBreak/>
         <w:t>5.</w:t>
       </w:r>
       <w:r>
@@ -3852,6 +3934,9 @@
     </w:p>
     <w:p>
       <w:r>
+        <w:rPr>
+          <w:noProof/>
+        </w:rPr>
         <w:drawing>
           <wp:inline distT="0" distB="0" distL="0" distR="0" wp14:anchorId="723EE074" wp14:editId="1CF3C0E7">
             <wp:extent cx="6645910" cy="2691130"/>
@@ -3868,10 +3953,10 @@
                     <pic:cNvPicPr/>
                   </pic:nvPicPr>
                   <pic:blipFill>
-                    <a:blip r:embed="rId13">
+                    <a:blip r:embed="rId15">
                       <a:extLst>
                         <a:ext uri="{96DAC541-7B7A-43D3-8B79-37D633B846F1}">
-                          <asvg:svgBlip xmlns:asvg="http://schemas.microsoft.com/office/drawing/2016/SVG/main" r:embed="rId14"/>
+                          <asvg:svgBlip xmlns:asvg="http://schemas.microsoft.com/office/drawing/2016/SVG/main" r:embed="rId16"/>
                         </a:ext>
                       </a:extLst>
                     </a:blip>
@@ -7299,27 +7384,6 @@
 </file>
 
 <file path=customXml/item1.xml><?xml version="1.0" encoding="utf-8"?>
-<b:Sources xmlns:b="http://schemas.openxmlformats.org/officeDocument/2006/bibliography" xmlns="http://schemas.openxmlformats.org/officeDocument/2006/bibliography" SelectedStyle="\APASixthEditionOfficeOnline.xsl" StyleName="APA" Version="6"/>
-</file>
-
-<file path=customXml/item2.xml><?xml version="1.0" encoding="utf-8"?>
-<p:properties xmlns:p="http://schemas.microsoft.com/office/2006/metadata/properties" xmlns:xsi="http://www.w3.org/2001/XMLSchema-instance" xmlns:pc="http://schemas.microsoft.com/office/infopath/2007/PartnerControls">
-  <documentManagement>
-    <_activity xmlns="01a094b0-08a8-443b-bd9d-7d2701d1cf8a" xsi:nil="true"/>
-  </documentManagement>
-</p:properties>
-</file>
-
-<file path=customXml/item3.xml><?xml version="1.0" encoding="utf-8"?>
-<?mso-contentType ?>
-<FormTemplates xmlns="http://schemas.microsoft.com/sharepoint/v3/contenttype/forms">
-  <Display>DocumentLibraryForm</Display>
-  <Edit>DocumentLibraryForm</Edit>
-  <New>DocumentLibraryForm</New>
-</FormTemplates>
-</file>
-
-<file path=customXml/item4.xml><?xml version="1.0" encoding="utf-8"?>
 <ct:contentTypeSchema xmlns:ct="http://schemas.microsoft.com/office/2006/metadata/contentType" xmlns:ma="http://schemas.microsoft.com/office/2006/metadata/properties/metaAttributes" ct:_="" ma:_="" ma:contentTypeName="Dokument" ma:contentTypeID="0x010100CCB42EE1A2101A46A529E33B73FA5B9E" ma:contentTypeVersion="6" ma:contentTypeDescription="Utwórz nowy dokument." ma:contentTypeScope="" ma:versionID="7f99c836655c8e118ac5ff6deceec588">
   <xsd:schema xmlns:xsd="http://www.w3.org/2001/XMLSchema" xmlns:xs="http://www.w3.org/2001/XMLSchema" xmlns:p="http://schemas.microsoft.com/office/2006/metadata/properties" xmlns:ns3="01a094b0-08a8-443b-bd9d-7d2701d1cf8a" targetNamespace="http://schemas.microsoft.com/office/2006/metadata/properties" ma:root="true" ma:fieldsID="402682bf42a3ef1dd60032c46426ad7b" ns3:_="">
     <xsd:import namespace="01a094b0-08a8-443b-bd9d-7d2701d1cf8a"/>
@@ -7475,33 +7539,28 @@
 </ct:contentTypeSchema>
 </file>
 
-<file path=customXml/itemProps1.xml><?xml version="1.0" encoding="utf-8"?>
-<ds:datastoreItem xmlns:ds="http://schemas.openxmlformats.org/officeDocument/2006/customXml" ds:itemID="{67C8E2F5-E66A-4D6E-A0D7-4D1B26B079DC}">
-  <ds:schemaRefs>
-    <ds:schemaRef ds:uri="http://schemas.openxmlformats.org/officeDocument/2006/bibliography"/>
-  </ds:schemaRefs>
-</ds:datastoreItem>
+<file path=customXml/item2.xml><?xml version="1.0" encoding="utf-8"?>
+<?mso-contentType ?>
+<FormTemplates xmlns="http://schemas.microsoft.com/sharepoint/v3/contenttype/forms">
+  <Display>DocumentLibraryForm</Display>
+  <Edit>DocumentLibraryForm</Edit>
+  <New>DocumentLibraryForm</New>
+</FormTemplates>
 </file>
 
-<file path=customXml/itemProps2.xml><?xml version="1.0" encoding="utf-8"?>
-<ds:datastoreItem xmlns:ds="http://schemas.openxmlformats.org/officeDocument/2006/customXml" ds:itemID="{7597BCB1-5F9D-46E4-B418-B874D9A18AD7}">
-  <ds:schemaRefs>
-    <ds:schemaRef ds:uri="http://schemas.microsoft.com/office/2006/metadata/properties"/>
-    <ds:schemaRef ds:uri="http://schemas.microsoft.com/office/infopath/2007/PartnerControls"/>
-    <ds:schemaRef ds:uri="01a094b0-08a8-443b-bd9d-7d2701d1cf8a"/>
-  </ds:schemaRefs>
-</ds:datastoreItem>
+<file path=customXml/item3.xml><?xml version="1.0" encoding="utf-8"?>
+<p:properties xmlns:p="http://schemas.microsoft.com/office/2006/metadata/properties" xmlns:xsi="http://www.w3.org/2001/XMLSchema-instance" xmlns:pc="http://schemas.microsoft.com/office/infopath/2007/PartnerControls">
+  <documentManagement>
+    <_activity xmlns="01a094b0-08a8-443b-bd9d-7d2701d1cf8a" xsi:nil="true"/>
+  </documentManagement>
+</p:properties>
 </file>
 
-<file path=customXml/itemProps3.xml><?xml version="1.0" encoding="utf-8"?>
-<ds:datastoreItem xmlns:ds="http://schemas.openxmlformats.org/officeDocument/2006/customXml" ds:itemID="{0F49DEAA-62A3-474D-9D43-5B4EB3847878}">
-  <ds:schemaRefs>
-    <ds:schemaRef ds:uri="http://schemas.microsoft.com/sharepoint/v3/contenttype/forms"/>
-  </ds:schemaRefs>
-</ds:datastoreItem>
+<file path=customXml/item4.xml><?xml version="1.0" encoding="utf-8"?>
+<b:Sources xmlns:b="http://schemas.openxmlformats.org/officeDocument/2006/bibliography" xmlns="http://schemas.openxmlformats.org/officeDocument/2006/bibliography" SelectedStyle="\APASixthEditionOfficeOnline.xsl" StyleName="APA" Version="6"/>
 </file>
 
-<file path=customXml/itemProps4.xml><?xml version="1.0" encoding="utf-8"?>
+<file path=customXml/itemProps1.xml><?xml version="1.0" encoding="utf-8"?>
 <ds:datastoreItem xmlns:ds="http://schemas.openxmlformats.org/officeDocument/2006/customXml" ds:itemID="{9FAA2568-8506-478A-A3AF-FB593C23B164}">
   <ds:schemaRefs>
     <ds:schemaRef ds:uri="http://schemas.microsoft.com/office/2006/metadata/contentType"/>
@@ -7517,4 +7576,30 @@
     <ds:schemaRef ds:uri="http://schemas.microsoft.com/internal/obd"/>
   </ds:schemaRefs>
 </ds:datastoreItem>
+</file>
+
+<file path=customXml/itemProps2.xml><?xml version="1.0" encoding="utf-8"?>
+<ds:datastoreItem xmlns:ds="http://schemas.openxmlformats.org/officeDocument/2006/customXml" ds:itemID="{0F49DEAA-62A3-474D-9D43-5B4EB3847878}">
+  <ds:schemaRefs>
+    <ds:schemaRef ds:uri="http://schemas.microsoft.com/sharepoint/v3/contenttype/forms"/>
+  </ds:schemaRefs>
+</ds:datastoreItem>
+</file>
+
+<file path=customXml/itemProps3.xml><?xml version="1.0" encoding="utf-8"?>
+<ds:datastoreItem xmlns:ds="http://schemas.openxmlformats.org/officeDocument/2006/customXml" ds:itemID="{7597BCB1-5F9D-46E4-B418-B874D9A18AD7}">
+  <ds:schemaRefs>
+    <ds:schemaRef ds:uri="http://schemas.microsoft.com/office/2006/metadata/properties"/>
+    <ds:schemaRef ds:uri="http://schemas.microsoft.com/office/infopath/2007/PartnerControls"/>
+    <ds:schemaRef ds:uri="01a094b0-08a8-443b-bd9d-7d2701d1cf8a"/>
+  </ds:schemaRefs>
+</ds:datastoreItem>
+</file>
+
+<file path=customXml/itemProps4.xml><?xml version="1.0" encoding="utf-8"?>
+<ds:datastoreItem xmlns:ds="http://schemas.openxmlformats.org/officeDocument/2006/customXml" ds:itemID="{67C8E2F5-E66A-4D6E-A0D7-4D1B26B079DC}">
+  <ds:schemaRefs>
+    <ds:schemaRef ds:uri="http://schemas.openxmlformats.org/officeDocument/2006/bibliography"/>
+  </ds:schemaRefs>
+</ds:datastoreItem>
 </file>
</xml_diff>

<commit_message>
diagram czynności part 2
</commit_message>
<xml_diff>
--- a/Sprawozdanie projektowe IO.docx
+++ b/Sprawozdanie projektowe IO.docx
@@ -1,6 +1,6 @@
 
 <file path=word/document.xml><?xml version="1.0" encoding="utf-8"?>
-<w:document xmlns:wpc="http://schemas.microsoft.com/office/word/2010/wordprocessingCanvas" xmlns:cx="http://schemas.microsoft.com/office/drawing/2014/chartex" xmlns:cx1="http://schemas.microsoft.com/office/drawing/2015/9/8/chartex" xmlns:cx2="http://schemas.microsoft.com/office/drawing/2015/10/21/chartex" xmlns:cx3="http://schemas.microsoft.com/office/drawing/2016/5/9/chartex" xmlns:cx4="http://schemas.microsoft.com/office/drawing/2016/5/10/chartex" xmlns:cx5="http://schemas.microsoft.com/office/drawing/2016/5/11/chartex" xmlns:cx6="http://schemas.microsoft.com/office/drawing/2016/5/12/chartex" xmlns:cx7="http://schemas.microsoft.com/office/drawing/2016/5/13/chartex" xmlns:cx8="http://schemas.microsoft.com/office/drawing/2016/5/14/chartex" xmlns:mc="http://schemas.openxmlformats.org/markup-compatibility/2006" xmlns:aink="http://schemas.microsoft.com/office/drawing/2016/ink" xmlns:am3d="http://schemas.microsoft.com/office/drawing/2017/model3d" xmlns:o="urn:schemas-microsoft-com:office:office" xmlns:oel="http://schemas.microsoft.com/office/2019/extlst" xmlns:r="http://schemas.openxmlformats.org/officeDocument/2006/relationships" xmlns:m="http://schemas.openxmlformats.org/officeDocument/2006/math" xmlns:v="urn:schemas-microsoft-com:vml" xmlns:wp14="http://schemas.microsoft.com/office/word/2010/wordprocessingDrawing" xmlns:wp="http://schemas.openxmlformats.org/drawingml/2006/wordprocessingDrawing" xmlns:w10="urn:schemas-microsoft-com:office:word" xmlns:w="http://schemas.openxmlformats.org/wordprocessingml/2006/main" xmlns:w14="http://schemas.microsoft.com/office/word/2010/wordml" xmlns:w15="http://schemas.microsoft.com/office/word/2012/wordml" xmlns:w16cex="http://schemas.microsoft.com/office/word/2018/wordml/cex" xmlns:w16cid="http://schemas.microsoft.com/office/word/2016/wordml/cid" xmlns:w16="http://schemas.microsoft.com/office/word/2018/wordml" xmlns:w16du="http://schemas.microsoft.com/office/word/2023/wordml/word16du" xmlns:w16sdtdh="http://schemas.microsoft.com/office/word/2020/wordml/sdtdatahash" xmlns:w16sdtfl="http://schemas.microsoft.com/office/word/2024/wordml/sdtformatlock" xmlns:w16se="http://schemas.microsoft.com/office/word/2015/wordml/symex" xmlns:wpg="http://schemas.microsoft.com/office/word/2010/wordprocessingGroup" xmlns:wpi="http://schemas.microsoft.com/office/word/2010/wordprocessingInk" xmlns:wne="http://schemas.microsoft.com/office/word/2006/wordml" xmlns:wps="http://schemas.microsoft.com/office/word/2010/wordprocessingShape" mc:Ignorable="w14 w15 w16se w16cid w16 w16cex w16sdtdh w16sdtfl w16du wp14">
+<w:document xmlns:wpc="http://schemas.microsoft.com/office/word/2010/wordprocessingCanvas" xmlns:cx="http://schemas.microsoft.com/office/drawing/2014/chartex" xmlns:cx1="http://schemas.microsoft.com/office/drawing/2015/9/8/chartex" xmlns:cx2="http://schemas.microsoft.com/office/drawing/2015/10/21/chartex" xmlns:cx3="http://schemas.microsoft.com/office/drawing/2016/5/9/chartex" xmlns:cx4="http://schemas.microsoft.com/office/drawing/2016/5/10/chartex" xmlns:cx5="http://schemas.microsoft.com/office/drawing/2016/5/11/chartex" xmlns:cx6="http://schemas.microsoft.com/office/drawing/2016/5/12/chartex" xmlns:cx7="http://schemas.microsoft.com/office/drawing/2016/5/13/chartex" xmlns:cx8="http://schemas.microsoft.com/office/drawing/2016/5/14/chartex" xmlns:mc="http://schemas.openxmlformats.org/markup-compatibility/2006" xmlns:aink="http://schemas.microsoft.com/office/drawing/2016/ink" xmlns:am3d="http://schemas.microsoft.com/office/drawing/2017/model3d" xmlns:o="urn:schemas-microsoft-com:office:office" xmlns:oel="http://schemas.microsoft.com/office/2019/extlst" xmlns:r="http://schemas.openxmlformats.org/officeDocument/2006/relationships" xmlns:m="http://schemas.openxmlformats.org/officeDocument/2006/math" xmlns:v="urn:schemas-microsoft-com:vml" xmlns:wp14="http://schemas.microsoft.com/office/word/2010/wordprocessingDrawing" xmlns:wp="http://schemas.openxmlformats.org/drawingml/2006/wordprocessingDrawing" xmlns:w10="urn:schemas-microsoft-com:office:word" xmlns:w="http://schemas.openxmlformats.org/wordprocessingml/2006/main" xmlns:w14="http://schemas.microsoft.com/office/word/2010/wordml" xmlns:w15="http://schemas.microsoft.com/office/word/2012/wordml" xmlns:w16cex="http://schemas.microsoft.com/office/word/2018/wordml/cex" xmlns:w16cid="http://schemas.microsoft.com/office/word/2016/wordml/cid" xmlns:w16="http://schemas.microsoft.com/office/word/2018/wordml" xmlns:w16du="http://schemas.microsoft.com/office/word/2023/wordml/word16du" xmlns:w16sdtdh="http://schemas.microsoft.com/office/word/2020/wordml/sdtdatahash" xmlns:w16sdtfl="http://schemas.microsoft.com/office/word/2024/wordml/sdtformatlock" xmlns:w16se="http://schemas.microsoft.com/office/word/2015/wordml/symex" xmlns:wpg="http://schemas.microsoft.com/office/word/2010/wordprocessingGroup" xmlns:wpi="http://schemas.microsoft.com/office/word/2010/wordprocessingInk" xmlns:wne="http://schemas.microsoft.com/office/word/2006/wordml" xmlns:wps="http://schemas.microsoft.com/office/word/2010/wordprocessingShape" xmlns:a="http://schemas.openxmlformats.org/drawingml/2006/main" xmlns:pic="http://schemas.openxmlformats.org/drawingml/2006/picture" xmlns:asvg="http://schemas.microsoft.com/office/drawing/2016/SVG/main" xmlns:a14="http://schemas.microsoft.com/office/drawing/2010/main" mc:Ignorable="w14 w15 w16se w16cid w16 w16cex w16sdtdh w16sdtfl w16du wp14">
   <w:body>
     <w:tbl>
       <w:tblPr>
@@ -8,10 +8,10 @@
         <w:tblW w:w="0" w:type="auto"/>
         <w:jc w:val="center"/>
         <w:tblBorders>
-          <w:top w:val="single" w:sz="6" w:space="0" w:color="auto"/>
-          <w:left w:val="single" w:sz="6" w:space="0" w:color="auto"/>
-          <w:bottom w:val="single" w:sz="6" w:space="0" w:color="auto"/>
-          <w:right w:val="single" w:sz="6" w:space="0" w:color="auto"/>
+          <w:top w:val="single" w:color="auto" w:sz="6" w:space="0"/>
+          <w:left w:val="single" w:color="auto" w:sz="6" w:space="0"/>
+          <w:bottom w:val="single" w:color="auto" w:sz="6" w:space="0"/>
+          <w:right w:val="single" w:color="auto" w:sz="6" w:space="0"/>
         </w:tblBorders>
         <w:tblLayout w:type="fixed"/>
         <w:tblLook w:val="04A0" w:firstRow="1" w:lastRow="0" w:firstColumn="1" w:lastColumn="0" w:noHBand="0" w:noVBand="1"/>
@@ -29,8 +29,8 @@
           <w:tcPr>
             <w:tcW w:w="5655" w:type="dxa"/>
             <w:tcBorders>
-              <w:top w:val="single" w:sz="6" w:space="0" w:color="auto"/>
-              <w:left w:val="single" w:sz="6" w:space="0" w:color="auto"/>
+              <w:top w:val="single" w:color="auto" w:sz="6" w:space="0"/>
+              <w:left w:val="single" w:color="auto" w:sz="6" w:space="0"/>
             </w:tcBorders>
             <w:tcMar>
               <w:left w:w="90" w:type="dxa"/>
@@ -41,12 +41,12 @@
             <w:pPr>
               <w:jc w:val="both"/>
               <w:rPr>
-                <w:rFonts w:ascii="Aptos" w:eastAsia="Aptos" w:hAnsi="Aptos" w:cs="Aptos"/>
+                <w:rFonts w:ascii="Aptos" w:hAnsi="Aptos" w:eastAsia="Aptos" w:cs="Aptos"/>
               </w:rPr>
             </w:pPr>
             <w:r>
               <w:rPr>
-                <w:rFonts w:ascii="Aptos" w:eastAsia="Aptos" w:hAnsi="Aptos" w:cs="Aptos"/>
+                <w:rFonts w:ascii="Aptos" w:hAnsi="Aptos" w:eastAsia="Aptos" w:cs="Aptos"/>
               </w:rPr>
               <w:t>Uczelnia: Politechnika Białostocka</w:t>
             </w:r>
@@ -55,12 +55,12 @@
             <w:pPr>
               <w:jc w:val="both"/>
               <w:rPr>
-                <w:rFonts w:ascii="Aptos" w:eastAsia="Aptos" w:hAnsi="Aptos" w:cs="Aptos"/>
+                <w:rFonts w:ascii="Aptos" w:hAnsi="Aptos" w:eastAsia="Aptos" w:cs="Aptos"/>
               </w:rPr>
             </w:pPr>
             <w:r>
               <w:rPr>
-                <w:rFonts w:ascii="Aptos" w:eastAsia="Aptos" w:hAnsi="Aptos" w:cs="Aptos"/>
+                <w:rFonts w:ascii="Aptos" w:hAnsi="Aptos" w:eastAsia="Aptos" w:cs="Aptos"/>
               </w:rPr>
               <w:t>Wydział Informatyki</w:t>
             </w:r>
@@ -69,12 +69,12 @@
             <w:pPr>
               <w:jc w:val="both"/>
               <w:rPr>
-                <w:rFonts w:ascii="Aptos" w:eastAsia="Aptos" w:hAnsi="Aptos" w:cs="Aptos"/>
+                <w:rFonts w:ascii="Aptos" w:hAnsi="Aptos" w:eastAsia="Aptos" w:cs="Aptos"/>
               </w:rPr>
             </w:pPr>
             <w:r>
               <w:rPr>
-                <w:rFonts w:ascii="Aptos" w:eastAsia="Aptos" w:hAnsi="Aptos" w:cs="Aptos"/>
+                <w:rFonts w:ascii="Aptos" w:hAnsi="Aptos" w:eastAsia="Aptos" w:cs="Aptos"/>
               </w:rPr>
               <w:t>Kierunek: Informatyka</w:t>
             </w:r>
@@ -84,8 +84,8 @@
           <w:tcPr>
             <w:tcW w:w="4095" w:type="dxa"/>
             <w:tcBorders>
-              <w:top w:val="single" w:sz="6" w:space="0" w:color="auto"/>
-              <w:right w:val="single" w:sz="6" w:space="0" w:color="auto"/>
+              <w:top w:val="single" w:color="auto" w:sz="6" w:space="0"/>
+              <w:right w:val="single" w:color="auto" w:sz="6" w:space="0"/>
             </w:tcBorders>
             <w:tcMar>
               <w:left w:w="90" w:type="dxa"/>
@@ -96,24 +96,24 @@
             <w:pPr>
               <w:jc w:val="both"/>
               <w:rPr>
-                <w:rFonts w:ascii="Aptos" w:eastAsia="Aptos" w:hAnsi="Aptos" w:cs="Aptos"/>
+                <w:rFonts w:ascii="Aptos" w:hAnsi="Aptos" w:eastAsia="Aptos" w:cs="Aptos"/>
               </w:rPr>
             </w:pPr>
             <w:r>
               <w:rPr>
-                <w:rFonts w:ascii="Aptos" w:eastAsia="Aptos" w:hAnsi="Aptos" w:cs="Aptos"/>
+                <w:rFonts w:ascii="Aptos" w:hAnsi="Aptos" w:eastAsia="Aptos" w:cs="Aptos"/>
               </w:rPr>
               <w:t>Data przekazania sprawozdania: 0</w:t>
             </w:r>
             <w:r>
               <w:rPr>
-                <w:rFonts w:ascii="Aptos" w:eastAsia="Aptos" w:hAnsi="Aptos" w:cs="Aptos"/>
+                <w:rFonts w:ascii="Aptos" w:hAnsi="Aptos" w:eastAsia="Aptos" w:cs="Aptos"/>
               </w:rPr>
               <w:t>7</w:t>
             </w:r>
             <w:r>
               <w:rPr>
-                <w:rFonts w:ascii="Aptos" w:eastAsia="Aptos" w:hAnsi="Aptos" w:cs="Aptos"/>
+                <w:rFonts w:ascii="Aptos" w:hAnsi="Aptos" w:eastAsia="Aptos" w:cs="Aptos"/>
               </w:rPr>
               <w:t>.05.2026</w:t>
             </w:r>
@@ -129,8 +129,8 @@
           <w:tcPr>
             <w:tcW w:w="5655" w:type="dxa"/>
             <w:tcBorders>
-              <w:top w:val="single" w:sz="6" w:space="0" w:color="auto"/>
-              <w:left w:val="single" w:sz="6" w:space="0" w:color="auto"/>
+              <w:top w:val="single" w:color="auto" w:sz="6" w:space="0"/>
+              <w:left w:val="single" w:color="auto" w:sz="6" w:space="0"/>
             </w:tcBorders>
             <w:tcMar>
               <w:left w:w="90" w:type="dxa"/>
@@ -141,12 +141,12 @@
             <w:pPr>
               <w:jc w:val="both"/>
               <w:rPr>
-                <w:rFonts w:ascii="Aptos" w:eastAsia="Aptos" w:hAnsi="Aptos" w:cs="Aptos"/>
+                <w:rFonts w:ascii="Aptos" w:hAnsi="Aptos" w:eastAsia="Aptos" w:cs="Aptos"/>
               </w:rPr>
             </w:pPr>
             <w:r>
               <w:rPr>
-                <w:rFonts w:ascii="Aptos" w:eastAsia="Aptos" w:hAnsi="Aptos" w:cs="Aptos"/>
+                <w:rFonts w:ascii="Aptos" w:hAnsi="Aptos" w:eastAsia="Aptos" w:cs="Aptos"/>
               </w:rPr>
               <w:t>Przedmiot: Pracownia Specjalistyczna Inżynierii Oprogramowania</w:t>
             </w:r>
@@ -155,7 +155,7 @@
             <w:pPr>
               <w:jc w:val="both"/>
               <w:rPr>
-                <w:rFonts w:ascii="Aptos" w:eastAsia="Aptos" w:hAnsi="Aptos" w:cs="Aptos"/>
+                <w:rFonts w:ascii="Aptos" w:hAnsi="Aptos" w:eastAsia="Aptos" w:cs="Aptos"/>
               </w:rPr>
             </w:pPr>
           </w:p>
@@ -164,8 +164,8 @@
           <w:tcPr>
             <w:tcW w:w="4095" w:type="dxa"/>
             <w:tcBorders>
-              <w:top w:val="single" w:sz="6" w:space="0" w:color="auto"/>
-              <w:right w:val="single" w:sz="6" w:space="0" w:color="auto"/>
+              <w:top w:val="single" w:color="auto" w:sz="6" w:space="0"/>
+              <w:right w:val="single" w:color="auto" w:sz="6" w:space="0"/>
             </w:tcBorders>
             <w:tcMar>
               <w:left w:w="90" w:type="dxa"/>
@@ -176,12 +176,12 @@
             <w:pPr>
               <w:jc w:val="both"/>
               <w:rPr>
-                <w:rFonts w:ascii="Aptos" w:eastAsia="Aptos" w:hAnsi="Aptos" w:cs="Aptos"/>
+                <w:rFonts w:ascii="Aptos" w:hAnsi="Aptos" w:eastAsia="Aptos" w:cs="Aptos"/>
               </w:rPr>
             </w:pPr>
             <w:r>
               <w:rPr>
-                <w:rFonts w:ascii="Aptos" w:eastAsia="Aptos" w:hAnsi="Aptos" w:cs="Aptos"/>
+                <w:rFonts w:ascii="Aptos" w:hAnsi="Aptos" w:eastAsia="Aptos" w:cs="Aptos"/>
               </w:rPr>
               <w:t>4. semestr, 2. rok studiów</w:t>
             </w:r>
@@ -190,12 +190,12 @@
             <w:pPr>
               <w:jc w:val="both"/>
               <w:rPr>
-                <w:rFonts w:ascii="Aptos" w:eastAsia="Aptos" w:hAnsi="Aptos" w:cs="Aptos"/>
+                <w:rFonts w:ascii="Aptos" w:hAnsi="Aptos" w:eastAsia="Aptos" w:cs="Aptos"/>
               </w:rPr>
             </w:pPr>
             <w:r>
               <w:rPr>
-                <w:rFonts w:ascii="Aptos" w:eastAsia="Aptos" w:hAnsi="Aptos" w:cs="Aptos"/>
+                <w:rFonts w:ascii="Aptos" w:hAnsi="Aptos" w:eastAsia="Aptos" w:cs="Aptos"/>
               </w:rPr>
               <w:t>(semestr letni roku 2025/2026)</w:t>
             </w:r>
@@ -211,8 +211,8 @@
           <w:tcPr>
             <w:tcW w:w="5655" w:type="dxa"/>
             <w:tcBorders>
-              <w:left w:val="single" w:sz="6" w:space="0" w:color="auto"/>
-              <w:bottom w:val="single" w:sz="6" w:space="0" w:color="auto"/>
+              <w:left w:val="single" w:color="auto" w:sz="6" w:space="0"/>
+              <w:bottom w:val="single" w:color="auto" w:sz="6" w:space="0"/>
             </w:tcBorders>
             <w:tcMar>
               <w:left w:w="90" w:type="dxa"/>
@@ -223,18 +223,18 @@
             <w:pPr>
               <w:jc w:val="both"/>
               <w:rPr>
-                <w:rFonts w:ascii="Aptos" w:eastAsia="Aptos" w:hAnsi="Aptos" w:cs="Aptos"/>
+                <w:rFonts w:ascii="Aptos" w:hAnsi="Aptos" w:eastAsia="Aptos" w:cs="Aptos"/>
               </w:rPr>
             </w:pPr>
             <w:r>
               <w:rPr>
-                <w:rFonts w:ascii="Aptos" w:eastAsia="Aptos" w:hAnsi="Aptos" w:cs="Aptos"/>
+                <w:rFonts w:ascii="Aptos" w:hAnsi="Aptos" w:eastAsia="Aptos" w:cs="Aptos"/>
               </w:rPr>
               <w:t>Skład projektu</w:t>
             </w:r>
             <w:r>
               <w:rPr>
-                <w:rFonts w:ascii="Aptos" w:eastAsia="Aptos" w:hAnsi="Aptos" w:cs="Aptos"/>
+                <w:rFonts w:ascii="Aptos" w:hAnsi="Aptos" w:eastAsia="Aptos" w:cs="Aptos"/>
               </w:rPr>
               <w:t>:</w:t>
             </w:r>
@@ -248,18 +248,18 @@
               </w:numPr>
               <w:jc w:val="both"/>
               <w:rPr>
-                <w:rFonts w:ascii="Aptos" w:eastAsia="Aptos" w:hAnsi="Aptos" w:cs="Aptos"/>
+                <w:rFonts w:ascii="Aptos" w:hAnsi="Aptos" w:eastAsia="Aptos" w:cs="Aptos"/>
               </w:rPr>
             </w:pPr>
             <w:r>
               <w:rPr>
-                <w:rFonts w:ascii="Aptos" w:eastAsia="Aptos" w:hAnsi="Aptos" w:cs="Aptos"/>
+                <w:rFonts w:ascii="Aptos" w:hAnsi="Aptos" w:eastAsia="Aptos" w:cs="Aptos"/>
               </w:rPr>
               <w:t>Piotr Borys</w:t>
             </w:r>
             <w:r>
               <w:rPr>
-                <w:rFonts w:ascii="Aptos" w:eastAsia="Aptos" w:hAnsi="Aptos" w:cs="Aptos"/>
+                <w:rFonts w:ascii="Aptos" w:hAnsi="Aptos" w:eastAsia="Aptos" w:cs="Aptos"/>
               </w:rPr>
               <w:t xml:space="preserve"> </w:t>
             </w:r>
@@ -273,12 +273,12 @@
               </w:numPr>
               <w:jc w:val="both"/>
               <w:rPr>
-                <w:rFonts w:ascii="Aptos" w:eastAsia="Aptos" w:hAnsi="Aptos" w:cs="Aptos"/>
+                <w:rFonts w:ascii="Aptos" w:hAnsi="Aptos" w:eastAsia="Aptos" w:cs="Aptos"/>
               </w:rPr>
             </w:pPr>
             <w:r>
               <w:rPr>
-                <w:rFonts w:ascii="Aptos" w:eastAsia="Aptos" w:hAnsi="Aptos" w:cs="Aptos"/>
+                <w:rFonts w:ascii="Aptos" w:hAnsi="Aptos" w:eastAsia="Aptos" w:cs="Aptos"/>
               </w:rPr>
               <w:t>Karolina Dec</w:t>
             </w:r>
@@ -292,19 +292,19 @@
               </w:numPr>
               <w:jc w:val="both"/>
               <w:rPr>
-                <w:rFonts w:ascii="Aptos" w:eastAsia="Aptos" w:hAnsi="Aptos" w:cs="Aptos"/>
+                <w:rFonts w:ascii="Aptos" w:hAnsi="Aptos" w:eastAsia="Aptos" w:cs="Aptos"/>
               </w:rPr>
             </w:pPr>
             <w:r>
               <w:rPr>
-                <w:rFonts w:ascii="Aptos" w:eastAsia="Aptos" w:hAnsi="Aptos" w:cs="Aptos"/>
+                <w:rFonts w:ascii="Aptos" w:hAnsi="Aptos" w:eastAsia="Aptos" w:cs="Aptos"/>
               </w:rPr>
               <w:t xml:space="preserve">Ernest </w:t>
             </w:r>
             <w:proofErr w:type="spellStart"/>
             <w:r>
               <w:rPr>
-                <w:rFonts w:ascii="Aptos" w:eastAsia="Aptos" w:hAnsi="Aptos" w:cs="Aptos"/>
+                <w:rFonts w:ascii="Aptos" w:hAnsi="Aptos" w:eastAsia="Aptos" w:cs="Aptos"/>
               </w:rPr>
               <w:t>Miciura</w:t>
             </w:r>
@@ -315,8 +315,8 @@
           <w:tcPr>
             <w:tcW w:w="4095" w:type="dxa"/>
             <w:tcBorders>
-              <w:bottom w:val="single" w:sz="6" w:space="0" w:color="auto"/>
-              <w:right w:val="single" w:sz="6" w:space="0" w:color="auto"/>
+              <w:bottom w:val="single" w:color="auto" w:sz="6" w:space="0"/>
+              <w:right w:val="single" w:color="auto" w:sz="6" w:space="0"/>
             </w:tcBorders>
             <w:tcMar>
               <w:left w:w="90" w:type="dxa"/>
@@ -327,12 +327,12 @@
             <w:pPr>
               <w:jc w:val="both"/>
               <w:rPr>
-                <w:rFonts w:ascii="Aptos" w:eastAsia="Aptos" w:hAnsi="Aptos" w:cs="Aptos"/>
+                <w:rFonts w:ascii="Aptos" w:hAnsi="Aptos" w:eastAsia="Aptos" w:cs="Aptos"/>
               </w:rPr>
             </w:pPr>
             <w:r>
               <w:rPr>
-                <w:rFonts w:ascii="Aptos" w:eastAsia="Aptos" w:hAnsi="Aptos" w:cs="Aptos"/>
+                <w:rFonts w:ascii="Aptos" w:hAnsi="Aptos" w:eastAsia="Aptos" w:cs="Aptos"/>
               </w:rPr>
               <w:t xml:space="preserve">Prowadzący: </w:t>
             </w:r>
@@ -343,19 +343,19 @@
             </w:pPr>
             <w:r>
               <w:rPr>
-                <w:rFonts w:ascii="Aptos" w:eastAsia="Aptos" w:hAnsi="Aptos" w:cs="Aptos"/>
+                <w:rFonts w:ascii="Aptos" w:hAnsi="Aptos" w:eastAsia="Aptos" w:cs="Aptos"/>
               </w:rPr>
               <w:t xml:space="preserve">dr </w:t>
             </w:r>
             <w:r>
               <w:rPr>
-                <w:rFonts w:ascii="Aptos" w:eastAsia="Aptos" w:hAnsi="Aptos" w:cs="Aptos"/>
+                <w:rFonts w:ascii="Aptos" w:hAnsi="Aptos" w:eastAsia="Aptos" w:cs="Aptos"/>
               </w:rPr>
               <w:t>inż.</w:t>
             </w:r>
             <w:r>
               <w:rPr>
-                <w:rFonts w:ascii="Aptos" w:eastAsia="Aptos" w:hAnsi="Aptos" w:cs="Aptos"/>
+                <w:rFonts w:ascii="Aptos" w:hAnsi="Aptos" w:eastAsia="Aptos" w:cs="Aptos"/>
               </w:rPr>
               <w:t xml:space="preserve"> Marcin Czajkowski</w:t>
             </w:r>
@@ -364,7 +364,7 @@
             <w:pPr>
               <w:jc w:val="both"/>
               <w:rPr>
-                <w:rFonts w:ascii="Aptos" w:eastAsia="Aptos" w:hAnsi="Aptos" w:cs="Aptos"/>
+                <w:rFonts w:ascii="Aptos" w:hAnsi="Aptos" w:eastAsia="Aptos" w:cs="Aptos"/>
               </w:rPr>
             </w:pPr>
           </w:p>
@@ -372,7 +372,7 @@
             <w:pPr>
               <w:jc w:val="both"/>
               <w:rPr>
-                <w:rFonts w:ascii="Aptos" w:eastAsia="Aptos" w:hAnsi="Aptos" w:cs="Aptos"/>
+                <w:rFonts w:ascii="Aptos" w:hAnsi="Aptos" w:eastAsia="Aptos" w:cs="Aptos"/>
               </w:rPr>
             </w:pPr>
           </w:p>
@@ -489,29 +489,11 @@
     </w:p>
     <w:p>
       <w:pPr>
-        <w:ind w:firstLine="360"/>
-        <w:jc w:val="both"/>
-      </w:pPr>
-      <w:r>
-        <w:t xml:space="preserve">Opis aktora: Klient, </w:t>
-      </w:r>
-      <w:r>
-        <w:t>Opis przypadku użycia:</w:t>
-      </w:r>
-      <w:r>
-        <w:t xml:space="preserve"> </w:t>
-      </w:r>
-      <w:r>
-        <w:t xml:space="preserve">kontakt </w:t>
-      </w:r>
-      <w:r>
-        <w:t>z klientem</w:t>
-      </w:r>
-      <w:r>
-        <w:t xml:space="preserve"> w sprawie</w:t>
-      </w:r>
-      <w:r>
-        <w:t xml:space="preserve"> zlecenia naprawy</w:t>
+        <w:ind/>
+      </w:pPr>
+      <w:r>
+        <w:rPr/>
+        <w:t>Opis aktora: Klient, Opis przypadku użycia: kontakt z klientem w sprawie zlecenia naprawy, Diagram czynności dla przypadku ,,Anulowanie zlecenia”</w:t>
       </w:r>
     </w:p>
     <w:p>
@@ -686,7 +668,6 @@
           <w:sz w:val="36"/>
           <w:szCs w:val="36"/>
         </w:rPr>
-        <w:lastRenderedPageBreak/>
         <w:t>Dodatkowe informacje na temat systemu</w:t>
       </w:r>
     </w:p>
@@ -1444,7 +1425,7 @@
         </m:f>
         <m:r>
           <w:rPr>
-            <w:rFonts w:ascii="Cambria Math" w:eastAsiaTheme="minorEastAsia" w:hAnsi="Cambria Math"/>
+            <w:rFonts w:ascii="Cambria Math" w:hAnsi="Cambria Math" w:eastAsiaTheme="minorEastAsia"/>
           </w:rPr>
           <m:t xml:space="preserve"> × 100%</m:t>
         </m:r>
@@ -1528,7 +1509,6 @@
         <w:jc w:val="both"/>
       </w:pPr>
       <w:r>
-        <w:lastRenderedPageBreak/>
         <w:t>p</w:t>
       </w:r>
       <w:r>
@@ -1781,7 +1761,6 @@
         <w:rPr>
           <w:u w:val="single"/>
         </w:rPr>
-        <w:lastRenderedPageBreak/>
         <w:t>Opisy tekstowe wszystkich aktorów</w:t>
       </w:r>
       <w:r>
@@ -2498,7 +2477,6 @@
         </w:numPr>
       </w:pPr>
       <w:r>
-        <w:lastRenderedPageBreak/>
         <w:t>Pracownik Biura p</w:t>
       </w:r>
       <w:r>
@@ -3078,7 +3056,6 @@
         </w:numPr>
       </w:pPr>
       <w:r>
-        <w:lastRenderedPageBreak/>
         <w:t>Alternatywne ciągi zdarzeń</w:t>
       </w:r>
     </w:p>
@@ -3487,7 +3464,6 @@
         </w:numPr>
       </w:pPr>
       <w:r>
-        <w:lastRenderedPageBreak/>
         <w:t>Pracownik biura wydaje sprzęt klientowi</w:t>
       </w:r>
     </w:p>
@@ -3777,24 +3753,11 @@
         <w:t>Pracownik biura ostatecznie zamyka zlecenie w systemie, zwalnia miejsce w magazynie</w:t>
       </w:r>
     </w:p>
-    <w:p/>
-    <w:p/>
-    <w:p/>
-    <w:p/>
-    <w:p/>
-    <w:p/>
-    <w:p/>
-    <w:p/>
-    <w:p/>
-    <w:p/>
-    <w:p/>
-    <w:p/>
     <w:p>
       <w:pPr>
         <w:pStyle w:val="Nagwek2"/>
       </w:pPr>
       <w:r>
-        <w:lastRenderedPageBreak/>
         <w:t>4.2</w:t>
       </w:r>
       <w:r>
@@ -3821,22 +3784,22 @@
     <w:p>
       <w:r>
         <w:drawing>
-          <wp:inline distT="0" distB="0" distL="0" distR="0" wp14:anchorId="165319B7" wp14:editId="2BE25B11">
+          <wp:inline wp14:editId="41C60800" wp14:anchorId="165319B7">
             <wp:extent cx="6645910" cy="7910195"/>
             <wp:effectExtent l="0" t="0" r="2540" b="0"/>
             <wp:docPr id="253579172" name="Grafika 1"/>
             <wp:cNvGraphicFramePr>
-              <a:graphicFrameLocks xmlns:a="http://schemas.openxmlformats.org/drawingml/2006/main" noChangeAspect="1"/>
+              <a:graphicFrameLocks noChangeAspect="1"/>
             </wp:cNvGraphicFramePr>
-            <a:graphic xmlns:a="http://schemas.openxmlformats.org/drawingml/2006/main">
-              <a:graphicData uri="http://schemas.openxmlformats.org/drawingml/2006/picture">
+            <a:graphic>
+              <a:graphicData xmlns:a="http://schemas.openxmlformats.org/drawingml/2006/main" uri="http://schemas.openxmlformats.org/drawingml/2006/picture">
                 <pic:pic xmlns:pic="http://schemas.openxmlformats.org/drawingml/2006/picture">
                   <pic:nvPicPr>
                     <pic:cNvPr id="253579172" name=""/>
                     <pic:cNvPicPr/>
                   </pic:nvPicPr>
                   <pic:blipFill>
-                    <a:blip r:embed="rId13">
+                    <a:blip xmlns:r="http://schemas.openxmlformats.org/officeDocument/2006/relationships" r:embed="rId13">
                       <a:extLst>
                         <a:ext uri="{96DAC541-7B7A-43D3-8B79-37D633B846F1}">
                           <asvg:svgBlip xmlns:asvg="http://schemas.microsoft.com/office/drawing/2016/SVG/main" r:embed="rId14"/>
@@ -3851,6 +3814,70 @@
                     <a:xfrm>
                       <a:off x="0" y="0"/>
                       <a:ext cx="6645910" cy="7910195"/>
+                    </a:xfrm>
+                    <a:prstGeom prst="rect">
+                      <a:avLst/>
+                    </a:prstGeom>
+                  </pic:spPr>
+                </pic:pic>
+              </a:graphicData>
+            </a:graphic>
+          </wp:inline>
+        </w:drawing>
+      </w:r>
+    </w:p>
+    <w:p/>
+    <w:p/>
+    <w:p/>
+    <w:p/>
+    <w:p/>
+    <w:p>
+      <w:pPr>
+        <w:pStyle w:val="Normalny"/>
+      </w:pPr>
+    </w:p>
+    <w:p>
+      <w:pPr>
+        <w:pStyle w:val="Normalny"/>
+      </w:pPr>
+      <w:r>
+        <w:rPr/>
+        <w:t>Diagram czynności dla przypadku użycia ,,Anulowanie zlecenia”</w:t>
+      </w:r>
+    </w:p>
+    <w:p>
+      <w:r>
+        <w:drawing>
+          <wp:inline wp14:editId="13683685" wp14:anchorId="2349A093">
+            <wp:extent cx="6638925" cy="5172075"/>
+            <wp:effectExtent l="0" t="0" r="0" b="0"/>
+            <wp:docPr id="499313697" name="drawing"/>
+            <wp:cNvGraphicFramePr>
+              <a:graphicFrameLocks noChangeAspect="1"/>
+            </wp:cNvGraphicFramePr>
+            <a:graphic>
+              <a:graphicData xmlns:a="http://schemas.openxmlformats.org/drawingml/2006/main" uri="http://schemas.openxmlformats.org/drawingml/2006/picture">
+                <pic:pic xmlns:pic="http://schemas.openxmlformats.org/drawingml/2006/picture">
+                  <pic:nvPicPr>
+                    <pic:cNvPr id="499313697" name="Picture 499313697"/>
+                    <pic:cNvPicPr/>
+                  </pic:nvPicPr>
+                  <pic:blipFill>
+                    <a:blip xmlns:r="http://schemas.openxmlformats.org/officeDocument/2006/relationships" r:embed="rId780151343">
+                      <a:extLst>
+                        <a:ext uri="{28A0092B-C50C-407E-A947-70E740481C1C}">
+                          <a14:useLocalDpi xmlns:a14="http://schemas.microsoft.com/office/drawing/2010/main"/>
+                        </a:ext>
+                      </a:extLst>
+                    </a:blip>
+                    <a:stretch>
+                      <a:fillRect/>
+                    </a:stretch>
+                  </pic:blipFill>
+                  <pic:spPr>
+                    <a:xfrm>
+                      <a:off x="0" y="0"/>
+                      <a:ext cx="6638925" cy="5172075"/>
                     </a:xfrm>
                     <a:prstGeom prst="rect">
                       <a:avLst/>
@@ -4027,6 +4054,8 @@
       </w:r>
       <w:r>
         <w:tab/>
+      </w:r>
+      <w:r>
         <w:t>Propozycje interfejsu użytkownika</w:t>
       </w:r>
     </w:p>
@@ -4047,7 +4076,7 @@
       </w:r>
     </w:p>
     <w:sectPr>
-      <w:pgSz w:w="11906" w:h="16838"/>
+      <w:pgSz w:w="11906" w:h="16838" w:orient="portrait"/>
       <w:pgMar w:top="720" w:right="720" w:bottom="720" w:left="720" w:header="708" w:footer="708" w:gutter="0"/>
       <w:cols w:space="708"/>
       <w:docGrid w:linePitch="360"/>
@@ -4121,7 +4150,7 @@
         <w:ind w:left="1800" w:hanging="360"/>
       </w:pPr>
       <w:rPr>
-        <w:rFonts w:ascii="Courier New" w:hAnsi="Courier New" w:hint="default"/>
+        <w:rFonts w:hint="default" w:ascii="Courier New" w:hAnsi="Courier New"/>
       </w:rPr>
     </w:lvl>
     <w:lvl w:ilvl="1" w:tplc="4BB61BAC">
@@ -4133,7 +4162,7 @@
         <w:ind w:left="2520" w:hanging="360"/>
       </w:pPr>
       <w:rPr>
-        <w:rFonts w:ascii="Courier New" w:hAnsi="Courier New" w:hint="default"/>
+        <w:rFonts w:hint="default" w:ascii="Courier New" w:hAnsi="Courier New"/>
       </w:rPr>
     </w:lvl>
     <w:lvl w:ilvl="2" w:tplc="201A044E">
@@ -4145,7 +4174,7 @@
         <w:ind w:left="3240" w:hanging="360"/>
       </w:pPr>
       <w:rPr>
-        <w:rFonts w:ascii="Wingdings" w:hAnsi="Wingdings" w:hint="default"/>
+        <w:rFonts w:hint="default" w:ascii="Wingdings" w:hAnsi="Wingdings"/>
       </w:rPr>
     </w:lvl>
     <w:lvl w:ilvl="3" w:tplc="8CF8A81C">
@@ -4157,7 +4186,7 @@
         <w:ind w:left="3960" w:hanging="360"/>
       </w:pPr>
       <w:rPr>
-        <w:rFonts w:ascii="Symbol" w:hAnsi="Symbol" w:hint="default"/>
+        <w:rFonts w:hint="default" w:ascii="Symbol" w:hAnsi="Symbol"/>
       </w:rPr>
     </w:lvl>
     <w:lvl w:ilvl="4" w:tplc="A5C87BDE">
@@ -4169,7 +4198,7 @@
         <w:ind w:left="4680" w:hanging="360"/>
       </w:pPr>
       <w:rPr>
-        <w:rFonts w:ascii="Courier New" w:hAnsi="Courier New" w:hint="default"/>
+        <w:rFonts w:hint="default" w:ascii="Courier New" w:hAnsi="Courier New"/>
       </w:rPr>
     </w:lvl>
     <w:lvl w:ilvl="5" w:tplc="68F4B1BE">
@@ -4181,7 +4210,7 @@
         <w:ind w:left="5400" w:hanging="360"/>
       </w:pPr>
       <w:rPr>
-        <w:rFonts w:ascii="Wingdings" w:hAnsi="Wingdings" w:hint="default"/>
+        <w:rFonts w:hint="default" w:ascii="Wingdings" w:hAnsi="Wingdings"/>
       </w:rPr>
     </w:lvl>
     <w:lvl w:ilvl="6" w:tplc="410AA764">
@@ -4193,7 +4222,7 @@
         <w:ind w:left="6120" w:hanging="360"/>
       </w:pPr>
       <w:rPr>
-        <w:rFonts w:ascii="Symbol" w:hAnsi="Symbol" w:hint="default"/>
+        <w:rFonts w:hint="default" w:ascii="Symbol" w:hAnsi="Symbol"/>
       </w:rPr>
     </w:lvl>
     <w:lvl w:ilvl="7" w:tplc="1D0235D2">
@@ -4205,7 +4234,7 @@
         <w:ind w:left="6840" w:hanging="360"/>
       </w:pPr>
       <w:rPr>
-        <w:rFonts w:ascii="Courier New" w:hAnsi="Courier New" w:hint="default"/>
+        <w:rFonts w:hint="default" w:ascii="Courier New" w:hAnsi="Courier New"/>
       </w:rPr>
     </w:lvl>
     <w:lvl w:ilvl="8" w:tplc="0D90B9D2">
@@ -4217,7 +4246,7 @@
         <w:ind w:left="7560" w:hanging="360"/>
       </w:pPr>
       <w:rPr>
-        <w:rFonts w:ascii="Wingdings" w:hAnsi="Wingdings" w:hint="default"/>
+        <w:rFonts w:hint="default" w:ascii="Wingdings" w:hAnsi="Wingdings"/>
       </w:rPr>
     </w:lvl>
   </w:abstractNum>
@@ -4409,7 +4438,7 @@
         <w:ind w:left="1800" w:hanging="360"/>
       </w:pPr>
       <w:rPr>
-        <w:rFonts w:ascii="Courier New" w:hAnsi="Courier New" w:hint="default"/>
+        <w:rFonts w:hint="default" w:ascii="Courier New" w:hAnsi="Courier New"/>
       </w:rPr>
     </w:lvl>
     <w:lvl w:ilvl="1" w:tplc="1F8ECD10">
@@ -4421,7 +4450,7 @@
         <w:ind w:left="2520" w:hanging="360"/>
       </w:pPr>
       <w:rPr>
-        <w:rFonts w:ascii="Courier New" w:hAnsi="Courier New" w:hint="default"/>
+        <w:rFonts w:hint="default" w:ascii="Courier New" w:hAnsi="Courier New"/>
       </w:rPr>
     </w:lvl>
     <w:lvl w:ilvl="2" w:tplc="8CFADA44">
@@ -4433,7 +4462,7 @@
         <w:ind w:left="3240" w:hanging="360"/>
       </w:pPr>
       <w:rPr>
-        <w:rFonts w:ascii="Wingdings" w:hAnsi="Wingdings" w:hint="default"/>
+        <w:rFonts w:hint="default" w:ascii="Wingdings" w:hAnsi="Wingdings"/>
       </w:rPr>
     </w:lvl>
     <w:lvl w:ilvl="3" w:tplc="E0ACE746">
@@ -4445,7 +4474,7 @@
         <w:ind w:left="3960" w:hanging="360"/>
       </w:pPr>
       <w:rPr>
-        <w:rFonts w:ascii="Symbol" w:hAnsi="Symbol" w:hint="default"/>
+        <w:rFonts w:hint="default" w:ascii="Symbol" w:hAnsi="Symbol"/>
       </w:rPr>
     </w:lvl>
     <w:lvl w:ilvl="4" w:tplc="F006B886">
@@ -4457,7 +4486,7 @@
         <w:ind w:left="4680" w:hanging="360"/>
       </w:pPr>
       <w:rPr>
-        <w:rFonts w:ascii="Courier New" w:hAnsi="Courier New" w:hint="default"/>
+        <w:rFonts w:hint="default" w:ascii="Courier New" w:hAnsi="Courier New"/>
       </w:rPr>
     </w:lvl>
     <w:lvl w:ilvl="5" w:tplc="881E76A2">
@@ -4469,7 +4498,7 @@
         <w:ind w:left="5400" w:hanging="360"/>
       </w:pPr>
       <w:rPr>
-        <w:rFonts w:ascii="Wingdings" w:hAnsi="Wingdings" w:hint="default"/>
+        <w:rFonts w:hint="default" w:ascii="Wingdings" w:hAnsi="Wingdings"/>
       </w:rPr>
     </w:lvl>
     <w:lvl w:ilvl="6" w:tplc="9184DE26">
@@ -4481,7 +4510,7 @@
         <w:ind w:left="6120" w:hanging="360"/>
       </w:pPr>
       <w:rPr>
-        <w:rFonts w:ascii="Symbol" w:hAnsi="Symbol" w:hint="default"/>
+        <w:rFonts w:hint="default" w:ascii="Symbol" w:hAnsi="Symbol"/>
       </w:rPr>
     </w:lvl>
     <w:lvl w:ilvl="7" w:tplc="1CC2AF42">
@@ -4493,7 +4522,7 @@
         <w:ind w:left="6840" w:hanging="360"/>
       </w:pPr>
       <w:rPr>
-        <w:rFonts w:ascii="Courier New" w:hAnsi="Courier New" w:hint="default"/>
+        <w:rFonts w:hint="default" w:ascii="Courier New" w:hAnsi="Courier New"/>
       </w:rPr>
     </w:lvl>
     <w:lvl w:ilvl="8" w:tplc="F7643966">
@@ -4505,7 +4534,7 @@
         <w:ind w:left="7560" w:hanging="360"/>
       </w:pPr>
       <w:rPr>
-        <w:rFonts w:ascii="Wingdings" w:hAnsi="Wingdings" w:hint="default"/>
+        <w:rFonts w:hint="default" w:ascii="Wingdings" w:hAnsi="Wingdings"/>
       </w:rPr>
     </w:lvl>
   </w:abstractNum>
@@ -4522,7 +4551,7 @@
         <w:ind w:left="720" w:hanging="360"/>
       </w:pPr>
       <w:rPr>
-        <w:rFonts w:ascii="Symbol" w:eastAsiaTheme="minorHAnsi" w:hAnsi="Symbol" w:cstheme="minorBidi" w:hint="default"/>
+        <w:rFonts w:hint="default" w:ascii="Symbol" w:hAnsi="Symbol" w:eastAsiaTheme="minorHAnsi" w:cstheme="minorBidi"/>
       </w:rPr>
     </w:lvl>
     <w:lvl w:ilvl="1" w:tplc="04150003">
@@ -4534,7 +4563,7 @@
         <w:ind w:left="1440" w:hanging="360"/>
       </w:pPr>
       <w:rPr>
-        <w:rFonts w:ascii="Courier New" w:hAnsi="Courier New" w:cs="Courier New" w:hint="default"/>
+        <w:rFonts w:hint="default" w:ascii="Courier New" w:hAnsi="Courier New" w:cs="Courier New"/>
       </w:rPr>
     </w:lvl>
     <w:lvl w:ilvl="2" w:tplc="04150005">
@@ -4546,7 +4575,7 @@
         <w:ind w:left="2160" w:hanging="360"/>
       </w:pPr>
       <w:rPr>
-        <w:rFonts w:ascii="Wingdings" w:hAnsi="Wingdings" w:hint="default"/>
+        <w:rFonts w:hint="default" w:ascii="Wingdings" w:hAnsi="Wingdings"/>
       </w:rPr>
     </w:lvl>
     <w:lvl w:ilvl="3" w:tplc="04150001" w:tentative="1">
@@ -4558,7 +4587,7 @@
         <w:ind w:left="2880" w:hanging="360"/>
       </w:pPr>
       <w:rPr>
-        <w:rFonts w:ascii="Symbol" w:hAnsi="Symbol" w:hint="default"/>
+        <w:rFonts w:hint="default" w:ascii="Symbol" w:hAnsi="Symbol"/>
       </w:rPr>
     </w:lvl>
     <w:lvl w:ilvl="4" w:tplc="04150003" w:tentative="1">
@@ -4570,7 +4599,7 @@
         <w:ind w:left="3600" w:hanging="360"/>
       </w:pPr>
       <w:rPr>
-        <w:rFonts w:ascii="Courier New" w:hAnsi="Courier New" w:cs="Courier New" w:hint="default"/>
+        <w:rFonts w:hint="default" w:ascii="Courier New" w:hAnsi="Courier New" w:cs="Courier New"/>
       </w:rPr>
     </w:lvl>
     <w:lvl w:ilvl="5" w:tplc="04150005" w:tentative="1">
@@ -4582,7 +4611,7 @@
         <w:ind w:left="4320" w:hanging="360"/>
       </w:pPr>
       <w:rPr>
-        <w:rFonts w:ascii="Wingdings" w:hAnsi="Wingdings" w:hint="default"/>
+        <w:rFonts w:hint="default" w:ascii="Wingdings" w:hAnsi="Wingdings"/>
       </w:rPr>
     </w:lvl>
     <w:lvl w:ilvl="6" w:tplc="04150001" w:tentative="1">
@@ -4594,7 +4623,7 @@
         <w:ind w:left="5040" w:hanging="360"/>
       </w:pPr>
       <w:rPr>
-        <w:rFonts w:ascii="Symbol" w:hAnsi="Symbol" w:hint="default"/>
+        <w:rFonts w:hint="default" w:ascii="Symbol" w:hAnsi="Symbol"/>
       </w:rPr>
     </w:lvl>
     <w:lvl w:ilvl="7" w:tplc="04150003" w:tentative="1">
@@ -4606,7 +4635,7 @@
         <w:ind w:left="5760" w:hanging="360"/>
       </w:pPr>
       <w:rPr>
-        <w:rFonts w:ascii="Courier New" w:hAnsi="Courier New" w:cs="Courier New" w:hint="default"/>
+        <w:rFonts w:hint="default" w:ascii="Courier New" w:hAnsi="Courier New" w:cs="Courier New"/>
       </w:rPr>
     </w:lvl>
     <w:lvl w:ilvl="8" w:tplc="04150005" w:tentative="1">
@@ -4618,7 +4647,7 @@
         <w:ind w:left="6480" w:hanging="360"/>
       </w:pPr>
       <w:rPr>
-        <w:rFonts w:ascii="Wingdings" w:hAnsi="Wingdings" w:hint="default"/>
+        <w:rFonts w:hint="default" w:ascii="Wingdings" w:hAnsi="Wingdings"/>
       </w:rPr>
     </w:lvl>
   </w:abstractNum>
@@ -4635,7 +4664,7 @@
         <w:ind w:left="1068" w:hanging="360"/>
       </w:pPr>
       <w:rPr>
-        <w:rFonts w:ascii="Courier New" w:hAnsi="Courier New" w:cs="Courier New" w:hint="default"/>
+        <w:rFonts w:hint="default" w:ascii="Courier New" w:hAnsi="Courier New" w:cs="Courier New"/>
       </w:rPr>
     </w:lvl>
     <w:lvl w:ilvl="1" w:tplc="04150003" w:tentative="1">
@@ -4647,7 +4676,7 @@
         <w:ind w:left="1788" w:hanging="360"/>
       </w:pPr>
       <w:rPr>
-        <w:rFonts w:ascii="Courier New" w:hAnsi="Courier New" w:cs="Courier New" w:hint="default"/>
+        <w:rFonts w:hint="default" w:ascii="Courier New" w:hAnsi="Courier New" w:cs="Courier New"/>
       </w:rPr>
     </w:lvl>
     <w:lvl w:ilvl="2" w:tplc="04150005" w:tentative="1">
@@ -4659,7 +4688,7 @@
         <w:ind w:left="2508" w:hanging="360"/>
       </w:pPr>
       <w:rPr>
-        <w:rFonts w:ascii="Wingdings" w:hAnsi="Wingdings" w:hint="default"/>
+        <w:rFonts w:hint="default" w:ascii="Wingdings" w:hAnsi="Wingdings"/>
       </w:rPr>
     </w:lvl>
     <w:lvl w:ilvl="3" w:tplc="04150001" w:tentative="1">
@@ -4671,7 +4700,7 @@
         <w:ind w:left="3228" w:hanging="360"/>
       </w:pPr>
       <w:rPr>
-        <w:rFonts w:ascii="Symbol" w:hAnsi="Symbol" w:hint="default"/>
+        <w:rFonts w:hint="default" w:ascii="Symbol" w:hAnsi="Symbol"/>
       </w:rPr>
     </w:lvl>
     <w:lvl w:ilvl="4" w:tplc="04150003" w:tentative="1">
@@ -4683,7 +4712,7 @@
         <w:ind w:left="3948" w:hanging="360"/>
       </w:pPr>
       <w:rPr>
-        <w:rFonts w:ascii="Courier New" w:hAnsi="Courier New" w:cs="Courier New" w:hint="default"/>
+        <w:rFonts w:hint="default" w:ascii="Courier New" w:hAnsi="Courier New" w:cs="Courier New"/>
       </w:rPr>
     </w:lvl>
     <w:lvl w:ilvl="5" w:tplc="04150005" w:tentative="1">
@@ -4695,7 +4724,7 @@
         <w:ind w:left="4668" w:hanging="360"/>
       </w:pPr>
       <w:rPr>
-        <w:rFonts w:ascii="Wingdings" w:hAnsi="Wingdings" w:hint="default"/>
+        <w:rFonts w:hint="default" w:ascii="Wingdings" w:hAnsi="Wingdings"/>
       </w:rPr>
     </w:lvl>
     <w:lvl w:ilvl="6" w:tplc="04150001" w:tentative="1">
@@ -4707,7 +4736,7 @@
         <w:ind w:left="5388" w:hanging="360"/>
       </w:pPr>
       <w:rPr>
-        <w:rFonts w:ascii="Symbol" w:hAnsi="Symbol" w:hint="default"/>
+        <w:rFonts w:hint="default" w:ascii="Symbol" w:hAnsi="Symbol"/>
       </w:rPr>
     </w:lvl>
     <w:lvl w:ilvl="7" w:tplc="04150003" w:tentative="1">
@@ -4719,7 +4748,7 @@
         <w:ind w:left="6108" w:hanging="360"/>
       </w:pPr>
       <w:rPr>
-        <w:rFonts w:ascii="Courier New" w:hAnsi="Courier New" w:cs="Courier New" w:hint="default"/>
+        <w:rFonts w:hint="default" w:ascii="Courier New" w:hAnsi="Courier New" w:cs="Courier New"/>
       </w:rPr>
     </w:lvl>
     <w:lvl w:ilvl="8" w:tplc="04150005" w:tentative="1">
@@ -4731,7 +4760,7 @@
         <w:ind w:left="6828" w:hanging="360"/>
       </w:pPr>
       <w:rPr>
-        <w:rFonts w:ascii="Wingdings" w:hAnsi="Wingdings" w:hint="default"/>
+        <w:rFonts w:hint="default" w:ascii="Wingdings" w:hAnsi="Wingdings"/>
       </w:rPr>
     </w:lvl>
   </w:abstractNum>
@@ -4748,7 +4777,7 @@
         <w:ind w:left="1632" w:hanging="360"/>
       </w:pPr>
       <w:rPr>
-        <w:rFonts w:ascii="Symbol" w:hAnsi="Symbol" w:hint="default"/>
+        <w:rFonts w:hint="default" w:ascii="Symbol" w:hAnsi="Symbol"/>
       </w:rPr>
     </w:lvl>
     <w:lvl w:ilvl="1" w:tplc="04150003" w:tentative="1">
@@ -4760,7 +4789,7 @@
         <w:ind w:left="2352" w:hanging="360"/>
       </w:pPr>
       <w:rPr>
-        <w:rFonts w:ascii="Courier New" w:hAnsi="Courier New" w:cs="Courier New" w:hint="default"/>
+        <w:rFonts w:hint="default" w:ascii="Courier New" w:hAnsi="Courier New" w:cs="Courier New"/>
       </w:rPr>
     </w:lvl>
     <w:lvl w:ilvl="2" w:tplc="04150005" w:tentative="1">
@@ -4772,7 +4801,7 @@
         <w:ind w:left="3072" w:hanging="360"/>
       </w:pPr>
       <w:rPr>
-        <w:rFonts w:ascii="Wingdings" w:hAnsi="Wingdings" w:hint="default"/>
+        <w:rFonts w:hint="default" w:ascii="Wingdings" w:hAnsi="Wingdings"/>
       </w:rPr>
     </w:lvl>
     <w:lvl w:ilvl="3" w:tplc="04150001" w:tentative="1">
@@ -4784,7 +4813,7 @@
         <w:ind w:left="3792" w:hanging="360"/>
       </w:pPr>
       <w:rPr>
-        <w:rFonts w:ascii="Symbol" w:hAnsi="Symbol" w:hint="default"/>
+        <w:rFonts w:hint="default" w:ascii="Symbol" w:hAnsi="Symbol"/>
       </w:rPr>
     </w:lvl>
     <w:lvl w:ilvl="4" w:tplc="04150003" w:tentative="1">
@@ -4796,7 +4825,7 @@
         <w:ind w:left="4512" w:hanging="360"/>
       </w:pPr>
       <w:rPr>
-        <w:rFonts w:ascii="Courier New" w:hAnsi="Courier New" w:cs="Courier New" w:hint="default"/>
+        <w:rFonts w:hint="default" w:ascii="Courier New" w:hAnsi="Courier New" w:cs="Courier New"/>
       </w:rPr>
     </w:lvl>
     <w:lvl w:ilvl="5" w:tplc="04150005" w:tentative="1">
@@ -4808,7 +4837,7 @@
         <w:ind w:left="5232" w:hanging="360"/>
       </w:pPr>
       <w:rPr>
-        <w:rFonts w:ascii="Wingdings" w:hAnsi="Wingdings" w:hint="default"/>
+        <w:rFonts w:hint="default" w:ascii="Wingdings" w:hAnsi="Wingdings"/>
       </w:rPr>
     </w:lvl>
     <w:lvl w:ilvl="6" w:tplc="04150001" w:tentative="1">
@@ -4820,7 +4849,7 @@
         <w:ind w:left="5952" w:hanging="360"/>
       </w:pPr>
       <w:rPr>
-        <w:rFonts w:ascii="Symbol" w:hAnsi="Symbol" w:hint="default"/>
+        <w:rFonts w:hint="default" w:ascii="Symbol" w:hAnsi="Symbol"/>
       </w:rPr>
     </w:lvl>
     <w:lvl w:ilvl="7" w:tplc="04150003" w:tentative="1">
@@ -4832,7 +4861,7 @@
         <w:ind w:left="6672" w:hanging="360"/>
       </w:pPr>
       <w:rPr>
-        <w:rFonts w:ascii="Courier New" w:hAnsi="Courier New" w:cs="Courier New" w:hint="default"/>
+        <w:rFonts w:hint="default" w:ascii="Courier New" w:hAnsi="Courier New" w:cs="Courier New"/>
       </w:rPr>
     </w:lvl>
     <w:lvl w:ilvl="8" w:tplc="04150005" w:tentative="1">
@@ -4844,7 +4873,7 @@
         <w:ind w:left="7392" w:hanging="360"/>
       </w:pPr>
       <w:rPr>
-        <w:rFonts w:ascii="Wingdings" w:hAnsi="Wingdings" w:hint="default"/>
+        <w:rFonts w:hint="default" w:ascii="Wingdings" w:hAnsi="Wingdings"/>
       </w:rPr>
     </w:lvl>
   </w:abstractNum>
@@ -4861,7 +4890,7 @@
         <w:ind w:left="1440" w:hanging="360"/>
       </w:pPr>
       <w:rPr>
-        <w:rFonts w:ascii="Courier New" w:hAnsi="Courier New" w:hint="default"/>
+        <w:rFonts w:hint="default" w:ascii="Courier New" w:hAnsi="Courier New"/>
       </w:rPr>
     </w:lvl>
     <w:lvl w:ilvl="1" w:tplc="9010535C">
@@ -4873,7 +4902,7 @@
         <w:ind w:left="2160" w:hanging="360"/>
       </w:pPr>
       <w:rPr>
-        <w:rFonts w:ascii="Courier New" w:hAnsi="Courier New" w:hint="default"/>
+        <w:rFonts w:hint="default" w:ascii="Courier New" w:hAnsi="Courier New"/>
       </w:rPr>
     </w:lvl>
     <w:lvl w:ilvl="2" w:tplc="6C58F962">
@@ -4885,7 +4914,7 @@
         <w:ind w:left="2880" w:hanging="360"/>
       </w:pPr>
       <w:rPr>
-        <w:rFonts w:ascii="Wingdings" w:hAnsi="Wingdings" w:hint="default"/>
+        <w:rFonts w:hint="default" w:ascii="Wingdings" w:hAnsi="Wingdings"/>
       </w:rPr>
     </w:lvl>
     <w:lvl w:ilvl="3" w:tplc="AB86A8C4">
@@ -4897,7 +4926,7 @@
         <w:ind w:left="3600" w:hanging="360"/>
       </w:pPr>
       <w:rPr>
-        <w:rFonts w:ascii="Symbol" w:hAnsi="Symbol" w:hint="default"/>
+        <w:rFonts w:hint="default" w:ascii="Symbol" w:hAnsi="Symbol"/>
       </w:rPr>
     </w:lvl>
     <w:lvl w:ilvl="4" w:tplc="F57AD808">
@@ -4909,7 +4938,7 @@
         <w:ind w:left="4320" w:hanging="360"/>
       </w:pPr>
       <w:rPr>
-        <w:rFonts w:ascii="Courier New" w:hAnsi="Courier New" w:hint="default"/>
+        <w:rFonts w:hint="default" w:ascii="Courier New" w:hAnsi="Courier New"/>
       </w:rPr>
     </w:lvl>
     <w:lvl w:ilvl="5" w:tplc="3A1A5D1C">
@@ -4921,7 +4950,7 @@
         <w:ind w:left="5040" w:hanging="360"/>
       </w:pPr>
       <w:rPr>
-        <w:rFonts w:ascii="Wingdings" w:hAnsi="Wingdings" w:hint="default"/>
+        <w:rFonts w:hint="default" w:ascii="Wingdings" w:hAnsi="Wingdings"/>
       </w:rPr>
     </w:lvl>
     <w:lvl w:ilvl="6" w:tplc="814006BC">
@@ -4933,7 +4962,7 @@
         <w:ind w:left="5760" w:hanging="360"/>
       </w:pPr>
       <w:rPr>
-        <w:rFonts w:ascii="Symbol" w:hAnsi="Symbol" w:hint="default"/>
+        <w:rFonts w:hint="default" w:ascii="Symbol" w:hAnsi="Symbol"/>
       </w:rPr>
     </w:lvl>
     <w:lvl w:ilvl="7" w:tplc="AEBE3492">
@@ -4945,7 +4974,7 @@
         <w:ind w:left="6480" w:hanging="360"/>
       </w:pPr>
       <w:rPr>
-        <w:rFonts w:ascii="Courier New" w:hAnsi="Courier New" w:hint="default"/>
+        <w:rFonts w:hint="default" w:ascii="Courier New" w:hAnsi="Courier New"/>
       </w:rPr>
     </w:lvl>
     <w:lvl w:ilvl="8" w:tplc="2FAE8552">
@@ -4957,7 +4986,7 @@
         <w:ind w:left="7200" w:hanging="360"/>
       </w:pPr>
       <w:rPr>
-        <w:rFonts w:ascii="Wingdings" w:hAnsi="Wingdings" w:hint="default"/>
+        <w:rFonts w:hint="default" w:ascii="Wingdings" w:hAnsi="Wingdings"/>
       </w:rPr>
     </w:lvl>
   </w:abstractNum>
@@ -5063,7 +5092,7 @@
         <w:ind w:left="1068" w:hanging="360"/>
       </w:pPr>
       <w:rPr>
-        <w:rFonts w:ascii="Courier New" w:hAnsi="Courier New" w:cs="Courier New" w:hint="default"/>
+        <w:rFonts w:hint="default" w:ascii="Courier New" w:hAnsi="Courier New" w:cs="Courier New"/>
       </w:rPr>
     </w:lvl>
     <w:lvl w:ilvl="1" w:tplc="04150003" w:tentative="1">
@@ -5075,7 +5104,7 @@
         <w:ind w:left="1788" w:hanging="360"/>
       </w:pPr>
       <w:rPr>
-        <w:rFonts w:ascii="Courier New" w:hAnsi="Courier New" w:cs="Courier New" w:hint="default"/>
+        <w:rFonts w:hint="default" w:ascii="Courier New" w:hAnsi="Courier New" w:cs="Courier New"/>
       </w:rPr>
     </w:lvl>
     <w:lvl w:ilvl="2" w:tplc="04150005" w:tentative="1">
@@ -5087,7 +5116,7 @@
         <w:ind w:left="2508" w:hanging="360"/>
       </w:pPr>
       <w:rPr>
-        <w:rFonts w:ascii="Wingdings" w:hAnsi="Wingdings" w:hint="default"/>
+        <w:rFonts w:hint="default" w:ascii="Wingdings" w:hAnsi="Wingdings"/>
       </w:rPr>
     </w:lvl>
     <w:lvl w:ilvl="3" w:tplc="04150001" w:tentative="1">
@@ -5099,7 +5128,7 @@
         <w:ind w:left="3228" w:hanging="360"/>
       </w:pPr>
       <w:rPr>
-        <w:rFonts w:ascii="Symbol" w:hAnsi="Symbol" w:hint="default"/>
+        <w:rFonts w:hint="default" w:ascii="Symbol" w:hAnsi="Symbol"/>
       </w:rPr>
     </w:lvl>
     <w:lvl w:ilvl="4" w:tplc="04150003" w:tentative="1">
@@ -5111,7 +5140,7 @@
         <w:ind w:left="3948" w:hanging="360"/>
       </w:pPr>
       <w:rPr>
-        <w:rFonts w:ascii="Courier New" w:hAnsi="Courier New" w:cs="Courier New" w:hint="default"/>
+        <w:rFonts w:hint="default" w:ascii="Courier New" w:hAnsi="Courier New" w:cs="Courier New"/>
       </w:rPr>
     </w:lvl>
     <w:lvl w:ilvl="5" w:tplc="04150005" w:tentative="1">
@@ -5123,7 +5152,7 @@
         <w:ind w:left="4668" w:hanging="360"/>
       </w:pPr>
       <w:rPr>
-        <w:rFonts w:ascii="Wingdings" w:hAnsi="Wingdings" w:hint="default"/>
+        <w:rFonts w:hint="default" w:ascii="Wingdings" w:hAnsi="Wingdings"/>
       </w:rPr>
     </w:lvl>
     <w:lvl w:ilvl="6" w:tplc="04150001" w:tentative="1">
@@ -5135,7 +5164,7 @@
         <w:ind w:left="5388" w:hanging="360"/>
       </w:pPr>
       <w:rPr>
-        <w:rFonts w:ascii="Symbol" w:hAnsi="Symbol" w:hint="default"/>
+        <w:rFonts w:hint="default" w:ascii="Symbol" w:hAnsi="Symbol"/>
       </w:rPr>
     </w:lvl>
     <w:lvl w:ilvl="7" w:tplc="04150003" w:tentative="1">
@@ -5147,7 +5176,7 @@
         <w:ind w:left="6108" w:hanging="360"/>
       </w:pPr>
       <w:rPr>
-        <w:rFonts w:ascii="Courier New" w:hAnsi="Courier New" w:cs="Courier New" w:hint="default"/>
+        <w:rFonts w:hint="default" w:ascii="Courier New" w:hAnsi="Courier New" w:cs="Courier New"/>
       </w:rPr>
     </w:lvl>
     <w:lvl w:ilvl="8" w:tplc="04150005" w:tentative="1">
@@ -5159,7 +5188,7 @@
         <w:ind w:left="6828" w:hanging="360"/>
       </w:pPr>
       <w:rPr>
-        <w:rFonts w:ascii="Wingdings" w:hAnsi="Wingdings" w:hint="default"/>
+        <w:rFonts w:hint="default" w:ascii="Wingdings" w:hAnsi="Wingdings"/>
       </w:rPr>
     </w:lvl>
   </w:abstractNum>
@@ -5351,7 +5380,7 @@
         <w:ind w:left="1440" w:hanging="360"/>
       </w:pPr>
       <w:rPr>
-        <w:rFonts w:ascii="Courier New" w:hAnsi="Courier New" w:hint="default"/>
+        <w:rFonts w:hint="default" w:ascii="Courier New" w:hAnsi="Courier New"/>
       </w:rPr>
     </w:lvl>
     <w:lvl w:ilvl="1" w:tplc="9B86D348">
@@ -5363,7 +5392,7 @@
         <w:ind w:left="2160" w:hanging="360"/>
       </w:pPr>
       <w:rPr>
-        <w:rFonts w:ascii="Courier New" w:hAnsi="Courier New" w:hint="default"/>
+        <w:rFonts w:hint="default" w:ascii="Courier New" w:hAnsi="Courier New"/>
       </w:rPr>
     </w:lvl>
     <w:lvl w:ilvl="2" w:tplc="29D2C16E">
@@ -5375,7 +5404,7 @@
         <w:ind w:left="2880" w:hanging="360"/>
       </w:pPr>
       <w:rPr>
-        <w:rFonts w:ascii="Wingdings" w:hAnsi="Wingdings" w:hint="default"/>
+        <w:rFonts w:hint="default" w:ascii="Wingdings" w:hAnsi="Wingdings"/>
       </w:rPr>
     </w:lvl>
     <w:lvl w:ilvl="3" w:tplc="4B380210">
@@ -5387,7 +5416,7 @@
         <w:ind w:left="3600" w:hanging="360"/>
       </w:pPr>
       <w:rPr>
-        <w:rFonts w:ascii="Symbol" w:hAnsi="Symbol" w:hint="default"/>
+        <w:rFonts w:hint="default" w:ascii="Symbol" w:hAnsi="Symbol"/>
       </w:rPr>
     </w:lvl>
     <w:lvl w:ilvl="4" w:tplc="93C80A7A">
@@ -5399,7 +5428,7 @@
         <w:ind w:left="4320" w:hanging="360"/>
       </w:pPr>
       <w:rPr>
-        <w:rFonts w:ascii="Courier New" w:hAnsi="Courier New" w:hint="default"/>
+        <w:rFonts w:hint="default" w:ascii="Courier New" w:hAnsi="Courier New"/>
       </w:rPr>
     </w:lvl>
     <w:lvl w:ilvl="5" w:tplc="302C5F52">
@@ -5411,7 +5440,7 @@
         <w:ind w:left="5040" w:hanging="360"/>
       </w:pPr>
       <w:rPr>
-        <w:rFonts w:ascii="Wingdings" w:hAnsi="Wingdings" w:hint="default"/>
+        <w:rFonts w:hint="default" w:ascii="Wingdings" w:hAnsi="Wingdings"/>
       </w:rPr>
     </w:lvl>
     <w:lvl w:ilvl="6" w:tplc="637276D0">
@@ -5423,7 +5452,7 @@
         <w:ind w:left="5760" w:hanging="360"/>
       </w:pPr>
       <w:rPr>
-        <w:rFonts w:ascii="Symbol" w:hAnsi="Symbol" w:hint="default"/>
+        <w:rFonts w:hint="default" w:ascii="Symbol" w:hAnsi="Symbol"/>
       </w:rPr>
     </w:lvl>
     <w:lvl w:ilvl="7" w:tplc="6E7ACA80">
@@ -5435,7 +5464,7 @@
         <w:ind w:left="6480" w:hanging="360"/>
       </w:pPr>
       <w:rPr>
-        <w:rFonts w:ascii="Courier New" w:hAnsi="Courier New" w:hint="default"/>
+        <w:rFonts w:hint="default" w:ascii="Courier New" w:hAnsi="Courier New"/>
       </w:rPr>
     </w:lvl>
     <w:lvl w:ilvl="8" w:tplc="14464244">
@@ -5447,7 +5476,7 @@
         <w:ind w:left="7200" w:hanging="360"/>
       </w:pPr>
       <w:rPr>
-        <w:rFonts w:ascii="Wingdings" w:hAnsi="Wingdings" w:hint="default"/>
+        <w:rFonts w:hint="default" w:ascii="Wingdings" w:hAnsi="Wingdings"/>
       </w:rPr>
     </w:lvl>
   </w:abstractNum>
@@ -5464,7 +5493,7 @@
         <w:ind w:left="1440" w:hanging="360"/>
       </w:pPr>
       <w:rPr>
-        <w:rFonts w:ascii="Courier New" w:hAnsi="Courier New" w:hint="default"/>
+        <w:rFonts w:hint="default" w:ascii="Courier New" w:hAnsi="Courier New"/>
       </w:rPr>
     </w:lvl>
     <w:lvl w:ilvl="1" w:tplc="8E802564">
@@ -5476,7 +5505,7 @@
         <w:ind w:left="2160" w:hanging="360"/>
       </w:pPr>
       <w:rPr>
-        <w:rFonts w:ascii="Courier New" w:hAnsi="Courier New" w:hint="default"/>
+        <w:rFonts w:hint="default" w:ascii="Courier New" w:hAnsi="Courier New"/>
       </w:rPr>
     </w:lvl>
     <w:lvl w:ilvl="2" w:tplc="D408B932">
@@ -5488,7 +5517,7 @@
         <w:ind w:left="2880" w:hanging="360"/>
       </w:pPr>
       <w:rPr>
-        <w:rFonts w:ascii="Wingdings" w:hAnsi="Wingdings" w:hint="default"/>
+        <w:rFonts w:hint="default" w:ascii="Wingdings" w:hAnsi="Wingdings"/>
       </w:rPr>
     </w:lvl>
     <w:lvl w:ilvl="3" w:tplc="2B04A65A">
@@ -5500,7 +5529,7 @@
         <w:ind w:left="3600" w:hanging="360"/>
       </w:pPr>
       <w:rPr>
-        <w:rFonts w:ascii="Symbol" w:hAnsi="Symbol" w:hint="default"/>
+        <w:rFonts w:hint="default" w:ascii="Symbol" w:hAnsi="Symbol"/>
       </w:rPr>
     </w:lvl>
     <w:lvl w:ilvl="4" w:tplc="74544D16">
@@ -5512,7 +5541,7 @@
         <w:ind w:left="4320" w:hanging="360"/>
       </w:pPr>
       <w:rPr>
-        <w:rFonts w:ascii="Courier New" w:hAnsi="Courier New" w:hint="default"/>
+        <w:rFonts w:hint="default" w:ascii="Courier New" w:hAnsi="Courier New"/>
       </w:rPr>
     </w:lvl>
     <w:lvl w:ilvl="5" w:tplc="98EE69F6">
@@ -5524,7 +5553,7 @@
         <w:ind w:left="5040" w:hanging="360"/>
       </w:pPr>
       <w:rPr>
-        <w:rFonts w:ascii="Wingdings" w:hAnsi="Wingdings" w:hint="default"/>
+        <w:rFonts w:hint="default" w:ascii="Wingdings" w:hAnsi="Wingdings"/>
       </w:rPr>
     </w:lvl>
     <w:lvl w:ilvl="6" w:tplc="78303BB4">
@@ -5536,7 +5565,7 @@
         <w:ind w:left="5760" w:hanging="360"/>
       </w:pPr>
       <w:rPr>
-        <w:rFonts w:ascii="Symbol" w:hAnsi="Symbol" w:hint="default"/>
+        <w:rFonts w:hint="default" w:ascii="Symbol" w:hAnsi="Symbol"/>
       </w:rPr>
     </w:lvl>
     <w:lvl w:ilvl="7" w:tplc="BE72C4E6">
@@ -5548,7 +5577,7 @@
         <w:ind w:left="6480" w:hanging="360"/>
       </w:pPr>
       <w:rPr>
-        <w:rFonts w:ascii="Courier New" w:hAnsi="Courier New" w:hint="default"/>
+        <w:rFonts w:hint="default" w:ascii="Courier New" w:hAnsi="Courier New"/>
       </w:rPr>
     </w:lvl>
     <w:lvl w:ilvl="8" w:tplc="20ACAD7E">
@@ -5560,7 +5589,7 @@
         <w:ind w:left="7200" w:hanging="360"/>
       </w:pPr>
       <w:rPr>
-        <w:rFonts w:ascii="Wingdings" w:hAnsi="Wingdings" w:hint="default"/>
+        <w:rFonts w:hint="default" w:ascii="Wingdings" w:hAnsi="Wingdings"/>
       </w:rPr>
     </w:lvl>
   </w:abstractNum>
@@ -5577,7 +5606,7 @@
         <w:ind w:left="720" w:hanging="360"/>
       </w:pPr>
       <w:rPr>
-        <w:rFonts w:ascii="Aptos" w:hAnsi="Aptos" w:hint="default"/>
+        <w:rFonts w:hint="default" w:ascii="Aptos" w:hAnsi="Aptos"/>
       </w:rPr>
     </w:lvl>
     <w:lvl w:ilvl="1" w:tplc="E7D0C668">
@@ -5871,7 +5900,7 @@
         <w:ind w:left="720" w:hanging="360"/>
       </w:pPr>
       <w:rPr>
-        <w:rFonts w:ascii="Symbol" w:eastAsiaTheme="minorHAnsi" w:hAnsi="Symbol" w:cstheme="minorBidi" w:hint="default"/>
+        <w:rFonts w:hint="default" w:ascii="Symbol" w:hAnsi="Symbol" w:eastAsiaTheme="minorHAnsi" w:cstheme="minorBidi"/>
       </w:rPr>
     </w:lvl>
     <w:lvl w:ilvl="1" w:tplc="04150003">
@@ -5883,7 +5912,7 @@
         <w:ind w:left="1440" w:hanging="360"/>
       </w:pPr>
       <w:rPr>
-        <w:rFonts w:ascii="Courier New" w:hAnsi="Courier New" w:cs="Courier New" w:hint="default"/>
+        <w:rFonts w:hint="default" w:ascii="Courier New" w:hAnsi="Courier New" w:cs="Courier New"/>
       </w:rPr>
     </w:lvl>
     <w:lvl w:ilvl="2" w:tplc="04150003">
@@ -5895,7 +5924,7 @@
         <w:ind w:left="2160" w:hanging="360"/>
       </w:pPr>
       <w:rPr>
-        <w:rFonts w:ascii="Courier New" w:hAnsi="Courier New" w:cs="Courier New" w:hint="default"/>
+        <w:rFonts w:hint="default" w:ascii="Courier New" w:hAnsi="Courier New" w:cs="Courier New"/>
       </w:rPr>
     </w:lvl>
     <w:lvl w:ilvl="3" w:tplc="04150001">
@@ -5907,7 +5936,7 @@
         <w:ind w:left="2880" w:hanging="360"/>
       </w:pPr>
       <w:rPr>
-        <w:rFonts w:ascii="Symbol" w:hAnsi="Symbol" w:hint="default"/>
+        <w:rFonts w:hint="default" w:ascii="Symbol" w:hAnsi="Symbol"/>
       </w:rPr>
     </w:lvl>
     <w:lvl w:ilvl="4" w:tplc="04150003" w:tentative="1">
@@ -5919,7 +5948,7 @@
         <w:ind w:left="3600" w:hanging="360"/>
       </w:pPr>
       <w:rPr>
-        <w:rFonts w:ascii="Courier New" w:hAnsi="Courier New" w:cs="Courier New" w:hint="default"/>
+        <w:rFonts w:hint="default" w:ascii="Courier New" w:hAnsi="Courier New" w:cs="Courier New"/>
       </w:rPr>
     </w:lvl>
     <w:lvl w:ilvl="5" w:tplc="04150005" w:tentative="1">
@@ -5931,7 +5960,7 @@
         <w:ind w:left="4320" w:hanging="360"/>
       </w:pPr>
       <w:rPr>
-        <w:rFonts w:ascii="Wingdings" w:hAnsi="Wingdings" w:hint="default"/>
+        <w:rFonts w:hint="default" w:ascii="Wingdings" w:hAnsi="Wingdings"/>
       </w:rPr>
     </w:lvl>
     <w:lvl w:ilvl="6" w:tplc="04150001" w:tentative="1">
@@ -5943,7 +5972,7 @@
         <w:ind w:left="5040" w:hanging="360"/>
       </w:pPr>
       <w:rPr>
-        <w:rFonts w:ascii="Symbol" w:hAnsi="Symbol" w:hint="default"/>
+        <w:rFonts w:hint="default" w:ascii="Symbol" w:hAnsi="Symbol"/>
       </w:rPr>
     </w:lvl>
     <w:lvl w:ilvl="7" w:tplc="04150003" w:tentative="1">
@@ -5955,7 +5984,7 @@
         <w:ind w:left="5760" w:hanging="360"/>
       </w:pPr>
       <w:rPr>
-        <w:rFonts w:ascii="Courier New" w:hAnsi="Courier New" w:cs="Courier New" w:hint="default"/>
+        <w:rFonts w:hint="default" w:ascii="Courier New" w:hAnsi="Courier New" w:cs="Courier New"/>
       </w:rPr>
     </w:lvl>
     <w:lvl w:ilvl="8" w:tplc="04150005" w:tentative="1">
@@ -5967,7 +5996,7 @@
         <w:ind w:left="6480" w:hanging="360"/>
       </w:pPr>
       <w:rPr>
-        <w:rFonts w:ascii="Wingdings" w:hAnsi="Wingdings" w:hint="default"/>
+        <w:rFonts w:hint="default" w:ascii="Wingdings" w:hAnsi="Wingdings"/>
       </w:rPr>
     </w:lvl>
   </w:abstractNum>
@@ -5984,7 +6013,7 @@
         <w:ind w:left="720" w:hanging="360"/>
       </w:pPr>
       <w:rPr>
-        <w:rFonts w:ascii="Symbol" w:hAnsi="Symbol" w:hint="default"/>
+        <w:rFonts w:hint="default" w:ascii="Symbol" w:hAnsi="Symbol"/>
       </w:rPr>
     </w:lvl>
     <w:lvl w:ilvl="1" w:tplc="54244D10">
@@ -5996,7 +6025,7 @@
         <w:ind w:left="1440" w:hanging="360"/>
       </w:pPr>
       <w:rPr>
-        <w:rFonts w:ascii="Courier New" w:hAnsi="Courier New" w:hint="default"/>
+        <w:rFonts w:hint="default" w:ascii="Courier New" w:hAnsi="Courier New"/>
       </w:rPr>
     </w:lvl>
     <w:lvl w:ilvl="2" w:tplc="C0DAE2CC">
@@ -6008,7 +6037,7 @@
         <w:ind w:left="2160" w:hanging="360"/>
       </w:pPr>
       <w:rPr>
-        <w:rFonts w:ascii="Wingdings" w:hAnsi="Wingdings" w:hint="default"/>
+        <w:rFonts w:hint="default" w:ascii="Wingdings" w:hAnsi="Wingdings"/>
       </w:rPr>
     </w:lvl>
     <w:lvl w:ilvl="3" w:tplc="69BEFFCA">
@@ -6020,7 +6049,7 @@
         <w:ind w:left="2880" w:hanging="360"/>
       </w:pPr>
       <w:rPr>
-        <w:rFonts w:ascii="Symbol" w:hAnsi="Symbol" w:hint="default"/>
+        <w:rFonts w:hint="default" w:ascii="Symbol" w:hAnsi="Symbol"/>
       </w:rPr>
     </w:lvl>
     <w:lvl w:ilvl="4" w:tplc="8CDC59F6">
@@ -6032,7 +6061,7 @@
         <w:ind w:left="3600" w:hanging="360"/>
       </w:pPr>
       <w:rPr>
-        <w:rFonts w:ascii="Courier New" w:hAnsi="Courier New" w:hint="default"/>
+        <w:rFonts w:hint="default" w:ascii="Courier New" w:hAnsi="Courier New"/>
       </w:rPr>
     </w:lvl>
     <w:lvl w:ilvl="5" w:tplc="BB30BF7A">
@@ -6044,7 +6073,7 @@
         <w:ind w:left="4320" w:hanging="360"/>
       </w:pPr>
       <w:rPr>
-        <w:rFonts w:ascii="Wingdings" w:hAnsi="Wingdings" w:hint="default"/>
+        <w:rFonts w:hint="default" w:ascii="Wingdings" w:hAnsi="Wingdings"/>
       </w:rPr>
     </w:lvl>
     <w:lvl w:ilvl="6" w:tplc="311C8212">
@@ -6056,7 +6085,7 @@
         <w:ind w:left="5040" w:hanging="360"/>
       </w:pPr>
       <w:rPr>
-        <w:rFonts w:ascii="Symbol" w:hAnsi="Symbol" w:hint="default"/>
+        <w:rFonts w:hint="default" w:ascii="Symbol" w:hAnsi="Symbol"/>
       </w:rPr>
     </w:lvl>
     <w:lvl w:ilvl="7" w:tplc="77A437D4">
@@ -6068,7 +6097,7 @@
         <w:ind w:left="5760" w:hanging="360"/>
       </w:pPr>
       <w:rPr>
-        <w:rFonts w:ascii="Courier New" w:hAnsi="Courier New" w:hint="default"/>
+        <w:rFonts w:hint="default" w:ascii="Courier New" w:hAnsi="Courier New"/>
       </w:rPr>
     </w:lvl>
     <w:lvl w:ilvl="8" w:tplc="304893C8">
@@ -6080,7 +6109,7 @@
         <w:ind w:left="6480" w:hanging="360"/>
       </w:pPr>
       <w:rPr>
-        <w:rFonts w:ascii="Wingdings" w:hAnsi="Wingdings" w:hint="default"/>
+        <w:rFonts w:hint="default" w:ascii="Wingdings" w:hAnsi="Wingdings"/>
       </w:rPr>
     </w:lvl>
   </w:abstractNum>
@@ -6416,11 +6445,11 @@
 </file>
 
 <file path=word/styles.xml><?xml version="1.0" encoding="utf-8"?>
-<w:styles xmlns:mc="http://schemas.openxmlformats.org/markup-compatibility/2006" xmlns:r="http://schemas.openxmlformats.org/officeDocument/2006/relationships" xmlns:w="http://schemas.openxmlformats.org/wordprocessingml/2006/main" xmlns:w14="http://schemas.microsoft.com/office/word/2010/wordml" xmlns:w15="http://schemas.microsoft.com/office/word/2012/wordml" xmlns:w16cex="http://schemas.microsoft.com/office/word/2018/wordml/cex" xmlns:w16cid="http://schemas.microsoft.com/office/word/2016/wordml/cid" xmlns:w16="http://schemas.microsoft.com/office/word/2018/wordml" xmlns:w16du="http://schemas.microsoft.com/office/word/2023/wordml/word16du" xmlns:w16sdtdh="http://schemas.microsoft.com/office/word/2020/wordml/sdtdatahash" xmlns:w16sdtfl="http://schemas.microsoft.com/office/word/2024/wordml/sdtformatlock" xmlns:w16se="http://schemas.microsoft.com/office/word/2015/wordml/symex" mc:Ignorable="w14 w15 w16se w16cid w16 w16cex w16sdtdh w16sdtfl w16du">
+<w:styles xmlns:wp14="http://schemas.microsoft.com/office/word/2010/wordprocessingDrawing" xmlns:mc="http://schemas.openxmlformats.org/markup-compatibility/2006" xmlns:r="http://schemas.openxmlformats.org/officeDocument/2006/relationships" xmlns:w="http://schemas.openxmlformats.org/wordprocessingml/2006/main" xmlns:w14="http://schemas.microsoft.com/office/word/2010/wordml" xmlns:w15="http://schemas.microsoft.com/office/word/2012/wordml" xmlns:w16cex="http://schemas.microsoft.com/office/word/2018/wordml/cex" xmlns:w16cid="http://schemas.microsoft.com/office/word/2016/wordml/cid" xmlns:w16="http://schemas.microsoft.com/office/word/2018/wordml" xmlns:w16du="http://schemas.microsoft.com/office/word/2023/wordml/word16du" xmlns:w16sdtdh="http://schemas.microsoft.com/office/word/2020/wordml/sdtdatahash" xmlns:w16sdtfl="http://schemas.microsoft.com/office/word/2024/wordml/sdtformatlock" xmlns:w16se="http://schemas.microsoft.com/office/word/2015/wordml/symex" mc:Ignorable="w14 w15 w16se w16cid w16 w16cex w16sdtdh w16sdtfl w16du wp14">
   <w:docDefaults>
     <w:rPrDefault>
       <w:rPr>
-        <w:rFonts w:asciiTheme="minorHAnsi" w:eastAsiaTheme="minorHAnsi" w:hAnsiTheme="minorHAnsi" w:cstheme="minorBidi"/>
+        <w:rFonts w:asciiTheme="minorHAnsi" w:hAnsiTheme="minorHAnsi" w:eastAsiaTheme="minorHAnsi" w:cstheme="minorBidi"/>
         <w:sz w:val="24"/>
         <w:szCs w:val="24"/>
         <w:lang w:val="pl-PL" w:eastAsia="en-US" w:bidi="ar-SA"/>
@@ -6435,14 +6464,14 @@
   <w:latentStyles w:defLockedState="0" w:defUIPriority="99" w:defSemiHidden="0" w:defUnhideWhenUsed="0" w:defQFormat="0" w:count="376">
     <w:lsdException w:name="Normal" w:uiPriority="0" w:qFormat="1"/>
     <w:lsdException w:name="heading 1" w:uiPriority="9" w:qFormat="1"/>
-    <w:lsdException w:name="heading 2" w:semiHidden="1" w:uiPriority="9" w:unhideWhenUsed="1" w:qFormat="1"/>
-    <w:lsdException w:name="heading 3" w:semiHidden="1" w:uiPriority="9" w:unhideWhenUsed="1" w:qFormat="1"/>
-    <w:lsdException w:name="heading 4" w:semiHidden="1" w:uiPriority="9" w:unhideWhenUsed="1" w:qFormat="1"/>
-    <w:lsdException w:name="heading 5" w:semiHidden="1" w:uiPriority="9" w:unhideWhenUsed="1" w:qFormat="1"/>
-    <w:lsdException w:name="heading 6" w:semiHidden="1" w:uiPriority="9" w:unhideWhenUsed="1" w:qFormat="1"/>
-    <w:lsdException w:name="heading 7" w:semiHidden="1" w:uiPriority="9" w:unhideWhenUsed="1" w:qFormat="1"/>
-    <w:lsdException w:name="heading 8" w:semiHidden="1" w:uiPriority="9" w:unhideWhenUsed="1" w:qFormat="1"/>
-    <w:lsdException w:name="heading 9" w:semiHidden="1" w:uiPriority="9" w:unhideWhenUsed="1" w:qFormat="1"/>
+    <w:lsdException w:name="heading 2" w:uiPriority="9" w:semiHidden="1" w:unhideWhenUsed="1" w:qFormat="1"/>
+    <w:lsdException w:name="heading 3" w:uiPriority="9" w:semiHidden="1" w:unhideWhenUsed="1" w:qFormat="1"/>
+    <w:lsdException w:name="heading 4" w:uiPriority="9" w:semiHidden="1" w:unhideWhenUsed="1" w:qFormat="1"/>
+    <w:lsdException w:name="heading 5" w:uiPriority="9" w:semiHidden="1" w:unhideWhenUsed="1" w:qFormat="1"/>
+    <w:lsdException w:name="heading 6" w:uiPriority="9" w:semiHidden="1" w:unhideWhenUsed="1" w:qFormat="1"/>
+    <w:lsdException w:name="heading 7" w:uiPriority="9" w:semiHidden="1" w:unhideWhenUsed="1" w:qFormat="1"/>
+    <w:lsdException w:name="heading 8" w:uiPriority="9" w:semiHidden="1" w:unhideWhenUsed="1" w:qFormat="1"/>
+    <w:lsdException w:name="heading 9" w:uiPriority="9" w:semiHidden="1" w:unhideWhenUsed="1" w:qFormat="1"/>
     <w:lsdException w:name="index 1" w:semiHidden="1" w:unhideWhenUsed="1"/>
     <w:lsdException w:name="index 2" w:semiHidden="1" w:unhideWhenUsed="1"/>
     <w:lsdException w:name="index 3" w:semiHidden="1" w:unhideWhenUsed="1"/>
@@ -6452,22 +6481,22 @@
     <w:lsdException w:name="index 7" w:semiHidden="1" w:unhideWhenUsed="1"/>
     <w:lsdException w:name="index 8" w:semiHidden="1" w:unhideWhenUsed="1"/>
     <w:lsdException w:name="index 9" w:semiHidden="1" w:unhideWhenUsed="1"/>
-    <w:lsdException w:name="toc 1" w:semiHidden="1" w:uiPriority="39" w:unhideWhenUsed="1"/>
-    <w:lsdException w:name="toc 2" w:semiHidden="1" w:uiPriority="39" w:unhideWhenUsed="1"/>
-    <w:lsdException w:name="toc 3" w:semiHidden="1" w:uiPriority="39" w:unhideWhenUsed="1"/>
-    <w:lsdException w:name="toc 4" w:semiHidden="1" w:uiPriority="39" w:unhideWhenUsed="1"/>
-    <w:lsdException w:name="toc 5" w:semiHidden="1" w:uiPriority="39" w:unhideWhenUsed="1"/>
-    <w:lsdException w:name="toc 6" w:semiHidden="1" w:uiPriority="39" w:unhideWhenUsed="1"/>
-    <w:lsdException w:name="toc 7" w:semiHidden="1" w:uiPriority="39" w:unhideWhenUsed="1"/>
-    <w:lsdException w:name="toc 8" w:semiHidden="1" w:uiPriority="39" w:unhideWhenUsed="1"/>
-    <w:lsdException w:name="toc 9" w:semiHidden="1" w:uiPriority="39" w:unhideWhenUsed="1"/>
+    <w:lsdException w:name="toc 1" w:uiPriority="39" w:semiHidden="1" w:unhideWhenUsed="1"/>
+    <w:lsdException w:name="toc 2" w:uiPriority="39" w:semiHidden="1" w:unhideWhenUsed="1"/>
+    <w:lsdException w:name="toc 3" w:uiPriority="39" w:semiHidden="1" w:unhideWhenUsed="1"/>
+    <w:lsdException w:name="toc 4" w:uiPriority="39" w:semiHidden="1" w:unhideWhenUsed="1"/>
+    <w:lsdException w:name="toc 5" w:uiPriority="39" w:semiHidden="1" w:unhideWhenUsed="1"/>
+    <w:lsdException w:name="toc 6" w:uiPriority="39" w:semiHidden="1" w:unhideWhenUsed="1"/>
+    <w:lsdException w:name="toc 7" w:uiPriority="39" w:semiHidden="1" w:unhideWhenUsed="1"/>
+    <w:lsdException w:name="toc 8" w:uiPriority="39" w:semiHidden="1" w:unhideWhenUsed="1"/>
+    <w:lsdException w:name="toc 9" w:uiPriority="39" w:semiHidden="1" w:unhideWhenUsed="1"/>
     <w:lsdException w:name="Normal Indent" w:semiHidden="1" w:unhideWhenUsed="1"/>
     <w:lsdException w:name="footnote text" w:semiHidden="1" w:unhideWhenUsed="1"/>
     <w:lsdException w:name="annotation text" w:semiHidden="1" w:unhideWhenUsed="1"/>
     <w:lsdException w:name="header" w:semiHidden="1" w:unhideWhenUsed="1"/>
     <w:lsdException w:name="footer" w:semiHidden="1" w:unhideWhenUsed="1"/>
     <w:lsdException w:name="index heading" w:semiHidden="1" w:unhideWhenUsed="1"/>
-    <w:lsdException w:name="caption" w:semiHidden="1" w:uiPriority="35" w:unhideWhenUsed="1" w:qFormat="1"/>
+    <w:lsdException w:name="caption" w:uiPriority="35" w:semiHidden="1" w:unhideWhenUsed="1" w:qFormat="1"/>
     <w:lsdException w:name="table of figures" w:semiHidden="1" w:unhideWhenUsed="1"/>
     <w:lsdException w:name="envelope address" w:semiHidden="1" w:unhideWhenUsed="1"/>
     <w:lsdException w:name="envelope return" w:semiHidden="1" w:unhideWhenUsed="1"/>
@@ -6498,7 +6527,7 @@
     <w:lsdException w:name="Title" w:uiPriority="10" w:qFormat="1"/>
     <w:lsdException w:name="Closing" w:semiHidden="1" w:unhideWhenUsed="1"/>
     <w:lsdException w:name="Signature" w:semiHidden="1" w:unhideWhenUsed="1"/>
-    <w:lsdException w:name="Default Paragraph Font" w:semiHidden="1" w:uiPriority="1" w:unhideWhenUsed="1"/>
+    <w:lsdException w:name="Default Paragraph Font" w:uiPriority="1" w:semiHidden="1" w:unhideWhenUsed="1"/>
     <w:lsdException w:name="Body Text" w:semiHidden="1" w:unhideWhenUsed="1"/>
     <w:lsdException w:name="Body Text Indent" w:semiHidden="1" w:unhideWhenUsed="1"/>
     <w:lsdException w:name="List Continue" w:semiHidden="1" w:unhideWhenUsed="1"/>
@@ -6698,8 +6727,8 @@
     <w:lsdException w:name="Subtle Reference" w:uiPriority="31" w:qFormat="1"/>
     <w:lsdException w:name="Intense Reference" w:uiPriority="32" w:qFormat="1"/>
     <w:lsdException w:name="Book Title" w:uiPriority="33" w:qFormat="1"/>
-    <w:lsdException w:name="Bibliography" w:semiHidden="1" w:uiPriority="37" w:unhideWhenUsed="1"/>
-    <w:lsdException w:name="TOC Heading" w:semiHidden="1" w:uiPriority="39" w:unhideWhenUsed="1" w:qFormat="1"/>
+    <w:lsdException w:name="Bibliography" w:uiPriority="37" w:semiHidden="1" w:unhideWhenUsed="1"/>
+    <w:lsdException w:name="TOC Heading" w:uiPriority="39" w:semiHidden="1" w:unhideWhenUsed="1" w:qFormat="1"/>
     <w:lsdException w:name="Plain Table 1" w:uiPriority="41"/>
     <w:lsdException w:name="Plain Table 2" w:uiPriority="42"/>
     <w:lsdException w:name="Plain Table 3" w:uiPriority="43"/>
@@ -6810,7 +6839,7 @@
     <w:lsdException w:name="Unresolved Mention" w:semiHidden="1" w:unhideWhenUsed="1"/>
     <w:lsdException w:name="Smart Link" w:semiHidden="1" w:unhideWhenUsed="1"/>
   </w:latentStyles>
-  <w:style w:type="paragraph" w:default="1" w:styleId="Normalny">
+  <w:style w:type="paragraph" w:styleId="Normalny" w:default="1">
     <w:name w:val="Normal"/>
     <w:qFormat/>
   </w:style>
@@ -6828,7 +6857,7 @@
       <w:outlineLvl w:val="0"/>
     </w:pPr>
     <w:rPr>
-      <w:rFonts w:asciiTheme="majorHAnsi" w:eastAsiaTheme="majorEastAsia" w:hAnsiTheme="majorHAnsi" w:cstheme="majorBidi"/>
+      <w:rFonts w:asciiTheme="majorHAnsi" w:hAnsiTheme="majorHAnsi" w:eastAsiaTheme="majorEastAsia" w:cstheme="majorBidi"/>
       <w:color w:val="0F4761" w:themeColor="accent1" w:themeShade="BF"/>
       <w:sz w:val="40"/>
       <w:szCs w:val="40"/>
@@ -6849,7 +6878,7 @@
       <w:outlineLvl w:val="1"/>
     </w:pPr>
     <w:rPr>
-      <w:rFonts w:asciiTheme="majorHAnsi" w:eastAsiaTheme="majorEastAsia" w:hAnsiTheme="majorHAnsi" w:cstheme="majorBidi"/>
+      <w:rFonts w:asciiTheme="majorHAnsi" w:hAnsiTheme="majorHAnsi" w:eastAsiaTheme="majorEastAsia" w:cstheme="majorBidi"/>
       <w:color w:val="0F4761" w:themeColor="accent1" w:themeShade="BF"/>
       <w:sz w:val="32"/>
       <w:szCs w:val="32"/>
@@ -6870,17 +6899,17 @@
       <w:outlineLvl w:val="2"/>
     </w:pPr>
     <w:rPr>
-      <w:rFonts w:asciiTheme="majorHAnsi" w:eastAsiaTheme="majorEastAsia" w:hAnsiTheme="majorHAnsi" w:cstheme="majorBidi"/>
+      <w:rFonts w:asciiTheme="majorHAnsi" w:hAnsiTheme="majorHAnsi" w:eastAsiaTheme="majorEastAsia" w:cstheme="majorBidi"/>
       <w:color w:val="0A2F40" w:themeColor="accent1" w:themeShade="7F"/>
     </w:rPr>
   </w:style>
-  <w:style w:type="character" w:default="1" w:styleId="Domylnaczcionkaakapitu">
+  <w:style w:type="character" w:styleId="Domylnaczcionkaakapitu" w:default="1">
     <w:name w:val="Default Paragraph Font"/>
     <w:uiPriority w:val="1"/>
     <w:semiHidden/>
     <w:unhideWhenUsed/>
   </w:style>
-  <w:style w:type="table" w:default="1" w:styleId="Standardowy">
+  <w:style w:type="table" w:styleId="Standardowy" w:default="1">
     <w:name w:val="Normal Table"/>
     <w:uiPriority w:val="99"/>
     <w:semiHidden/>
@@ -6895,7 +6924,7 @@
       </w:tblCellMar>
     </w:tblPr>
   </w:style>
-  <w:style w:type="numbering" w:default="1" w:styleId="Bezlisty">
+  <w:style w:type="numbering" w:styleId="Bezlisty" w:default="1">
     <w:name w:val="No List"/>
     <w:uiPriority w:val="99"/>
     <w:semiHidden/>
@@ -6933,12 +6962,12 @@
     </w:pPr>
     <w:tblPr>
       <w:tblBorders>
-        <w:top w:val="single" w:sz="4" w:space="0" w:color="000000" w:themeColor="text1"/>
-        <w:left w:val="single" w:sz="4" w:space="0" w:color="000000" w:themeColor="text1"/>
-        <w:bottom w:val="single" w:sz="4" w:space="0" w:color="000000" w:themeColor="text1"/>
-        <w:right w:val="single" w:sz="4" w:space="0" w:color="000000" w:themeColor="text1"/>
-        <w:insideH w:val="single" w:sz="4" w:space="0" w:color="000000" w:themeColor="text1"/>
-        <w:insideV w:val="single" w:sz="4" w:space="0" w:color="000000" w:themeColor="text1"/>
+        <w:top w:val="single" w:color="000000" w:themeColor="text1" w:sz="4" w:space="0"/>
+        <w:left w:val="single" w:color="000000" w:themeColor="text1" w:sz="4" w:space="0"/>
+        <w:bottom w:val="single" w:color="000000" w:themeColor="text1" w:sz="4" w:space="0"/>
+        <w:right w:val="single" w:color="000000" w:themeColor="text1" w:sz="4" w:space="0"/>
+        <w:insideH w:val="single" w:color="000000" w:themeColor="text1" w:sz="4" w:space="0"/>
+        <w:insideV w:val="single" w:color="000000" w:themeColor="text1" w:sz="4" w:space="0"/>
       </w:tblBorders>
     </w:tblPr>
   </w:style>
@@ -6965,7 +6994,7 @@
       <w:vertAlign w:val="superscript"/>
     </w:rPr>
   </w:style>
-  <w:style w:type="character" w:customStyle="1" w:styleId="TekstprzypisukocowegoZnak">
+  <w:style w:type="character" w:styleId="TekstprzypisukocowegoZnak" w:customStyle="1">
     <w:name w:val="Tekst przypisu końcowego Znak"/>
     <w:basedOn w:val="Domylnaczcionkaakapitu"/>
     <w:uiPriority w:val="99"/>
@@ -6976,14 +7005,14 @@
       <w:szCs w:val="20"/>
     </w:rPr>
   </w:style>
-  <w:style w:type="character" w:customStyle="1" w:styleId="NagwekZnak">
+  <w:style w:type="character" w:styleId="NagwekZnak" w:customStyle="1">
     <w:name w:val="Nagłówek Znak"/>
     <w:basedOn w:val="Domylnaczcionkaakapitu"/>
     <w:uiPriority w:val="99"/>
     <w:semiHidden/>
     <w:rsid w:val="004F20F3"/>
   </w:style>
-  <w:style w:type="character" w:customStyle="1" w:styleId="StopkaZnak">
+  <w:style w:type="character" w:styleId="StopkaZnak" w:customStyle="1">
     <w:name w:val="Stopka Znak"/>
     <w:basedOn w:val="Domylnaczcionkaakapitu"/>
     <w:uiPriority w:val="99"/>
@@ -7006,7 +7035,7 @@
       <w:spacing w:after="0" w:line="240" w:lineRule="auto"/>
     </w:pPr>
   </w:style>
-  <w:style w:type="character" w:customStyle="1" w:styleId="NagwekZnak2">
+  <w:style w:type="character" w:styleId="NagwekZnak2" w:customStyle="1">
     <w:name w:val="Nagłówek Znak2"/>
     <w:basedOn w:val="Domylnaczcionkaakapitu"/>
     <w:link w:val="Nagwek"/>
@@ -7030,7 +7059,7 @@
       <w:spacing w:after="0" w:line="240" w:lineRule="auto"/>
     </w:pPr>
   </w:style>
-  <w:style w:type="character" w:customStyle="1" w:styleId="StopkaZnak2">
+  <w:style w:type="character" w:styleId="StopkaZnak2" w:customStyle="1">
     <w:name w:val="Stopka Znak2"/>
     <w:basedOn w:val="Domylnaczcionkaakapitu"/>
     <w:link w:val="Stopka"/>
@@ -7038,7 +7067,7 @@
     <w:semiHidden/>
     <w:rsid w:val="00854199"/>
   </w:style>
-  <w:style w:type="table" w:customStyle="1" w:styleId="TableNormal1">
+  <w:style w:type="table" w:styleId="TableNormal1" w:customStyle="1">
     <w:name w:val="Table Normal1"/>
     <w:uiPriority w:val="99"/>
     <w:semiHidden/>
@@ -7066,7 +7095,7 @@
       <w:contextualSpacing/>
     </w:pPr>
     <w:rPr>
-      <w:rFonts w:asciiTheme="majorHAnsi" w:eastAsiaTheme="majorEastAsia" w:hAnsiTheme="majorHAnsi" w:cstheme="majorBidi"/>
+      <w:rFonts w:asciiTheme="majorHAnsi" w:hAnsiTheme="majorHAnsi" w:eastAsiaTheme="majorEastAsia" w:cstheme="majorBidi"/>
       <w:sz w:val="56"/>
       <w:szCs w:val="56"/>
     </w:rPr>
@@ -7095,27 +7124,27 @@
       <w:color w:val="666666"/>
     </w:rPr>
   </w:style>
-  <w:style w:type="character" w:customStyle="1" w:styleId="NagwekZnak1">
+  <w:style w:type="character" w:styleId="NagwekZnak1" w:customStyle="1">
     <w:name w:val="Nagłówek Znak1"/>
     <w:basedOn w:val="Domylnaczcionkaakapitu"/>
     <w:uiPriority w:val="99"/>
     <w:semiHidden/>
     <w:rsid w:val="00BF1A5E"/>
   </w:style>
-  <w:style w:type="character" w:customStyle="1" w:styleId="StopkaZnak1">
+  <w:style w:type="character" w:styleId="StopkaZnak1" w:customStyle="1">
     <w:name w:val="Stopka Znak1"/>
     <w:basedOn w:val="Domylnaczcionkaakapitu"/>
     <w:uiPriority w:val="99"/>
     <w:semiHidden/>
     <w:rsid w:val="00BF1A5E"/>
   </w:style>
-  <w:style w:type="character" w:customStyle="1" w:styleId="Nagwek3Znak">
+  <w:style w:type="character" w:styleId="Nagwek3Znak" w:customStyle="1">
     <w:name w:val="Nagłówek 3 Znak"/>
     <w:basedOn w:val="Domylnaczcionkaakapitu"/>
     <w:uiPriority w:val="9"/>
     <w:rsid w:val="00BF1A5E"/>
     <w:rPr>
-      <w:rFonts w:asciiTheme="majorHAnsi" w:eastAsiaTheme="majorEastAsia" w:hAnsiTheme="majorHAnsi" w:cstheme="majorBidi"/>
+      <w:rFonts w:asciiTheme="majorHAnsi" w:hAnsiTheme="majorHAnsi" w:eastAsiaTheme="majorEastAsia" w:cstheme="majorBidi"/>
       <w:color w:val="0A2F40" w:themeColor="accent1" w:themeShade="7F"/>
     </w:rPr>
   </w:style>
@@ -7123,7 +7152,7 @@
 </file>
 
 <file path=word/theme/theme1.xml><?xml version="1.0" encoding="utf-8"?>
-<a:theme xmlns:a="http://schemas.openxmlformats.org/drawingml/2006/main" name="Office Theme">
+<a:theme xmlns:a="http://schemas.openxmlformats.org/drawingml/2006/main" xmlns:thm15="http://schemas.microsoft.com/office/thememl/2012/main" name="Office Theme">
   <a:themeElements>
     <a:clrScheme name="Office">
       <a:dk1>

</xml_diff>

<commit_message>
diagram czynności part 3
</commit_message>
<xml_diff>
--- a/Sprawozdanie projektowe IO.docx
+++ b/Sprawozdanie projektowe IO.docx
@@ -523,27 +523,24 @@
         <w:jc w:val="both"/>
       </w:pPr>
       <w:r>
+        <w:rPr/>
         <w:t xml:space="preserve">Opis aktora: </w:t>
       </w:r>
-      <w:proofErr w:type="spellStart"/>
-      <w:r>
+      <w:r>
+        <w:rPr/>
         <w:t>Serwisant</w:t>
       </w:r>
-      <w:proofErr w:type="spellEnd"/>
-      <w:r>
-        <w:t>,</w:t>
-      </w:r>
-      <w:r>
-        <w:t xml:space="preserve"> </w:t>
-      </w:r>
-      <w:r>
-        <w:t xml:space="preserve">Opis przypadku użycia: </w:t>
-      </w:r>
-      <w:r>
-        <w:t xml:space="preserve">odbiór </w:t>
-      </w:r>
-      <w:r>
-        <w:t>sprzętu</w:t>
+      <w:r>
+        <w:rPr/>
+        <w:t xml:space="preserve">, Opis przypadku użycia: odbiór sprzętu, Diagram </w:t>
+      </w:r>
+      <w:r>
+        <w:rPr/>
+        <w:t>czyności</w:t>
+      </w:r>
+      <w:r>
+        <w:rPr/>
+        <w:t xml:space="preserve"> dla przypadku “Przyjęcie zlecenia naprawy”</w:t>
       </w:r>
     </w:p>
     <w:p>
@@ -3784,7 +3781,7 @@
     <w:p>
       <w:r>
         <w:drawing>
-          <wp:inline wp14:editId="41C60800" wp14:anchorId="165319B7">
+          <wp:inline wp14:editId="377CDB2C" wp14:anchorId="165319B7">
             <wp:extent cx="6645910" cy="7910195"/>
             <wp:effectExtent l="0" t="0" r="2540" b="0"/>
             <wp:docPr id="253579172" name="Grafika 1"/>
@@ -3848,7 +3845,7 @@
     <w:p>
       <w:r>
         <w:drawing>
-          <wp:inline wp14:editId="13683685" wp14:anchorId="2349A093">
+          <wp:inline wp14:editId="2EFAF880" wp14:anchorId="2349A093">
             <wp:extent cx="6638925" cy="5172075"/>
             <wp:effectExtent l="0" t="0" r="0" b="0"/>
             <wp:docPr id="499313697" name="drawing"/>
@@ -3878,6 +3875,58 @@
                     <a:xfrm>
                       <a:off x="0" y="0"/>
                       <a:ext cx="6638925" cy="5172075"/>
+                    </a:xfrm>
+                    <a:prstGeom prst="rect">
+                      <a:avLst/>
+                    </a:prstGeom>
+                  </pic:spPr>
+                </pic:pic>
+              </a:graphicData>
+            </a:graphic>
+          </wp:inline>
+        </w:drawing>
+      </w:r>
+      <w:r>
+        <w:rPr/>
+        <w:t>Diagram czynności dla przypadku użycia ,,Przyjęcie zlecenia”</w:t>
+      </w:r>
+    </w:p>
+    <w:p>
+      <w:pPr>
+        <w:pStyle w:val="Normalny"/>
+      </w:pPr>
+      <w:r>
+        <w:drawing>
+          <wp:inline wp14:editId="1270B40C" wp14:anchorId="013D849A">
+            <wp:extent cx="6305055" cy="9862657"/>
+            <wp:effectExtent l="0" t="0" r="0" b="0"/>
+            <wp:docPr id="2069432687" name="drawing"/>
+            <wp:cNvGraphicFramePr>
+              <a:graphicFrameLocks noChangeAspect="1"/>
+            </wp:cNvGraphicFramePr>
+            <a:graphic>
+              <a:graphicData xmlns:a="http://schemas.openxmlformats.org/drawingml/2006/main" uri="http://schemas.openxmlformats.org/drawingml/2006/picture">
+                <pic:pic xmlns:pic="http://schemas.openxmlformats.org/drawingml/2006/picture">
+                  <pic:nvPicPr>
+                    <pic:cNvPr id="2069432687" name="Picture 2069432687"/>
+                    <pic:cNvPicPr/>
+                  </pic:nvPicPr>
+                  <pic:blipFill>
+                    <a:blip xmlns:r="http://schemas.openxmlformats.org/officeDocument/2006/relationships" r:embed="rId1238556924">
+                      <a:extLst>
+                        <a:ext uri="{28A0092B-C50C-407E-A947-70E740481C1C}">
+                          <a14:useLocalDpi xmlns:a14="http://schemas.microsoft.com/office/drawing/2010/main"/>
+                        </a:ext>
+                      </a:extLst>
+                    </a:blip>
+                    <a:stretch>
+                      <a:fillRect/>
+                    </a:stretch>
+                  </pic:blipFill>
+                  <pic:spPr>
+                    <a:xfrm rot="0">
+                      <a:off x="0" y="0"/>
+                      <a:ext cx="6305055" cy="9862657"/>
                     </a:xfrm>
                     <a:prstGeom prst="rect">
                       <a:avLst/>

</xml_diff>